<commit_message>
termine el ejercicio 4 con conclusion y todo, faltan las imagenes del 4 y terminar el 3
</commit_message>
<xml_diff>
--- a/TP4/informe/Entregable.docx
+++ b/TP4/informe/Entregable.docx
@@ -1,6 +1,6 @@
 
 <file path=word/document.xml><?xml version="1.0" encoding="utf-8"?>
-<w:document xmlns:wpc="http://schemas.microsoft.com/office/word/2010/wordprocessingCanvas" xmlns:cx="http://schemas.microsoft.com/office/drawing/2014/chartex" xmlns:mc="http://schemas.openxmlformats.org/markup-compatibility/2006" xmlns:o="urn:schemas-microsoft-com:office:office" xmlns:r="http://schemas.openxmlformats.org/officeDocument/2006/relationships" xmlns:m="http://schemas.openxmlformats.org/officeDocument/2006/math" xmlns:v="urn:schemas-microsoft-com:vml" xmlns:wp14="http://schemas.microsoft.com/office/word/2010/wordprocessingDrawing" xmlns:wp="http://schemas.openxmlformats.org/drawingml/2006/wordprocessingDrawing" xmlns:w10="urn:schemas-microsoft-com:office:word" xmlns:w="http://schemas.openxmlformats.org/wordprocessingml/2006/main" xmlns:w14="http://schemas.microsoft.com/office/word/2010/wordml" xmlns:w15="http://schemas.microsoft.com/office/word/2012/wordml" xmlns:w16se="http://schemas.microsoft.com/office/word/2015/wordml/symex" xmlns:wpg="http://schemas.microsoft.com/office/word/2010/wordprocessingGroup" xmlns:wpi="http://schemas.microsoft.com/office/word/2010/wordprocessingInk" xmlns:wne="http://schemas.microsoft.com/office/word/2006/wordml" xmlns:wps="http://schemas.microsoft.com/office/word/2010/wordprocessingShape" mc:Ignorable="w14 w15 w16se wp14">
+<w:document xmlns:wpc="http://schemas.microsoft.com/office/word/2010/wordprocessingCanvas" xmlns:cx="http://schemas.microsoft.com/office/drawing/2014/chartex" xmlns:cx1="http://schemas.microsoft.com/office/drawing/2015/9/8/chartex" xmlns:cx2="http://schemas.microsoft.com/office/drawing/2015/10/21/chartex" xmlns:cx3="http://schemas.microsoft.com/office/drawing/2016/5/9/chartex" xmlns:cx4="http://schemas.microsoft.com/office/drawing/2016/5/10/chartex" xmlns:cx5="http://schemas.microsoft.com/office/drawing/2016/5/11/chartex" xmlns:cx6="http://schemas.microsoft.com/office/drawing/2016/5/12/chartex" xmlns:cx7="http://schemas.microsoft.com/office/drawing/2016/5/13/chartex" xmlns:cx8="http://schemas.microsoft.com/office/drawing/2016/5/14/chartex" xmlns:mc="http://schemas.openxmlformats.org/markup-compatibility/2006" xmlns:aink="http://schemas.microsoft.com/office/drawing/2016/ink" xmlns:am3d="http://schemas.microsoft.com/office/drawing/2017/model3d" xmlns:o="urn:schemas-microsoft-com:office:office" xmlns:oel="http://schemas.microsoft.com/office/2019/extlst" xmlns:r="http://schemas.openxmlformats.org/officeDocument/2006/relationships" xmlns:m="http://schemas.openxmlformats.org/officeDocument/2006/math" xmlns:v="urn:schemas-microsoft-com:vml" xmlns:wp14="http://schemas.microsoft.com/office/word/2010/wordprocessingDrawing" xmlns:wp="http://schemas.openxmlformats.org/drawingml/2006/wordprocessingDrawing" xmlns:w10="urn:schemas-microsoft-com:office:word" xmlns:w="http://schemas.openxmlformats.org/wordprocessingml/2006/main" xmlns:w14="http://schemas.microsoft.com/office/word/2010/wordml" xmlns:w15="http://schemas.microsoft.com/office/word/2012/wordml" xmlns:w16cex="http://schemas.microsoft.com/office/word/2018/wordml/cex" xmlns:w16cid="http://schemas.microsoft.com/office/word/2016/wordml/cid" xmlns:w16="http://schemas.microsoft.com/office/word/2018/wordml" xmlns:w16du="http://schemas.microsoft.com/office/word/2023/wordml/word16du" xmlns:w16sdtdh="http://schemas.microsoft.com/office/word/2020/wordml/sdtdatahash" xmlns:w16sdtfl="http://schemas.microsoft.com/office/word/2024/wordml/sdtformatlock" xmlns:w16se="http://schemas.microsoft.com/office/word/2015/wordml/symex" xmlns:wpg="http://schemas.microsoft.com/office/word/2010/wordprocessingGroup" xmlns:wpi="http://schemas.microsoft.com/office/word/2010/wordprocessingInk" xmlns:wne="http://schemas.microsoft.com/office/word/2006/wordml" xmlns:wps="http://schemas.microsoft.com/office/word/2010/wordprocessingShape" mc:Ignorable="w14 w15 w16se w16cid w16 w16cex w16sdtdh w16sdtfl w16du wp14">
   <w:body>
     <w:p>
       <w:pPr>
@@ -1046,23 +1046,7 @@
                 <w:rFonts w:eastAsia="CMBX12"/>
                 <w:noProof/>
               </w:rPr>
-              <w:t>3. Síntesis y Rend</w:t>
-            </w:r>
-            <w:r>
-              <w:rPr>
-                <w:rStyle w:val="Hipervnculo"/>
-                <w:rFonts w:eastAsia="CMBX12"/>
-                <w:noProof/>
-              </w:rPr>
-              <w:t>e</w:t>
-            </w:r>
-            <w:r>
-              <w:rPr>
-                <w:rStyle w:val="Hipervnculo"/>
-                <w:rFonts w:eastAsia="CMBX12"/>
-                <w:noProof/>
-              </w:rPr>
-              <w:t>rizado de Vuelo Filtrado</w:t>
+              <w:t>3. Síntesis y Renderizado de Vuelo Filtrado</w:t>
             </w:r>
             <w:r>
               <w:rPr>
@@ -1288,7 +1272,7 @@
             <v:path o:extrusionok="f" gradientshapeok="t" o:connecttype="rect"/>
             <o:lock v:ext="edit" aspectratio="t"/>
           </v:shapetype>
-          <v:shape id="_x0000_i1039" type="#_x0000_t75" style="width:325.05pt;height:243.4pt">
+          <v:shape id="_x0000_i1025" type="#_x0000_t75" style="width:324.95pt;height:242.9pt">
             <v:imagedata r:id="rId10" o:title="trayectoria_cartesiana"/>
           </v:shape>
         </w:pict>
@@ -1697,7 +1681,7 @@
         </w:rPr>
         <w:lastRenderedPageBreak/>
         <w:pict w14:anchorId="123CAF66">
-          <v:shape id="_x0000_i1045" type="#_x0000_t75" style="width:425pt;height:212.8pt">
+          <v:shape id="_x0000_i1026" type="#_x0000_t75" style="width:425.1pt;height:212.85pt">
             <v:imagedata r:id="rId11" o:title="rapidez_instantanea"/>
           </v:shape>
         </w:pict>
@@ -1734,19 +1718,7 @@
         <w:rPr>
           <w:rFonts w:eastAsia="CMBX12"/>
         </w:rPr>
-        <w:t>2</w:t>
-      </w:r>
-      <w:r>
-        <w:rPr>
-          <w:rFonts w:eastAsia="CMBX12"/>
-        </w:rPr>
-        <w:t>.</w:t>
-      </w:r>
-      <w:r>
-        <w:rPr>
-          <w:rFonts w:eastAsia="CMBX12"/>
-        </w:rPr>
-        <w:t xml:space="preserve"> Modelado de Trayectoria</w:t>
+        <w:t>2. Modelado de Trayectoria</w:t>
       </w:r>
       <w:bookmarkEnd w:id="6"/>
     </w:p>
@@ -1874,7 +1846,7 @@
     <w:p>
       <w:r>
         <w:pict w14:anchorId="04EC8283">
-          <v:shape id="_x0000_i1046" type="#_x0000_t75" style="width:425pt;height:330.45pt">
+          <v:shape id="_x0000_i1027" type="#_x0000_t75" style="width:425.1pt;height:330.55pt">
             <v:imagedata r:id="rId12" o:title="comparacion_plano_cartesiano"/>
           </v:shape>
         </w:pict>
@@ -1883,7 +1855,7 @@
     <w:p>
       <w:r>
         <w:pict w14:anchorId="758B00C6">
-          <v:shape id="_x0000_i1048" type="#_x0000_t75" style="width:425pt;height:233.75pt">
+          <v:shape id="_x0000_i1028" type="#_x0000_t75" style="width:424.5pt;height:233.55pt">
             <v:imagedata r:id="rId13" o:title="comparacion_altitud"/>
           </v:shape>
         </w:pict>
@@ -1901,48 +1873,41 @@
           <w:color w:val="000000"/>
           <w:szCs w:val="28"/>
         </w:rPr>
-        <w:t>El polinomio global es rígido, intentar que una única función pase cerca de todos los nodos del vuelo suele generar sobretiros y oscilaciones severas en los tramos intermedios y extremos (fenómeno de Runge). Un cambio brusco en la trayectoria del dron afecta a toda la curva global.</w:t>
+        <w:t xml:space="preserve">El polinomio global es rígido, intentar que una única función pase cerca de todos los nodos del vuelo suele generar sobretiros y oscilaciones severas en los tramos intermedios y extremos (fenómeno de Runge). Un cambio brusco en la trayectoria del dron afecta a toda la curva global. Si bien esta aplicación del </w:t>
       </w:r>
       <w:r>
         <w:rPr>
           <w:color w:val="000000"/>
           <w:szCs w:val="28"/>
         </w:rPr>
-        <w:t xml:space="preserve"> Si bien esta aplicación del </w:t>
-      </w:r>
+        <w:lastRenderedPageBreak/>
+        <w:t>polinomio cumple muy bien el recorrido del dron, en los otros grados probados, las oscilaciones eran mucho más fuertes.</w:t>
+      </w:r>
+    </w:p>
+    <w:p>
       <w:r>
         <w:rPr>
           <w:color w:val="000000"/>
           <w:szCs w:val="28"/>
         </w:rPr>
-        <w:lastRenderedPageBreak/>
-        <w:t>polinomio cumple muy bien el recorrido del dron, en los otros grados probados, las oscilaciones eran mucho más fuertes.</w:t>
+        <w:t xml:space="preserve">El Spline Cúbico Natural es superior para este caso. Al ser local, una ráfaga de viento o un giro cerrado en una esquina del mapa solo afecta a ese tramo específico. Además, los polinomios cúbicos garantizan que la trayectoria final tenga posición, velocidad y aceleración continuas, lo que elimina el ruido del video original y genera un modelado </w:t>
+      </w:r>
+      <w:r>
+        <w:rPr>
+          <w:color w:val="000000"/>
+          <w:szCs w:val="28"/>
+        </w:rPr>
+        <w:t>más estable</w:t>
+      </w:r>
+      <w:r>
+        <w:rPr>
+          <w:color w:val="000000"/>
+          <w:szCs w:val="28"/>
+        </w:rPr>
+        <w:t xml:space="preserve"> para el vuelo del dron.</w:t>
       </w:r>
     </w:p>
     <w:p>
-      <w:r>
-        <w:rPr>
-          <w:color w:val="000000"/>
-          <w:szCs w:val="28"/>
-        </w:rPr>
-        <w:t xml:space="preserve">El Spline Cúbico Natural es superior para este caso. Al ser local, una ráfaga de viento o un giro cerrado en una esquina del mapa solo afecta a ese tramo específico. Además, los polinomios cúbicos garantizan que la trayectoria final tenga posición, velocidad y aceleración continuas, lo que elimina el ruido del video original y genera un modelado </w:t>
-      </w:r>
-      <w:r>
-        <w:rPr>
-          <w:color w:val="000000"/>
-          <w:szCs w:val="28"/>
-        </w:rPr>
-        <w:t>más estable</w:t>
-      </w:r>
-      <w:r>
-        <w:rPr>
-          <w:color w:val="000000"/>
-          <w:szCs w:val="28"/>
-        </w:rPr>
-        <w:t xml:space="preserve"> para el vuelo del dron.</w:t>
-      </w:r>
-    </w:p>
-    <w:p>
       <w:pPr>
         <w:pStyle w:val="Ttulo1"/>
       </w:pPr>
@@ -1951,40 +1916,13 @@
         <w:rPr>
           <w:rFonts w:eastAsia="CMBX12"/>
         </w:rPr>
-        <w:t>3</w:t>
-      </w:r>
-      <w:r>
-        <w:rPr>
-          <w:rFonts w:eastAsia="CMBX12"/>
-        </w:rPr>
-        <w:t>.</w:t>
-      </w:r>
-      <w:r>
-        <w:rPr>
-          <w:rFonts w:eastAsia="CMBX12"/>
-        </w:rPr>
-        <w:t xml:space="preserve"> S</w:t>
-      </w:r>
-      <w:r>
-        <w:rPr>
-          <w:rFonts w:eastAsia="CMBX12"/>
-        </w:rPr>
-        <w:t>í</w:t>
-      </w:r>
-      <w:r>
-        <w:rPr>
-          <w:rFonts w:eastAsia="CMBX12"/>
-        </w:rPr>
-        <w:t>ntesis y Renderizado de Vuelo Filtrado</w:t>
+        <w:t>3. Síntesis y Renderizado de Vuelo Filtrado</w:t>
       </w:r>
       <w:bookmarkEnd w:id="10"/>
     </w:p>
     <w:p>
       <w:pPr>
         <w:rPr>
-          <w:rFonts w:ascii="Times New Roman" w:hAnsi="Times New Roman"/>
-          <w:sz w:val="24"/>
-          <w:szCs w:val="24"/>
           <w:lang w:eastAsia="es-AR"/>
         </w:rPr>
       </w:pPr>
@@ -1994,8 +1932,1642 @@
         </w:rPr>
         <w:t>Comenzaremos aclarando que seleccionamos el método local por tramos (Spline Cúbico Natural) debido a su superioridad para el modelado físico. El spline evita oscilaciones y el fenómeno de Runge propios del polinomio global, garantizando que la posición reconstruida tenga velocidad y aceleración continuas. Esta suavidad es indispensable para que el renderizado del dron virtual fluya sin sobresaltos ni cambios de dirección discontinuos que arruinarían el análisis de flujo óptico posterior.</w:t>
       </w:r>
-      <w:bookmarkStart w:id="11" w:name="_GoBack"/>
-      <w:bookmarkEnd w:id="11"/>
+    </w:p>
+    <w:p>
+      <w:pPr>
+        <w:pStyle w:val="Ttulo1"/>
+        <w:rPr>
+          <w:lang w:eastAsia="es-AR"/>
+        </w:rPr>
+      </w:pPr>
+      <w:r>
+        <w:rPr>
+          <w:lang w:eastAsia="es-AR"/>
+        </w:rPr>
+        <w:t>4. Modelado de Condiciones Reales de Vuelo</w:t>
+      </w:r>
+    </w:p>
+    <w:p>
+      <w:pPr>
+        <w:rPr>
+          <w:lang w:eastAsia="es-AR"/>
+        </w:rPr>
+      </w:pPr>
+      <w:r>
+        <w:rPr>
+          <w:lang w:eastAsia="es-AR"/>
+        </w:rPr>
+        <w:t xml:space="preserve">Al investigar un poco sobre </w:t>
+      </w:r>
+      <w:r>
+        <w:rPr>
+          <w:lang w:eastAsia="es-AR"/>
+        </w:rPr>
+        <w:t>sistemas de control de autopilotos para drone</w:t>
+      </w:r>
+      <w:r>
+        <w:rPr>
+          <w:lang w:eastAsia="es-AR"/>
+        </w:rPr>
+        <w:t>s comerciales algunos sistemas y marcas mas recomendados con los que nos topamos fueron ArduPilot y PX4, los cuales son ecosistemas de código abierto, como también el software de DJI.</w:t>
+      </w:r>
+    </w:p>
+    <w:p>
+      <w:pPr>
+        <w:pStyle w:val="Ttulo2"/>
+        <w:rPr>
+          <w:lang w:eastAsia="es-AR"/>
+        </w:rPr>
+      </w:pPr>
+      <w:r>
+        <w:rPr>
+          <w:lang w:eastAsia="es-AR"/>
+        </w:rPr>
+        <w:t>Velocidad y Aceleracion</w:t>
+      </w:r>
+    </w:p>
+    <w:p>
+      <w:pPr>
+        <w:rPr>
+          <w:rFonts w:eastAsiaTheme="minorEastAsia"/>
+          <w:lang w:eastAsia="es-AR"/>
+        </w:rPr>
+      </w:pPr>
+      <w:r>
+        <w:rPr>
+          <w:lang w:eastAsia="es-AR"/>
+        </w:rPr>
+        <w:t xml:space="preserve">La información que </w:t>
+      </w:r>
+      <w:r>
+        <w:rPr>
+          <w:lang w:eastAsia="es-AR"/>
+        </w:rPr>
+        <w:t>extraemos</w:t>
+      </w:r>
+      <w:r>
+        <w:rPr>
+          <w:lang w:eastAsia="es-AR"/>
+        </w:rPr>
+        <w:t xml:space="preserve"> de estas marcas es que la velocidad máxima (o crucero) que alcanza en el </w:t>
+      </w:r>
+      <w:r>
+        <w:rPr>
+          <w:lang w:eastAsia="es-AR"/>
+        </w:rPr>
+        <w:t>software</w:t>
+      </w:r>
+      <w:r>
+        <w:rPr>
+          <w:lang w:eastAsia="es-AR"/>
+        </w:rPr>
+        <w:t xml:space="preserve"> ArduPilot oscila entre </w:t>
+      </w:r>
+      <m:oMath>
+        <m:r>
+          <w:rPr>
+            <w:rFonts w:ascii="Cambria Math" w:hAnsi="Cambria Math"/>
+            <w:lang w:eastAsia="es-AR"/>
+          </w:rPr>
+          <m:t>5.0 m/s</m:t>
+        </m:r>
+      </m:oMath>
+      <w:r>
+        <w:rPr>
+          <w:lang w:eastAsia="es-AR"/>
+        </w:rPr>
+        <w:t xml:space="preserve"> y </w:t>
+      </w:r>
+      <m:oMath>
+        <m:r>
+          <w:rPr>
+            <w:rFonts w:ascii="Cambria Math" w:hAnsi="Cambria Math"/>
+            <w:lang w:eastAsia="es-AR"/>
+          </w:rPr>
+          <m:t>8.0m/s</m:t>
+        </m:r>
+      </m:oMath>
+      <w:r>
+        <w:rPr>
+          <w:lang w:eastAsia="es-AR"/>
+        </w:rPr>
+        <w:t>, nuestra elección fue de 7.0 m/s.</w:t>
+      </w:r>
+      <w:r>
+        <w:rPr>
+          <w:lang w:eastAsia="es-AR"/>
+        </w:rPr>
+        <w:t xml:space="preserve"> Para la aceleración máxima (o tangencial) encontramos que </w:t>
+      </w:r>
+      <w:r>
+        <w:rPr>
+          <w:lang w:eastAsia="es-AR"/>
+        </w:rPr>
+        <w:t>ArduPilot limita</w:t>
+      </w:r>
+      <w:r>
+        <w:rPr>
+          <w:lang w:eastAsia="es-AR"/>
+        </w:rPr>
+        <w:t xml:space="preserve"> </w:t>
+      </w:r>
+      <w:r>
+        <w:rPr>
+          <w:lang w:eastAsia="es-AR"/>
+        </w:rPr>
+        <w:t xml:space="preserve">entre </w:t>
+      </w:r>
+      <m:oMath>
+        <m:r>
+          <w:rPr>
+            <w:rFonts w:ascii="Cambria Math" w:hAnsi="Cambria Math"/>
+            <w:lang w:eastAsia="es-AR"/>
+          </w:rPr>
+          <m:t>2.0</m:t>
+        </m:r>
+        <m:r>
+          <w:rPr>
+            <w:rFonts w:ascii="Cambria Math" w:hAnsi="Cambria Math"/>
+            <w:lang w:eastAsia="es-AR"/>
+          </w:rPr>
+          <m:t xml:space="preserve"> </m:t>
+        </m:r>
+        <m:sSup>
+          <m:sSupPr>
+            <m:ctrlPr>
+              <w:rPr>
+                <w:rFonts w:ascii="Cambria Math" w:hAnsi="Cambria Math"/>
+                <w:lang w:eastAsia="es-AR"/>
+              </w:rPr>
+            </m:ctrlPr>
+          </m:sSupPr>
+          <m:e>
+            <m:r>
+              <m:rPr>
+                <m:nor/>
+              </m:rPr>
+              <w:rPr>
+                <w:lang w:eastAsia="es-AR"/>
+              </w:rPr>
+              <m:t> m/s</m:t>
+            </m:r>
+          </m:e>
+          <m:sup>
+            <m:r>
+              <w:rPr>
+                <w:rFonts w:ascii="Cambria Math" w:hAnsi="Cambria Math"/>
+                <w:lang w:eastAsia="es-AR"/>
+              </w:rPr>
+              <m:t>2</m:t>
+            </m:r>
+          </m:sup>
+        </m:sSup>
+      </m:oMath>
+      <w:r>
+        <w:rPr>
+          <w:lang w:eastAsia="es-AR"/>
+        </w:rPr>
+        <w:t xml:space="preserve"> y </w:t>
+      </w:r>
+      <m:oMath>
+        <m:r>
+          <w:rPr>
+            <w:rFonts w:ascii="Cambria Math" w:hAnsi="Cambria Math"/>
+            <w:lang w:eastAsia="es-AR"/>
+          </w:rPr>
+          <m:t>4.0</m:t>
+        </m:r>
+        <m:sSup>
+          <m:sSupPr>
+            <m:ctrlPr>
+              <w:rPr>
+                <w:rFonts w:ascii="Cambria Math" w:hAnsi="Cambria Math"/>
+                <w:lang w:eastAsia="es-AR"/>
+              </w:rPr>
+            </m:ctrlPr>
+          </m:sSupPr>
+          <m:e>
+            <m:r>
+              <m:rPr>
+                <m:nor/>
+              </m:rPr>
+              <w:rPr>
+                <w:lang w:eastAsia="es-AR"/>
+              </w:rPr>
+              <m:t> m/s</m:t>
+            </m:r>
+          </m:e>
+          <m:sup>
+            <m:r>
+              <w:rPr>
+                <w:rFonts w:ascii="Cambria Math" w:hAnsi="Cambria Math"/>
+                <w:lang w:eastAsia="es-AR"/>
+              </w:rPr>
+              <m:t>2</m:t>
+            </m:r>
+          </m:sup>
+        </m:sSup>
+      </m:oMath>
+      <w:r>
+        <w:rPr>
+          <w:lang w:eastAsia="es-AR"/>
+        </w:rPr>
+        <w:t>, mientras que</w:t>
+      </w:r>
+      <w:r>
+        <w:rPr>
+          <w:lang w:eastAsia="es-AR"/>
+        </w:rPr>
+        <w:t xml:space="preserve"> PX4 ajusta </w:t>
+      </w:r>
+      <w:r>
+        <w:rPr>
+          <w:lang w:eastAsia="es-AR"/>
+        </w:rPr>
+        <w:t>a</w:t>
+      </w:r>
+      <w:r>
+        <w:rPr>
+          <w:lang w:eastAsia="es-AR"/>
+        </w:rPr>
+        <w:t xml:space="preserve"> </w:t>
+      </w:r>
+      <m:oMath>
+        <m:r>
+          <w:rPr>
+            <w:rFonts w:ascii="Cambria Math" w:hAnsi="Cambria Math"/>
+            <w:lang w:eastAsia="es-AR"/>
+          </w:rPr>
+          <m:t>2.0</m:t>
+        </m:r>
+        <m:r>
+          <w:rPr>
+            <w:rFonts w:ascii="Cambria Math" w:eastAsiaTheme="minorEastAsia" w:hAnsi="Cambria Math"/>
+            <w:lang w:eastAsia="es-AR"/>
+          </w:rPr>
+          <m:t xml:space="preserve"> </m:t>
+        </m:r>
+        <m:sSup>
+          <m:sSupPr>
+            <m:ctrlPr>
+              <w:rPr>
+                <w:rFonts w:ascii="Cambria Math" w:hAnsi="Cambria Math"/>
+                <w:lang w:eastAsia="es-AR"/>
+              </w:rPr>
+            </m:ctrlPr>
+          </m:sSupPr>
+          <m:e>
+            <m:r>
+              <m:rPr>
+                <m:nor/>
+              </m:rPr>
+              <w:rPr>
+                <w:lang w:eastAsia="es-AR"/>
+              </w:rPr>
+              <m:t> m/s</m:t>
+            </m:r>
+          </m:e>
+          <m:sup>
+            <m:r>
+              <w:rPr>
+                <w:rFonts w:ascii="Cambria Math" w:hAnsi="Cambria Math"/>
+                <w:lang w:eastAsia="es-AR"/>
+              </w:rPr>
+              <m:t>2</m:t>
+            </m:r>
+          </m:sup>
+        </m:sSup>
+      </m:oMath>
+      <w:r>
+        <w:rPr>
+          <w:lang w:eastAsia="es-AR"/>
+        </w:rPr>
+        <w:t xml:space="preserve"> o </w:t>
+      </w:r>
+      <m:oMath>
+        <m:r>
+          <w:rPr>
+            <w:rFonts w:ascii="Cambria Math" w:hAnsi="Cambria Math"/>
+            <w:lang w:eastAsia="es-AR"/>
+          </w:rPr>
+          <m:t>3.0</m:t>
+        </m:r>
+        <m:sSup>
+          <m:sSupPr>
+            <m:ctrlPr>
+              <w:rPr>
+                <w:rFonts w:ascii="Cambria Math" w:hAnsi="Cambria Math"/>
+                <w:lang w:eastAsia="es-AR"/>
+              </w:rPr>
+            </m:ctrlPr>
+          </m:sSupPr>
+          <m:e>
+            <m:r>
+              <m:rPr>
+                <m:nor/>
+              </m:rPr>
+              <w:rPr>
+                <w:lang w:eastAsia="es-AR"/>
+              </w:rPr>
+              <m:t> m/s</m:t>
+            </m:r>
+          </m:e>
+          <m:sup>
+            <m:r>
+              <w:rPr>
+                <w:rFonts w:ascii="Cambria Math" w:hAnsi="Cambria Math"/>
+                <w:lang w:eastAsia="es-AR"/>
+              </w:rPr>
+              <m:t>2</m:t>
+            </m:r>
+          </m:sup>
+        </m:sSup>
+      </m:oMath>
+      <w:r>
+        <w:rPr>
+          <w:lang w:eastAsia="es-AR"/>
+        </w:rPr>
+        <w:t xml:space="preserve">, nuestra elección fue de </w:t>
+      </w:r>
+      <m:oMath>
+        <m:r>
+          <w:rPr>
+            <w:rFonts w:ascii="Cambria Math" w:hAnsi="Cambria Math"/>
+            <w:lang w:eastAsia="es-AR"/>
+          </w:rPr>
+          <m:t xml:space="preserve">3.0 </m:t>
+        </m:r>
+        <m:sSup>
+          <m:sSupPr>
+            <m:ctrlPr>
+              <w:rPr>
+                <w:rFonts w:ascii="Cambria Math" w:hAnsi="Cambria Math"/>
+                <w:lang w:eastAsia="es-AR"/>
+              </w:rPr>
+            </m:ctrlPr>
+          </m:sSupPr>
+          <m:e>
+            <m:r>
+              <m:rPr>
+                <m:nor/>
+              </m:rPr>
+              <w:rPr>
+                <w:lang w:eastAsia="es-AR"/>
+              </w:rPr>
+              <m:t> m/s</m:t>
+            </m:r>
+          </m:e>
+          <m:sup>
+            <m:r>
+              <w:rPr>
+                <w:rFonts w:ascii="Cambria Math" w:hAnsi="Cambria Math"/>
+                <w:lang w:eastAsia="es-AR"/>
+              </w:rPr>
+              <m:t>2</m:t>
+            </m:r>
+          </m:sup>
+        </m:sSup>
+      </m:oMath>
+      <w:r>
+        <w:rPr>
+          <w:rFonts w:eastAsiaTheme="minorEastAsia"/>
+          <w:lang w:eastAsia="es-AR"/>
+        </w:rPr>
+        <w:t>.</w:t>
+      </w:r>
+    </w:p>
+    <w:p>
+      <w:pPr>
+        <w:rPr>
+          <w:rFonts w:eastAsiaTheme="minorEastAsia"/>
+          <w:lang w:val="es-ES" w:eastAsia="es-AR"/>
+        </w:rPr>
+      </w:pPr>
+      <w:r>
+        <w:rPr>
+          <w:rFonts w:eastAsiaTheme="minorEastAsia"/>
+          <w:lang w:eastAsia="es-AR"/>
+        </w:rPr>
+        <w:t xml:space="preserve">Estos datos son suficientes para realizar la simulación de condiciones reales de vuelo, otro dato que se proporciona es el Jerk (o tirón), esto representa la tasa de cambio de la aceleración, según investigamos es la </w:t>
+      </w:r>
+      <w:r>
+        <w:rPr>
+          <w:rFonts w:eastAsiaTheme="minorEastAsia"/>
+          <w:lang w:eastAsia="es-AR"/>
+        </w:rPr>
+        <w:t>tercera derivada</w:t>
+      </w:r>
+      <w:r>
+        <w:rPr>
+          <w:rFonts w:eastAsiaTheme="minorEastAsia"/>
+          <w:lang w:eastAsia="es-AR"/>
+        </w:rPr>
+        <w:t xml:space="preserve"> de la posición respecto al tiempo</w:t>
+      </w:r>
+      <w:r>
+        <w:rPr>
+          <w:rFonts w:eastAsiaTheme="minorEastAsia"/>
+          <w:lang w:eastAsia="es-AR"/>
+        </w:rPr>
+        <w:t xml:space="preserve">, en un gráfico se ve como una curva suavizada o con “forma de S” la utilización de este. El código que debíamos implementar para simular el Jerk es muy costoso computacionalmente, por lo tanto, decidimos no hacerlo y utilizar la velocidad y aceleración conocidas para hacer la simulación ya que </w:t>
+      </w:r>
+      <w:r>
+        <w:rPr>
+          <w:rFonts w:eastAsiaTheme="minorEastAsia"/>
+          <w:lang w:val="es-ES" w:eastAsia="es-AR"/>
+        </w:rPr>
+        <w:t>la diferencia visual al implementar o no el Jerk es muy pequeña, el resultado en el grafico se ve como un “perfil trapezoidal</w:t>
+      </w:r>
+      <w:r>
+        <w:rPr>
+          <w:rFonts w:eastAsiaTheme="minorEastAsia"/>
+          <w:lang w:val="es-ES" w:eastAsia="es-AR"/>
+        </w:rPr>
+        <w:t xml:space="preserve">”. </w:t>
+      </w:r>
+    </w:p>
+    <w:p>
+      <w:pPr>
+        <w:rPr>
+          <w:rFonts w:eastAsiaTheme="minorEastAsia"/>
+        </w:rPr>
+      </w:pPr>
+      <w:r>
+        <w:rPr>
+          <w:rFonts w:eastAsiaTheme="minorEastAsia"/>
+          <w:lang w:val="es-ES" w:eastAsia="es-AR"/>
+        </w:rPr>
+        <w:lastRenderedPageBreak/>
+        <w:t xml:space="preserve">Para evitar que en la implementación se utilicen </w:t>
+      </w:r>
+      <w:r>
+        <w:rPr>
+          <w:rFonts w:eastAsiaTheme="minorEastAsia"/>
+          <w:lang w:eastAsia="es-AR"/>
+        </w:rPr>
+        <w:t>iteraciones complejas y resolver polinomios de tercer grado</w:t>
+      </w:r>
+      <w:r>
+        <w:rPr>
+          <w:rFonts w:eastAsiaTheme="minorEastAsia"/>
+          <w:lang w:eastAsia="es-AR"/>
+        </w:rPr>
+        <w:t xml:space="preserve"> implementamos </w:t>
+      </w:r>
+      <w:r>
+        <w:rPr>
+          <w:rFonts w:eastAsiaTheme="minorEastAsia"/>
+          <w:lang w:eastAsia="es-AR"/>
+        </w:rPr>
+        <w:t>la Ecuación de Torricelli</w:t>
+      </w:r>
+      <w:r>
+        <w:rPr>
+          <w:rFonts w:eastAsiaTheme="minorEastAsia"/>
+          <w:lang w:eastAsia="es-AR"/>
+        </w:rPr>
+        <w:t>:</w:t>
+      </w:r>
+      <w:r>
+        <w:rPr>
+          <w:rFonts w:eastAsiaTheme="minorEastAsia"/>
+          <w:lang w:eastAsia="es-AR"/>
+        </w:rPr>
+        <w:br/>
+      </w:r>
+      <m:oMathPara>
+        <m:oMath>
+          <m:sSub>
+            <m:sSubPr>
+              <m:ctrlPr>
+                <w:rPr>
+                  <w:rFonts w:ascii="Cambria Math" w:eastAsiaTheme="minorEastAsia" w:hAnsi="Cambria Math"/>
+                </w:rPr>
+              </m:ctrlPr>
+            </m:sSubPr>
+            <m:e>
+              <m:r>
+                <w:rPr>
+                  <w:rFonts w:ascii="Cambria Math" w:eastAsiaTheme="minorEastAsia" w:hAnsi="Cambria Math"/>
+                </w:rPr>
+                <m:t>v</m:t>
+              </m:r>
+            </m:e>
+            <m:sub>
+              <m:r>
+                <w:rPr>
+                  <w:rFonts w:ascii="Cambria Math" w:eastAsiaTheme="minorEastAsia" w:hAnsi="Cambria Math"/>
+                </w:rPr>
+                <m:t>f</m:t>
+              </m:r>
+            </m:sub>
+          </m:sSub>
+          <m:r>
+            <w:rPr>
+              <w:rFonts w:ascii="Cambria Math" w:eastAsiaTheme="minorEastAsia" w:hAnsi="Cambria Math"/>
+            </w:rPr>
+            <m:t>=</m:t>
+          </m:r>
+          <m:rad>
+            <m:radPr>
+              <m:degHide m:val="1"/>
+              <m:ctrlPr>
+                <w:rPr>
+                  <w:rFonts w:ascii="Cambria Math" w:eastAsiaTheme="minorEastAsia" w:hAnsi="Cambria Math"/>
+                </w:rPr>
+              </m:ctrlPr>
+            </m:radPr>
+            <m:deg/>
+            <m:e>
+              <m:sSubSup>
+                <m:sSubSupPr>
+                  <m:ctrlPr>
+                    <w:rPr>
+                      <w:rFonts w:ascii="Cambria Math" w:eastAsiaTheme="minorEastAsia" w:hAnsi="Cambria Math"/>
+                    </w:rPr>
+                  </m:ctrlPr>
+                </m:sSubSupPr>
+                <m:e>
+                  <m:r>
+                    <w:rPr>
+                      <w:rFonts w:ascii="Cambria Math" w:eastAsiaTheme="minorEastAsia" w:hAnsi="Cambria Math"/>
+                    </w:rPr>
+                    <m:t>v</m:t>
+                  </m:r>
+                </m:e>
+                <m:sub>
+                  <m:r>
+                    <w:rPr>
+                      <w:rFonts w:ascii="Cambria Math" w:eastAsiaTheme="minorEastAsia" w:hAnsi="Cambria Math"/>
+                    </w:rPr>
+                    <m:t>0</m:t>
+                  </m:r>
+                </m:sub>
+                <m:sup>
+                  <m:r>
+                    <w:rPr>
+                      <w:rFonts w:ascii="Cambria Math" w:eastAsiaTheme="minorEastAsia" w:hAnsi="Cambria Math"/>
+                    </w:rPr>
+                    <m:t>2</m:t>
+                  </m:r>
+                </m:sup>
+              </m:sSubSup>
+              <m:r>
+                <w:rPr>
+                  <w:rFonts w:ascii="Cambria Math" w:eastAsiaTheme="minorEastAsia" w:hAnsi="Cambria Math"/>
+                </w:rPr>
+                <m:t>+2⋅a⋅</m:t>
+              </m:r>
+              <m:r>
+                <m:rPr>
+                  <m:sty m:val="p"/>
+                </m:rPr>
+                <w:rPr>
+                  <w:rFonts w:ascii="Cambria Math" w:eastAsiaTheme="minorEastAsia" w:hAnsi="Cambria Math"/>
+                </w:rPr>
+                <m:t>Δ</m:t>
+              </m:r>
+              <m:r>
+                <w:rPr>
+                  <w:rFonts w:ascii="Cambria Math" w:eastAsiaTheme="minorEastAsia" w:hAnsi="Cambria Math"/>
+                </w:rPr>
+                <m:t>s</m:t>
+              </m:r>
+            </m:e>
+          </m:rad>
+        </m:oMath>
+      </m:oMathPara>
+    </w:p>
+    <w:p>
+      <w:pPr>
+        <w:rPr>
+          <w:rFonts w:eastAsiaTheme="minorEastAsia"/>
+          <w:lang w:eastAsia="es-AR"/>
+        </w:rPr>
+      </w:pPr>
+      <w:r>
+        <w:rPr>
+          <w:rFonts w:eastAsiaTheme="minorEastAsia"/>
+          <w:lang w:eastAsia="es-AR"/>
+        </w:rPr>
+        <w:t>Al usar esta fórmula, solo necesitamos la aceleración constante (</w:t>
+      </w:r>
+      <m:oMath>
+        <m:sSub>
+          <m:sSubPr>
+            <m:ctrlPr>
+              <w:rPr>
+                <w:rFonts w:ascii="Cambria Math" w:eastAsiaTheme="minorEastAsia" w:hAnsi="Cambria Math"/>
+                <w:lang w:eastAsia="es-AR"/>
+              </w:rPr>
+            </m:ctrlPr>
+          </m:sSubPr>
+          <m:e>
+            <m:r>
+              <w:rPr>
+                <w:rFonts w:ascii="Cambria Math" w:eastAsiaTheme="minorEastAsia" w:hAnsi="Cambria Math"/>
+                <w:lang w:eastAsia="es-AR"/>
+              </w:rPr>
+              <m:t>A</m:t>
+            </m:r>
+          </m:e>
+          <m:sub>
+            <m:r>
+              <w:rPr>
+                <w:rFonts w:ascii="Cambria Math" w:eastAsiaTheme="minorEastAsia" w:hAnsi="Cambria Math"/>
+                <w:lang w:eastAsia="es-AR"/>
+              </w:rPr>
+              <m:t>MAX</m:t>
+            </m:r>
+          </m:sub>
+        </m:sSub>
+      </m:oMath>
+      <w:r>
+        <w:rPr>
+          <w:rFonts w:eastAsiaTheme="minorEastAsia"/>
+          <w:lang w:eastAsia="es-AR"/>
+        </w:rPr>
+        <w:t>) y la distancia entre los nodos del spline (</w:t>
+      </w:r>
+      <m:oMath>
+        <m:r>
+          <w:rPr>
+            <w:rFonts w:ascii="Cambria Math" w:eastAsiaTheme="minorEastAsia" w:hAnsi="Cambria Math"/>
+            <w:lang w:eastAsia="es-AR"/>
+          </w:rPr>
+          <m:t>ds</m:t>
+        </m:r>
+      </m:oMath>
+      <w:r>
+        <w:rPr>
+          <w:rFonts w:eastAsiaTheme="minorEastAsia"/>
+          <w:lang w:eastAsia="es-AR"/>
+        </w:rPr>
+        <w:t>).</w:t>
+      </w:r>
+    </w:p>
+    <w:p>
+      <w:pPr>
+        <w:rPr>
+          <w:rFonts w:eastAsiaTheme="minorEastAsia"/>
+          <w:lang w:eastAsia="es-AR"/>
+        </w:rPr>
+      </w:pPr>
+      <w:r>
+        <w:rPr>
+          <w:rFonts w:eastAsiaTheme="minorEastAsia"/>
+          <w:lang w:eastAsia="es-AR"/>
+        </w:rPr>
+        <w:t xml:space="preserve">Para aplicar esta aceleración constante y asegurar que el dron respete los límites en las curvas, </w:t>
+      </w:r>
+      <w:r>
+        <w:rPr>
+          <w:rFonts w:eastAsiaTheme="minorEastAsia"/>
+          <w:lang w:eastAsia="es-AR"/>
+        </w:rPr>
+        <w:t>aplicamos un</w:t>
+      </w:r>
+      <w:r>
+        <w:rPr>
+          <w:rFonts w:eastAsiaTheme="minorEastAsia"/>
+          <w:lang w:eastAsia="es-AR"/>
+        </w:rPr>
+        <w:t xml:space="preserve"> </w:t>
+      </w:r>
+      <w:r>
+        <w:rPr>
+          <w:rFonts w:eastAsiaTheme="minorEastAsia"/>
+          <w:lang w:eastAsia="es-AR"/>
+        </w:rPr>
+        <w:t>algoritmo de doble barrido</w:t>
+      </w:r>
+      <w:r>
+        <w:rPr>
+          <w:rFonts w:eastAsiaTheme="minorEastAsia"/>
+          <w:lang w:eastAsia="es-AR"/>
+        </w:rPr>
+        <w:t>.</w:t>
+      </w:r>
+    </w:p>
+    <w:p>
+      <w:pPr>
+        <w:pStyle w:val="Ttulo2"/>
+        <w:rPr>
+          <w:rFonts w:eastAsiaTheme="minorEastAsia"/>
+          <w:lang w:eastAsia="es-AR"/>
+        </w:rPr>
+      </w:pPr>
+      <w:r>
+        <w:rPr>
+          <w:rFonts w:eastAsiaTheme="minorEastAsia"/>
+          <w:lang w:eastAsia="es-AR"/>
+        </w:rPr>
+        <w:t>Implementación de Parámetros</w:t>
+      </w:r>
+    </w:p>
+    <w:p>
+      <w:pPr>
+        <w:rPr>
+          <w:rFonts w:eastAsiaTheme="minorEastAsia"/>
+          <w:lang w:eastAsia="es-AR"/>
+        </w:rPr>
+      </w:pPr>
+      <w:r>
+        <w:rPr>
+          <w:rFonts w:eastAsiaTheme="minorEastAsia"/>
+          <w:lang w:eastAsia="es-AR"/>
+        </w:rPr>
+        <w:t xml:space="preserve">Primer </w:t>
+      </w:r>
+      <w:r>
+        <w:rPr>
+          <w:rFonts w:eastAsiaTheme="minorEastAsia"/>
+          <w:lang w:eastAsia="es-AR"/>
+        </w:rPr>
+        <w:t>Barrido: El algoritmo recorre la trayectoria desde el inicio aplicando la aceleración tangencial máxima (</w:t>
+      </w:r>
+      <m:oMath>
+        <m:sSub>
+          <m:sSubPr>
+            <m:ctrlPr>
+              <w:rPr>
+                <w:rFonts w:ascii="Cambria Math" w:eastAsiaTheme="minorEastAsia" w:hAnsi="Cambria Math"/>
+                <w:lang w:eastAsia="es-AR"/>
+              </w:rPr>
+            </m:ctrlPr>
+          </m:sSubPr>
+          <m:e>
+            <m:r>
+              <w:rPr>
+                <w:rFonts w:ascii="Cambria Math" w:eastAsiaTheme="minorEastAsia" w:hAnsi="Cambria Math"/>
+                <w:lang w:eastAsia="es-AR"/>
+              </w:rPr>
+              <m:t>A</m:t>
+            </m:r>
+          </m:e>
+          <m:sub>
+            <m:r>
+              <w:rPr>
+                <w:rFonts w:ascii="Cambria Math" w:eastAsiaTheme="minorEastAsia" w:hAnsi="Cambria Math"/>
+                <w:lang w:eastAsia="es-AR"/>
+              </w:rPr>
+              <m:t>MAX</m:t>
+            </m:r>
+          </m:sub>
+        </m:sSub>
+      </m:oMath>
+      <w:r>
+        <w:rPr>
+          <w:rFonts w:eastAsiaTheme="minorEastAsia"/>
+          <w:lang w:eastAsia="es-AR"/>
+        </w:rPr>
+        <w:t>), incrementando la velocidad hasta saturar en el límite cinemático local (</w:t>
+      </w:r>
+      <m:oMath>
+        <m:sSub>
+          <m:sSubPr>
+            <m:ctrlPr>
+              <w:rPr>
+                <w:rFonts w:ascii="Cambria Math" w:eastAsiaTheme="minorEastAsia" w:hAnsi="Cambria Math"/>
+                <w:lang w:eastAsia="es-AR"/>
+              </w:rPr>
+            </m:ctrlPr>
+          </m:sSubPr>
+          <m:e>
+            <m:r>
+              <w:rPr>
+                <w:rFonts w:ascii="Cambria Math" w:eastAsiaTheme="minorEastAsia" w:hAnsi="Cambria Math"/>
+                <w:lang w:eastAsia="es-AR"/>
+              </w:rPr>
+              <m:t>v</m:t>
+            </m:r>
+          </m:e>
+          <m:sub>
+            <m:r>
+              <w:rPr>
+                <w:rFonts w:ascii="Cambria Math" w:eastAsiaTheme="minorEastAsia" w:hAnsi="Cambria Math"/>
+                <w:lang w:eastAsia="es-AR"/>
+              </w:rPr>
+              <m:t>limite</m:t>
+            </m:r>
+          </m:sub>
+        </m:sSub>
+      </m:oMath>
+      <w:r>
+        <w:rPr>
+          <w:rFonts w:eastAsiaTheme="minorEastAsia"/>
+          <w:lang w:eastAsia="es-AR"/>
+        </w:rPr>
+        <w:t>) impuesto por la curvatura. Esto genera las rampas de aceleración.</w:t>
+      </w:r>
+    </w:p>
+    <w:p>
+      <w:pPr>
+        <w:rPr>
+          <w:rFonts w:eastAsiaTheme="minorEastAsia"/>
+          <w:lang w:eastAsia="es-AR"/>
+        </w:rPr>
+      </w:pPr>
+      <w:r>
+        <w:rPr>
+          <w:rFonts w:eastAsiaTheme="minorEastAsia"/>
+          <w:lang w:eastAsia="es-AR"/>
+        </w:rPr>
+        <w:t xml:space="preserve">Segundo </w:t>
+      </w:r>
+      <w:r>
+        <w:rPr>
+          <w:rFonts w:eastAsiaTheme="minorEastAsia"/>
+          <w:lang w:eastAsia="es-AR"/>
+        </w:rPr>
+        <w:t xml:space="preserve">Barrido: Se recorre la trayectoria en sentido inverso para propagar las restricciones de velocidad hacia atrás. Esto calcula la desaceleración necesaria con </w:t>
+      </w:r>
+      <m:oMath>
+        <m:sSub>
+          <m:sSubPr>
+            <m:ctrlPr>
+              <w:rPr>
+                <w:rFonts w:ascii="Cambria Math" w:eastAsiaTheme="minorEastAsia" w:hAnsi="Cambria Math"/>
+                <w:lang w:eastAsia="es-AR"/>
+              </w:rPr>
+            </m:ctrlPr>
+          </m:sSubPr>
+          <m:e>
+            <m:r>
+              <w:rPr>
+                <w:rFonts w:ascii="Cambria Math" w:eastAsiaTheme="minorEastAsia" w:hAnsi="Cambria Math"/>
+                <w:lang w:eastAsia="es-AR"/>
+              </w:rPr>
+              <m:t>A</m:t>
+            </m:r>
+          </m:e>
+          <m:sub>
+            <m:r>
+              <w:rPr>
+                <w:rFonts w:ascii="Cambria Math" w:eastAsiaTheme="minorEastAsia" w:hAnsi="Cambria Math"/>
+                <w:lang w:eastAsia="es-AR"/>
+              </w:rPr>
+              <m:t>MAX</m:t>
+            </m:r>
+          </m:sub>
+        </m:sSub>
+      </m:oMath>
+      <w:r>
+        <w:rPr>
+          <w:rFonts w:eastAsiaTheme="minorEastAsia"/>
+          <w:lang w:eastAsia="es-AR"/>
+        </w:rPr>
+        <w:t>, garantizando que la aeronave anticipe el frenado y respete la velocidad máxima exigida al ingresar a cada curva.</w:t>
+      </w:r>
+    </w:p>
+    <w:p>
+      <w:pPr>
+        <w:pStyle w:val="Ttulo2"/>
+        <w:rPr>
+          <w:rFonts w:eastAsiaTheme="minorEastAsia"/>
+          <w:lang w:eastAsia="es-AR"/>
+        </w:rPr>
+      </w:pPr>
+      <w:r>
+        <w:rPr>
+          <w:rFonts w:eastAsiaTheme="minorEastAsia"/>
+          <w:lang w:eastAsia="es-AR"/>
+        </w:rPr>
+        <w:t>Restricción en Curvas</w:t>
+      </w:r>
+    </w:p>
+    <w:p>
+      <w:pPr>
+        <w:rPr>
+          <w:lang w:eastAsia="es-AR"/>
+        </w:rPr>
+      </w:pPr>
+      <w:r>
+        <w:rPr>
+          <w:lang w:eastAsia="es-AR"/>
+        </w:rPr>
+        <w:t xml:space="preserve">Para que el límite cinemático local mencionado en los barridos </w:t>
+      </w:r>
+      <w:r>
+        <w:rPr>
+          <w:lang w:eastAsia="es-AR"/>
+        </w:rPr>
+        <w:t>sea físicamente posible</w:t>
+      </w:r>
+      <w:r>
+        <w:rPr>
+          <w:lang w:eastAsia="es-AR"/>
+        </w:rPr>
+        <w:t xml:space="preserve">, se debió modelar la dinámica de giro del dron. En los multicópteros, el giro depende del ángulo máximo de alabeo (roll) permitido por el chasis, típicamente limitado a 31.45° para no perder sustentación. Utilizando la aceleración de la gravedad (9.81 m/s²), la aceleración centrípeta máxima sostenible se calculó analíticamente como </w:t>
+      </w:r>
+      <m:oMath>
+        <m:sSub>
+          <m:sSubPr>
+            <m:ctrlPr>
+              <w:rPr>
+                <w:rFonts w:ascii="Cambria Math" w:hAnsi="Cambria Math"/>
+                <w:lang w:eastAsia="es-AR"/>
+              </w:rPr>
+            </m:ctrlPr>
+          </m:sSubPr>
+          <m:e>
+            <m:r>
+              <w:rPr>
+                <w:rFonts w:ascii="Cambria Math" w:hAnsi="Cambria Math"/>
+                <w:lang w:eastAsia="es-AR"/>
+              </w:rPr>
+              <m:t>A</m:t>
+            </m:r>
+          </m:e>
+          <m:sub>
+            <m:r>
+              <w:rPr>
+                <w:rFonts w:ascii="Cambria Math" w:hAnsi="Cambria Math"/>
+                <w:lang w:eastAsia="es-AR"/>
+              </w:rPr>
+              <m:t>c</m:t>
+            </m:r>
+          </m:sub>
+        </m:sSub>
+        <m:r>
+          <w:rPr>
+            <w:rFonts w:ascii="Cambria Math" w:hAnsi="Cambria Math"/>
+            <w:lang w:eastAsia="es-AR"/>
+          </w:rPr>
+          <m:t>=g⋅</m:t>
+        </m:r>
+        <m:func>
+          <m:funcPr>
+            <m:ctrlPr>
+              <w:rPr>
+                <w:rFonts w:ascii="Cambria Math" w:hAnsi="Cambria Math"/>
+                <w:lang w:eastAsia="es-AR"/>
+              </w:rPr>
+            </m:ctrlPr>
+          </m:funcPr>
+          <m:fName>
+            <m:r>
+              <m:rPr>
+                <m:sty m:val="p"/>
+              </m:rPr>
+              <w:rPr>
+                <w:rFonts w:ascii="Cambria Math" w:hAnsi="Cambria Math"/>
+                <w:lang w:eastAsia="es-AR"/>
+              </w:rPr>
+              <m:t>tan</m:t>
+            </m:r>
+          </m:fName>
+          <m:e>
+            <m:d>
+              <m:dPr>
+                <m:ctrlPr>
+                  <w:rPr>
+                    <w:rFonts w:ascii="Cambria Math" w:hAnsi="Cambria Math"/>
+                    <w:lang w:eastAsia="es-AR"/>
+                  </w:rPr>
+                </m:ctrlPr>
+              </m:dPr>
+              <m:e>
+                <m:sSup>
+                  <m:sSupPr>
+                    <m:ctrlPr>
+                      <w:rPr>
+                        <w:rFonts w:ascii="Cambria Math" w:hAnsi="Cambria Math"/>
+                        <w:lang w:eastAsia="es-AR"/>
+                      </w:rPr>
+                    </m:ctrlPr>
+                  </m:sSupPr>
+                  <m:e>
+                    <m:r>
+                      <w:rPr>
+                        <w:rFonts w:ascii="Cambria Math" w:hAnsi="Cambria Math"/>
+                        <w:lang w:eastAsia="es-AR"/>
+                      </w:rPr>
+                      <m:t>31.45</m:t>
+                    </m:r>
+                  </m:e>
+                  <m:sup>
+                    <m:r>
+                      <w:rPr>
+                        <w:rFonts w:ascii="Cambria Math" w:hAnsi="Cambria Math"/>
+                        <w:lang w:eastAsia="es-AR"/>
+                      </w:rPr>
+                      <m:t>∘</m:t>
+                    </m:r>
+                  </m:sup>
+                </m:sSup>
+              </m:e>
+            </m:d>
+          </m:e>
+        </m:func>
+        <m:r>
+          <w:rPr>
+            <w:rFonts w:ascii="Cambria Math" w:hAnsi="Cambria Math"/>
+            <w:lang w:eastAsia="es-AR"/>
+          </w:rPr>
+          <m:t>≈6.0</m:t>
+        </m:r>
+        <m:sSup>
+          <m:sSupPr>
+            <m:ctrlPr>
+              <w:rPr>
+                <w:rFonts w:ascii="Cambria Math" w:hAnsi="Cambria Math"/>
+                <w:lang w:eastAsia="es-AR"/>
+              </w:rPr>
+            </m:ctrlPr>
+          </m:sSupPr>
+          <m:e>
+            <m:r>
+              <m:rPr>
+                <m:nor/>
+              </m:rPr>
+              <w:rPr>
+                <w:lang w:eastAsia="es-AR"/>
+              </w:rPr>
+              <m:t> m/s</m:t>
+            </m:r>
+          </m:e>
+          <m:sup>
+            <m:r>
+              <w:rPr>
+                <w:rFonts w:ascii="Cambria Math" w:hAnsi="Cambria Math"/>
+                <w:lang w:eastAsia="es-AR"/>
+              </w:rPr>
+              <m:t>2</m:t>
+            </m:r>
+          </m:sup>
+        </m:sSup>
+      </m:oMath>
+      <w:r>
+        <w:rPr>
+          <w:lang w:eastAsia="es-AR"/>
+        </w:rPr>
+        <w:t>. Si una curva en el spline superaba esta curvatura, el algoritmo calculaba la velocidad máxima segura y forzaba el frenado.</w:t>
+      </w:r>
+    </w:p>
+    <w:p>
+      <w:pPr>
+        <w:pStyle w:val="Ttulo2"/>
+        <w:rPr>
+          <w:rFonts w:eastAsiaTheme="minorEastAsia"/>
+          <w:lang w:eastAsia="es-AR"/>
+        </w:rPr>
+      </w:pPr>
+      <w:r>
+        <w:rPr>
+          <w:rFonts w:eastAsiaTheme="minorEastAsia"/>
+          <w:lang w:eastAsia="es-AR"/>
+        </w:rPr>
+        <w:t>Calibración Numérica (Desacople Cinemático)</w:t>
+      </w:r>
+    </w:p>
+    <w:p>
+      <w:pPr>
+        <w:rPr>
+          <w:rFonts w:eastAsiaTheme="minorEastAsia"/>
+          <w:lang w:eastAsia="es-AR"/>
+        </w:rPr>
+      </w:pPr>
+      <w:r>
+        <w:rPr>
+          <w:rFonts w:eastAsiaTheme="minorEastAsia"/>
+          <w:lang w:eastAsia="es-AR"/>
+        </w:rPr>
+        <w:t xml:space="preserve">Dado que el algoritmo de renderizado y flujo óptico trabaja en el espacio de la imagen, fue obligatorio establecer un factor de conversión entre la física real y los píxeles. Al aislar la cinemática en el Caso B del inciso anterior (sin el efecto distorsivo del zoom), la velocidad observada se estabilizó en </w:t>
+      </w:r>
+      <m:oMath>
+        <m:r>
+          <w:rPr>
+            <w:rFonts w:ascii="Cambria Math" w:eastAsiaTheme="minorEastAsia" w:hAnsi="Cambria Math"/>
+            <w:lang w:eastAsia="es-AR"/>
+          </w:rPr>
+          <m:t>350</m:t>
+        </m:r>
+        <m:r>
+          <m:rPr>
+            <m:nor/>
+          </m:rPr>
+          <w:rPr>
+            <w:rFonts w:eastAsiaTheme="minorEastAsia"/>
+            <w:lang w:eastAsia="es-AR"/>
+          </w:rPr>
+          <m:t> px/s</m:t>
+        </m:r>
+      </m:oMath>
+      <w:r>
+        <w:rPr>
+          <w:rFonts w:eastAsiaTheme="minorEastAsia"/>
+          <w:lang w:eastAsia="es-AR"/>
+        </w:rPr>
+        <w:t>. Al vincular este límite empírico con nuestra velocidad real de crucero elegida (</w:t>
+      </w:r>
+      <m:oMath>
+        <m:r>
+          <w:rPr>
+            <w:rFonts w:ascii="Cambria Math" w:eastAsiaTheme="minorEastAsia" w:hAnsi="Cambria Math"/>
+            <w:lang w:eastAsia="es-AR"/>
+          </w:rPr>
+          <m:t>7.0</m:t>
+        </m:r>
+        <m:r>
+          <m:rPr>
+            <m:nor/>
+          </m:rPr>
+          <w:rPr>
+            <w:rFonts w:eastAsiaTheme="minorEastAsia"/>
+            <w:lang w:eastAsia="es-AR"/>
+          </w:rPr>
+          <m:t> m/s</m:t>
+        </m:r>
+      </m:oMath>
+      <w:r>
+        <w:rPr>
+          <w:rFonts w:eastAsiaTheme="minorEastAsia"/>
+          <w:lang w:eastAsia="es-AR"/>
+        </w:rPr>
+        <w:t xml:space="preserve">), se dedujo una escala cinemática exacta de </w:t>
+      </w:r>
+      <m:oMath>
+        <m:r>
+          <w:rPr>
+            <w:rFonts w:ascii="Cambria Math" w:eastAsiaTheme="minorEastAsia" w:hAnsi="Cambria Math"/>
+            <w:lang w:eastAsia="es-AR"/>
+          </w:rPr>
+          <m:t>50</m:t>
+        </m:r>
+        <m:r>
+          <m:rPr>
+            <m:nor/>
+          </m:rPr>
+          <w:rPr>
+            <w:rFonts w:eastAsiaTheme="minorEastAsia"/>
+            <w:lang w:eastAsia="es-AR"/>
+          </w:rPr>
+          <m:t> px/m</m:t>
+        </m:r>
+      </m:oMath>
+      <w:r>
+        <w:rPr>
+          <w:rFonts w:eastAsiaTheme="minorEastAsia"/>
+          <w:lang w:eastAsia="es-AR"/>
+        </w:rPr>
+        <w:t xml:space="preserve"> (</w:t>
+      </w:r>
+      <m:oMath>
+        <m:r>
+          <w:rPr>
+            <w:rFonts w:ascii="Cambria Math" w:eastAsiaTheme="minorEastAsia" w:hAnsi="Cambria Math"/>
+            <w:lang w:eastAsia="es-AR"/>
+          </w:rPr>
+          <m:t>350/7</m:t>
+        </m:r>
+      </m:oMath>
+      <w:r>
+        <w:rPr>
+          <w:rFonts w:eastAsiaTheme="minorEastAsia"/>
+          <w:lang w:eastAsia="es-AR"/>
+        </w:rPr>
+        <w:t>). Este factor permitió mapear nuestros límites físicos (</w:t>
+      </w:r>
+      <m:oMath>
+        <m:sSub>
+          <m:sSubPr>
+            <m:ctrlPr>
+              <w:rPr>
+                <w:rFonts w:ascii="Cambria Math" w:eastAsiaTheme="minorEastAsia" w:hAnsi="Cambria Math"/>
+                <w:lang w:eastAsia="es-AR"/>
+              </w:rPr>
+            </m:ctrlPr>
+          </m:sSubPr>
+          <m:e>
+            <m:r>
+              <w:rPr>
+                <w:rFonts w:ascii="Cambria Math" w:eastAsiaTheme="minorEastAsia" w:hAnsi="Cambria Math"/>
+                <w:lang w:eastAsia="es-AR"/>
+              </w:rPr>
+              <m:t>A</m:t>
+            </m:r>
+          </m:e>
+          <m:sub>
+            <m:r>
+              <w:rPr>
+                <w:rFonts w:ascii="Cambria Math" w:eastAsiaTheme="minorEastAsia" w:hAnsi="Cambria Math"/>
+                <w:lang w:eastAsia="es-AR"/>
+              </w:rPr>
+              <m:t>max</m:t>
+            </m:r>
+          </m:sub>
+        </m:sSub>
+        <m:r>
+          <w:rPr>
+            <w:rFonts w:ascii="Cambria Math" w:eastAsiaTheme="minorEastAsia" w:hAnsi="Cambria Math"/>
+            <w:lang w:eastAsia="es-AR"/>
+          </w:rPr>
+          <m:t>=3</m:t>
+        </m:r>
+        <m:r>
+          <w:rPr>
+            <w:rFonts w:ascii="Cambria Math" w:eastAsiaTheme="minorEastAsia" w:hAnsi="Cambria Math"/>
+            <w:lang w:eastAsia="es-AR"/>
+          </w:rPr>
+          <m:t>.0</m:t>
+        </m:r>
+        <m:sSup>
+          <m:sSupPr>
+            <m:ctrlPr>
+              <w:rPr>
+                <w:rFonts w:ascii="Cambria Math" w:eastAsiaTheme="minorEastAsia" w:hAnsi="Cambria Math"/>
+                <w:lang w:eastAsia="es-AR"/>
+              </w:rPr>
+            </m:ctrlPr>
+          </m:sSupPr>
+          <m:e>
+            <m:r>
+              <m:rPr>
+                <m:nor/>
+              </m:rPr>
+              <w:rPr>
+                <w:rFonts w:eastAsiaTheme="minorEastAsia"/>
+                <w:lang w:eastAsia="es-AR"/>
+              </w:rPr>
+              <m:t> m/s</m:t>
+            </m:r>
+          </m:e>
+          <m:sup>
+            <m:r>
+              <w:rPr>
+                <w:rFonts w:ascii="Cambria Math" w:eastAsiaTheme="minorEastAsia" w:hAnsi="Cambria Math"/>
+                <w:lang w:eastAsia="es-AR"/>
+              </w:rPr>
+              <m:t>2</m:t>
+            </m:r>
+          </m:sup>
+        </m:sSup>
+      </m:oMath>
+      <w:r>
+        <w:rPr>
+          <w:rFonts w:eastAsiaTheme="minorEastAsia"/>
+          <w:lang w:eastAsia="es-AR"/>
+        </w:rPr>
+        <w:t xml:space="preserve"> y </w:t>
+      </w:r>
+      <m:oMath>
+        <m:sSub>
+          <m:sSubPr>
+            <m:ctrlPr>
+              <w:rPr>
+                <w:rFonts w:ascii="Cambria Math" w:eastAsiaTheme="minorEastAsia" w:hAnsi="Cambria Math"/>
+                <w:lang w:eastAsia="es-AR"/>
+              </w:rPr>
+            </m:ctrlPr>
+          </m:sSubPr>
+          <m:e>
+            <m:r>
+              <w:rPr>
+                <w:rFonts w:ascii="Cambria Math" w:eastAsiaTheme="minorEastAsia" w:hAnsi="Cambria Math"/>
+                <w:lang w:eastAsia="es-AR"/>
+              </w:rPr>
+              <m:t>A</m:t>
+            </m:r>
+          </m:e>
+          <m:sub>
+            <m:r>
+              <w:rPr>
+                <w:rFonts w:ascii="Cambria Math" w:eastAsiaTheme="minorEastAsia" w:hAnsi="Cambria Math"/>
+                <w:lang w:eastAsia="es-AR"/>
+              </w:rPr>
+              <m:t>c_max</m:t>
+            </m:r>
+          </m:sub>
+        </m:sSub>
+        <m:r>
+          <w:rPr>
+            <w:rFonts w:ascii="Cambria Math" w:eastAsiaTheme="minorEastAsia" w:hAnsi="Cambria Math"/>
+            <w:lang w:eastAsia="es-AR"/>
+          </w:rPr>
+          <m:t>=6</m:t>
+        </m:r>
+        <m:sSup>
+          <m:sSupPr>
+            <m:ctrlPr>
+              <w:rPr>
+                <w:rFonts w:ascii="Cambria Math" w:eastAsiaTheme="minorEastAsia" w:hAnsi="Cambria Math"/>
+                <w:lang w:eastAsia="es-AR"/>
+              </w:rPr>
+            </m:ctrlPr>
+          </m:sSupPr>
+          <m:e>
+            <m:r>
+              <m:rPr>
+                <m:nor/>
+              </m:rPr>
+              <w:rPr>
+                <w:rFonts w:eastAsiaTheme="minorEastAsia"/>
+                <w:lang w:eastAsia="es-AR"/>
+              </w:rPr>
+              <m:t> m/s</m:t>
+            </m:r>
+          </m:e>
+          <m:sup>
+            <m:r>
+              <w:rPr>
+                <w:rFonts w:ascii="Cambria Math" w:eastAsiaTheme="minorEastAsia" w:hAnsi="Cambria Math"/>
+                <w:lang w:eastAsia="es-AR"/>
+              </w:rPr>
+              <m:t>2</m:t>
+            </m:r>
+          </m:sup>
+        </m:sSup>
+      </m:oMath>
+      <w:r>
+        <w:rPr>
+          <w:rFonts w:eastAsiaTheme="minorEastAsia"/>
+          <w:lang w:eastAsia="es-AR"/>
+        </w:rPr>
+        <w:t xml:space="preserve">) directamente al código como </w:t>
+      </w:r>
+      <m:oMath>
+        <m:r>
+          <w:rPr>
+            <w:rFonts w:ascii="Cambria Math" w:eastAsiaTheme="minorEastAsia" w:hAnsi="Cambria Math"/>
+            <w:lang w:eastAsia="es-AR"/>
+          </w:rPr>
+          <m:t>150</m:t>
+        </m:r>
+        <m:sSup>
+          <m:sSupPr>
+            <m:ctrlPr>
+              <w:rPr>
+                <w:rFonts w:ascii="Cambria Math" w:eastAsiaTheme="minorEastAsia" w:hAnsi="Cambria Math"/>
+                <w:lang w:eastAsia="es-AR"/>
+              </w:rPr>
+            </m:ctrlPr>
+          </m:sSupPr>
+          <m:e>
+            <m:r>
+              <m:rPr>
+                <m:nor/>
+              </m:rPr>
+              <w:rPr>
+                <w:rFonts w:eastAsiaTheme="minorEastAsia"/>
+                <w:lang w:eastAsia="es-AR"/>
+              </w:rPr>
+              <m:t> px/s</m:t>
+            </m:r>
+          </m:e>
+          <m:sup>
+            <m:r>
+              <w:rPr>
+                <w:rFonts w:ascii="Cambria Math" w:eastAsiaTheme="minorEastAsia" w:hAnsi="Cambria Math"/>
+                <w:lang w:eastAsia="es-AR"/>
+              </w:rPr>
+              <m:t>2</m:t>
+            </m:r>
+          </m:sup>
+        </m:sSup>
+      </m:oMath>
+      <w:r>
+        <w:rPr>
+          <w:rFonts w:eastAsiaTheme="minorEastAsia"/>
+          <w:lang w:eastAsia="es-AR"/>
+        </w:rPr>
+        <w:t xml:space="preserve"> y </w:t>
+      </w:r>
+      <m:oMath>
+        <m:r>
+          <w:rPr>
+            <w:rFonts w:ascii="Cambria Math" w:eastAsiaTheme="minorEastAsia" w:hAnsi="Cambria Math"/>
+            <w:lang w:eastAsia="es-AR"/>
+          </w:rPr>
+          <m:t>300</m:t>
+        </m:r>
+        <m:sSup>
+          <m:sSupPr>
+            <m:ctrlPr>
+              <w:rPr>
+                <w:rFonts w:ascii="Cambria Math" w:eastAsiaTheme="minorEastAsia" w:hAnsi="Cambria Math"/>
+                <w:lang w:eastAsia="es-AR"/>
+              </w:rPr>
+            </m:ctrlPr>
+          </m:sSupPr>
+          <m:e>
+            <m:r>
+              <m:rPr>
+                <m:nor/>
+              </m:rPr>
+              <w:rPr>
+                <w:rFonts w:eastAsiaTheme="minorEastAsia"/>
+                <w:lang w:eastAsia="es-AR"/>
+              </w:rPr>
+              <m:t> px/s</m:t>
+            </m:r>
+          </m:e>
+          <m:sup>
+            <m:r>
+              <w:rPr>
+                <w:rFonts w:ascii="Cambria Math" w:eastAsiaTheme="minorEastAsia" w:hAnsi="Cambria Math"/>
+                <w:lang w:eastAsia="es-AR"/>
+              </w:rPr>
+              <m:t>2</m:t>
+            </m:r>
+          </m:sup>
+        </m:sSup>
+      </m:oMath>
+      <w:r>
+        <w:rPr>
+          <w:rFonts w:eastAsiaTheme="minorEastAsia"/>
+          <w:lang w:eastAsia="es-AR"/>
+        </w:rPr>
+        <w:t xml:space="preserve"> respectivamente, resolviendo la ambigüedad de escala del video original.</w:t>
+      </w:r>
+    </w:p>
+    <w:p>
+      <w:pPr>
+        <w:pStyle w:val="Ttulo2"/>
+        <w:rPr>
+          <w:rFonts w:eastAsiaTheme="minorEastAsia"/>
+          <w:lang w:eastAsia="es-AR"/>
+        </w:rPr>
+      </w:pPr>
+      <w:r>
+        <w:rPr>
+          <w:rFonts w:eastAsiaTheme="minorEastAsia"/>
+          <w:lang w:eastAsia="es-AR"/>
+        </w:rPr>
+        <w:lastRenderedPageBreak/>
+        <w:t>Resultados del Flujo Óptico</w:t>
+      </w:r>
+    </w:p>
+    <w:p>
+      <w:pPr>
+        <w:rPr>
+          <w:rFonts w:eastAsiaTheme="minorEastAsia"/>
+          <w:lang w:eastAsia="es-AR"/>
+        </w:rPr>
+      </w:pPr>
+      <w:r>
+        <w:rPr>
+          <w:rFonts w:eastAsiaTheme="minorEastAsia"/>
+          <w:lang w:eastAsia="es-AR"/>
+        </w:rPr>
+        <w:t xml:space="preserve">Finalmente, al someter el video sintetizado con estas condiciones reales al algoritmo de Lucas-Kanade, las gráficas resultantes </w:t>
+      </w:r>
+      <w:r>
+        <w:rPr>
+          <w:rFonts w:eastAsiaTheme="minorEastAsia"/>
+          <w:lang w:eastAsia="es-AR"/>
+        </w:rPr>
+        <w:t>muestran que el nuevo</w:t>
+      </w:r>
+      <w:r>
+        <w:rPr>
+          <w:rFonts w:eastAsiaTheme="minorEastAsia"/>
+          <w:lang w:eastAsia="es-AR"/>
+        </w:rPr>
+        <w:t xml:space="preserve"> modelo</w:t>
+      </w:r>
+      <w:r>
+        <w:rPr>
+          <w:rFonts w:eastAsiaTheme="minorEastAsia"/>
+          <w:lang w:eastAsia="es-AR"/>
+        </w:rPr>
+        <w:t xml:space="preserve"> utilizado es muy satisfactorio</w:t>
+      </w:r>
+      <w:r>
+        <w:rPr>
+          <w:rFonts w:eastAsiaTheme="minorEastAsia"/>
+          <w:lang w:eastAsia="es-AR"/>
+        </w:rPr>
+        <w:t xml:space="preserve">. A diferencia de los incisos previos, la rapidez escalar instantánea dejó de ser constante, </w:t>
+      </w:r>
+      <w:r>
+        <w:rPr>
+          <w:rFonts w:eastAsiaTheme="minorEastAsia"/>
+          <w:lang w:eastAsia="es-AR"/>
+        </w:rPr>
+        <w:t>se muestran</w:t>
+      </w:r>
+      <w:r>
+        <w:rPr>
+          <w:rFonts w:eastAsiaTheme="minorEastAsia"/>
+          <w:lang w:eastAsia="es-AR"/>
+        </w:rPr>
+        <w:t xml:space="preserve"> rampas de aceleración limpias y frenadas pronunciadas en coincidencia exacta con los vértices más cerrados de la trayectoria. Se logró un vuelo matemáticamente libre del ruido de alta frecuencia del gimbal original, pero con un comportamiento dinámico </w:t>
+      </w:r>
+      <w:r>
+        <w:rPr>
+          <w:rFonts w:eastAsiaTheme="minorEastAsia"/>
+          <w:lang w:eastAsia="es-AR"/>
+        </w:rPr>
+        <w:t>muy cercano al</w:t>
+      </w:r>
+      <w:r>
+        <w:rPr>
+          <w:rFonts w:eastAsiaTheme="minorEastAsia"/>
+          <w:lang w:eastAsia="es-AR"/>
+        </w:rPr>
+        <w:t xml:space="preserve"> de un autopiloto comercial.</w:t>
+      </w:r>
+    </w:p>
+    <w:p>
+      <w:pPr>
+        <w:pStyle w:val="Ttulo2"/>
+        <w:rPr>
+          <w:rFonts w:eastAsiaTheme="minorEastAsia"/>
+          <w:lang w:eastAsia="es-AR"/>
+        </w:rPr>
+      </w:pPr>
+      <w:r>
+        <w:rPr>
+          <w:rFonts w:eastAsiaTheme="minorEastAsia"/>
+          <w:lang w:eastAsia="es-AR"/>
+        </w:rPr>
+        <w:t>Conclusión</w:t>
+      </w:r>
+    </w:p>
+    <w:p>
+      <w:pPr>
+        <w:rPr>
+          <w:lang w:eastAsia="es-AR"/>
+        </w:rPr>
+      </w:pPr>
+      <w:r>
+        <w:rPr>
+          <w:lang w:eastAsia="es-AR"/>
+        </w:rPr>
+        <w:t>En conclusión, logramos simular un vuelo físicamente realista aplicando parámetros de drones comerciales. Al definir la escala en 50 px/m, pudimos trasladar estas limitaciones al código de forma directa. Para mantener la eficiencia del sistema, usamos un algoritmo de doble barrido con la ecuación de Torricelli; esto nos permitió simular el frenado en las curvas respetando los límites de aceleración, sin la necesidad de calcular el Jerk. Finalmente, las gráficas de Lucas-Kanade confirmaron que el modelo funciona tal como esperábamos</w:t>
+      </w:r>
+      <w:r>
+        <w:rPr>
+          <w:lang w:eastAsia="es-AR"/>
+        </w:rPr>
+        <w:t>,</w:t>
+      </w:r>
+      <w:r>
+        <w:rPr>
+          <w:lang w:eastAsia="es-AR"/>
+        </w:rPr>
+        <w:t xml:space="preserve"> el dron acelera de forma limpia y frena justo a tiempo al girar, logrando el perfil trapezoidal que </w:t>
+      </w:r>
+      <w:r>
+        <w:rPr>
+          <w:lang w:eastAsia="es-AR"/>
+        </w:rPr>
+        <w:t>comentamos anteriormente</w:t>
+      </w:r>
+      <w:r>
+        <w:rPr>
+          <w:lang w:eastAsia="es-AR"/>
+        </w:rPr>
+        <w:t>.</w:t>
+      </w:r>
+    </w:p>
+    <w:p>
+      <w:pPr>
+        <w:rPr>
+          <w:rFonts w:eastAsiaTheme="minorEastAsia"/>
+          <w:lang w:eastAsia="es-AR"/>
+        </w:rPr>
+      </w:pPr>
+    </w:p>
+    <w:p>
+      <w:pPr>
+        <w:rPr>
+          <w:rFonts w:eastAsiaTheme="minorEastAsia"/>
+          <w:lang w:eastAsia="es-AR"/>
+        </w:rPr>
+      </w:pPr>
+    </w:p>
+    <w:p>
+      <w:pPr>
+        <w:rPr>
+          <w:rFonts w:eastAsiaTheme="minorEastAsia"/>
+          <w:lang w:eastAsia="es-AR"/>
+        </w:rPr>
+      </w:pPr>
+    </w:p>
+    <w:p>
+      <w:pPr>
+        <w:rPr>
+          <w:rFonts w:eastAsiaTheme="minorEastAsia"/>
+          <w:lang w:eastAsia="es-AR"/>
+        </w:rPr>
+      </w:pPr>
+    </w:p>
+    <w:p>
+      <w:pPr>
+        <w:rPr>
+          <w:rFonts w:eastAsiaTheme="minorEastAsia"/>
+          <w:lang w:eastAsia="es-AR"/>
+        </w:rPr>
+      </w:pPr>
+    </w:p>
+    <w:p>
+      <w:pPr>
+        <w:rPr>
+          <w:lang w:eastAsia="es-AR"/>
+        </w:rPr>
+      </w:pPr>
     </w:p>
     <w:p/>
     <w:p/>
@@ -2014,7 +3586,7 @@
 </file>
 
 <file path=word/endnotes.xml><?xml version="1.0" encoding="utf-8"?>
-<w:endnotes xmlns:wpc="http://schemas.microsoft.com/office/word/2010/wordprocessingCanvas" xmlns:cx="http://schemas.microsoft.com/office/drawing/2014/chartex" xmlns:mc="http://schemas.openxmlformats.org/markup-compatibility/2006" xmlns:o="urn:schemas-microsoft-com:office:office" xmlns:r="http://schemas.openxmlformats.org/officeDocument/2006/relationships" xmlns:m="http://schemas.openxmlformats.org/officeDocument/2006/math" xmlns:v="urn:schemas-microsoft-com:vml" xmlns:wp14="http://schemas.microsoft.com/office/word/2010/wordprocessingDrawing" xmlns:wp="http://schemas.openxmlformats.org/drawingml/2006/wordprocessingDrawing" xmlns:w10="urn:schemas-microsoft-com:office:word" xmlns:w="http://schemas.openxmlformats.org/wordprocessingml/2006/main" xmlns:w14="http://schemas.microsoft.com/office/word/2010/wordml" xmlns:w15="http://schemas.microsoft.com/office/word/2012/wordml" xmlns:w16se="http://schemas.microsoft.com/office/word/2015/wordml/symex" xmlns:wpg="http://schemas.microsoft.com/office/word/2010/wordprocessingGroup" xmlns:wpi="http://schemas.microsoft.com/office/word/2010/wordprocessingInk" xmlns:wne="http://schemas.microsoft.com/office/word/2006/wordml" xmlns:wps="http://schemas.microsoft.com/office/word/2010/wordprocessingShape" mc:Ignorable="w14 w15 w16se wp14">
+<w:endnotes xmlns:wpc="http://schemas.microsoft.com/office/word/2010/wordprocessingCanvas" xmlns:cx="http://schemas.microsoft.com/office/drawing/2014/chartex" xmlns:cx1="http://schemas.microsoft.com/office/drawing/2015/9/8/chartex" xmlns:cx2="http://schemas.microsoft.com/office/drawing/2015/10/21/chartex" xmlns:cx3="http://schemas.microsoft.com/office/drawing/2016/5/9/chartex" xmlns:cx4="http://schemas.microsoft.com/office/drawing/2016/5/10/chartex" xmlns:cx5="http://schemas.microsoft.com/office/drawing/2016/5/11/chartex" xmlns:cx6="http://schemas.microsoft.com/office/drawing/2016/5/12/chartex" xmlns:cx7="http://schemas.microsoft.com/office/drawing/2016/5/13/chartex" xmlns:cx8="http://schemas.microsoft.com/office/drawing/2016/5/14/chartex" xmlns:mc="http://schemas.openxmlformats.org/markup-compatibility/2006" xmlns:aink="http://schemas.microsoft.com/office/drawing/2016/ink" xmlns:am3d="http://schemas.microsoft.com/office/drawing/2017/model3d" xmlns:o="urn:schemas-microsoft-com:office:office" xmlns:oel="http://schemas.microsoft.com/office/2019/extlst" xmlns:r="http://schemas.openxmlformats.org/officeDocument/2006/relationships" xmlns:m="http://schemas.openxmlformats.org/officeDocument/2006/math" xmlns:v="urn:schemas-microsoft-com:vml" xmlns:wp14="http://schemas.microsoft.com/office/word/2010/wordprocessingDrawing" xmlns:wp="http://schemas.openxmlformats.org/drawingml/2006/wordprocessingDrawing" xmlns:w10="urn:schemas-microsoft-com:office:word" xmlns:w="http://schemas.openxmlformats.org/wordprocessingml/2006/main" xmlns:w14="http://schemas.microsoft.com/office/word/2010/wordml" xmlns:w15="http://schemas.microsoft.com/office/word/2012/wordml" xmlns:w16cex="http://schemas.microsoft.com/office/word/2018/wordml/cex" xmlns:w16cid="http://schemas.microsoft.com/office/word/2016/wordml/cid" xmlns:w16="http://schemas.microsoft.com/office/word/2018/wordml" xmlns:w16du="http://schemas.microsoft.com/office/word/2023/wordml/word16du" xmlns:w16sdtdh="http://schemas.microsoft.com/office/word/2020/wordml/sdtdatahash" xmlns:w16sdtfl="http://schemas.microsoft.com/office/word/2024/wordml/sdtformatlock" xmlns:w16se="http://schemas.microsoft.com/office/word/2015/wordml/symex" xmlns:wpg="http://schemas.microsoft.com/office/word/2010/wordprocessingGroup" xmlns:wpi="http://schemas.microsoft.com/office/word/2010/wordprocessingInk" xmlns:wne="http://schemas.microsoft.com/office/word/2006/wordml" xmlns:wps="http://schemas.microsoft.com/office/word/2010/wordprocessingShape" mc:Ignorable="w14 w15 w16se w16cid w16 w16cex w16sdtdh w16sdtfl w16du wp14">
   <w:endnote w:type="separator" w:id="-1">
     <w:p>
       <w:pPr>
@@ -2039,7 +3611,7 @@
 </file>
 
 <file path=word/footer1.xml><?xml version="1.0" encoding="utf-8"?>
-<w:ftr xmlns:wpc="http://schemas.microsoft.com/office/word/2010/wordprocessingCanvas" xmlns:cx="http://schemas.microsoft.com/office/drawing/2014/chartex" xmlns:mc="http://schemas.openxmlformats.org/markup-compatibility/2006" xmlns:o="urn:schemas-microsoft-com:office:office" xmlns:r="http://schemas.openxmlformats.org/officeDocument/2006/relationships" xmlns:m="http://schemas.openxmlformats.org/officeDocument/2006/math" xmlns:v="urn:schemas-microsoft-com:vml" xmlns:wp14="http://schemas.microsoft.com/office/word/2010/wordprocessingDrawing" xmlns:wp="http://schemas.openxmlformats.org/drawingml/2006/wordprocessingDrawing" xmlns:w10="urn:schemas-microsoft-com:office:word" xmlns:w="http://schemas.openxmlformats.org/wordprocessingml/2006/main" xmlns:w14="http://schemas.microsoft.com/office/word/2010/wordml" xmlns:w15="http://schemas.microsoft.com/office/word/2012/wordml" xmlns:w16se="http://schemas.microsoft.com/office/word/2015/wordml/symex" xmlns:wpg="http://schemas.microsoft.com/office/word/2010/wordprocessingGroup" xmlns:wpi="http://schemas.microsoft.com/office/word/2010/wordprocessingInk" xmlns:wne="http://schemas.microsoft.com/office/word/2006/wordml" xmlns:wps="http://schemas.microsoft.com/office/word/2010/wordprocessingShape" mc:Ignorable="w14 w15 w16se wp14">
+<w:ftr xmlns:wpc="http://schemas.microsoft.com/office/word/2010/wordprocessingCanvas" xmlns:cx="http://schemas.microsoft.com/office/drawing/2014/chartex" xmlns:cx1="http://schemas.microsoft.com/office/drawing/2015/9/8/chartex" xmlns:cx2="http://schemas.microsoft.com/office/drawing/2015/10/21/chartex" xmlns:cx3="http://schemas.microsoft.com/office/drawing/2016/5/9/chartex" xmlns:cx4="http://schemas.microsoft.com/office/drawing/2016/5/10/chartex" xmlns:cx5="http://schemas.microsoft.com/office/drawing/2016/5/11/chartex" xmlns:cx6="http://schemas.microsoft.com/office/drawing/2016/5/12/chartex" xmlns:cx7="http://schemas.microsoft.com/office/drawing/2016/5/13/chartex" xmlns:cx8="http://schemas.microsoft.com/office/drawing/2016/5/14/chartex" xmlns:mc="http://schemas.openxmlformats.org/markup-compatibility/2006" xmlns:aink="http://schemas.microsoft.com/office/drawing/2016/ink" xmlns:am3d="http://schemas.microsoft.com/office/drawing/2017/model3d" xmlns:o="urn:schemas-microsoft-com:office:office" xmlns:oel="http://schemas.microsoft.com/office/2019/extlst" xmlns:r="http://schemas.openxmlformats.org/officeDocument/2006/relationships" xmlns:m="http://schemas.openxmlformats.org/officeDocument/2006/math" xmlns:v="urn:schemas-microsoft-com:vml" xmlns:wp14="http://schemas.microsoft.com/office/word/2010/wordprocessingDrawing" xmlns:wp="http://schemas.openxmlformats.org/drawingml/2006/wordprocessingDrawing" xmlns:w10="urn:schemas-microsoft-com:office:word" xmlns:w="http://schemas.openxmlformats.org/wordprocessingml/2006/main" xmlns:w14="http://schemas.microsoft.com/office/word/2010/wordml" xmlns:w15="http://schemas.microsoft.com/office/word/2012/wordml" xmlns:w16cex="http://schemas.microsoft.com/office/word/2018/wordml/cex" xmlns:w16cid="http://schemas.microsoft.com/office/word/2016/wordml/cid" xmlns:w16="http://schemas.microsoft.com/office/word/2018/wordml" xmlns:w16du="http://schemas.microsoft.com/office/word/2023/wordml/word16du" xmlns:w16sdtdh="http://schemas.microsoft.com/office/word/2020/wordml/sdtdatahash" xmlns:w16sdtfl="http://schemas.microsoft.com/office/word/2024/wordml/sdtformatlock" xmlns:w16se="http://schemas.microsoft.com/office/word/2015/wordml/symex" xmlns:wpg="http://schemas.microsoft.com/office/word/2010/wordprocessingGroup" xmlns:wpi="http://schemas.microsoft.com/office/word/2010/wordprocessingInk" xmlns:wne="http://schemas.microsoft.com/office/word/2006/wordml" xmlns:wps="http://schemas.microsoft.com/office/word/2010/wordprocessingShape" mc:Ignorable="w14 w15 w16se w16cid w16 w16cex w16sdtdh w16sdtfl w16du wp14">
   <w:p>
     <w:pPr>
       <w:tabs>
@@ -2176,7 +3748,7 @@
 </file>
 
 <file path=word/footnotes.xml><?xml version="1.0" encoding="utf-8"?>
-<w:footnotes xmlns:wpc="http://schemas.microsoft.com/office/word/2010/wordprocessingCanvas" xmlns:cx="http://schemas.microsoft.com/office/drawing/2014/chartex" xmlns:mc="http://schemas.openxmlformats.org/markup-compatibility/2006" xmlns:o="urn:schemas-microsoft-com:office:office" xmlns:r="http://schemas.openxmlformats.org/officeDocument/2006/relationships" xmlns:m="http://schemas.openxmlformats.org/officeDocument/2006/math" xmlns:v="urn:schemas-microsoft-com:vml" xmlns:wp14="http://schemas.microsoft.com/office/word/2010/wordprocessingDrawing" xmlns:wp="http://schemas.openxmlformats.org/drawingml/2006/wordprocessingDrawing" xmlns:w10="urn:schemas-microsoft-com:office:word" xmlns:w="http://schemas.openxmlformats.org/wordprocessingml/2006/main" xmlns:w14="http://schemas.microsoft.com/office/word/2010/wordml" xmlns:w15="http://schemas.microsoft.com/office/word/2012/wordml" xmlns:w16se="http://schemas.microsoft.com/office/word/2015/wordml/symex" xmlns:wpg="http://schemas.microsoft.com/office/word/2010/wordprocessingGroup" xmlns:wpi="http://schemas.microsoft.com/office/word/2010/wordprocessingInk" xmlns:wne="http://schemas.microsoft.com/office/word/2006/wordml" xmlns:wps="http://schemas.microsoft.com/office/word/2010/wordprocessingShape" mc:Ignorable="w14 w15 w16se wp14">
+<w:footnotes xmlns:wpc="http://schemas.microsoft.com/office/word/2010/wordprocessingCanvas" xmlns:cx="http://schemas.microsoft.com/office/drawing/2014/chartex" xmlns:cx1="http://schemas.microsoft.com/office/drawing/2015/9/8/chartex" xmlns:cx2="http://schemas.microsoft.com/office/drawing/2015/10/21/chartex" xmlns:cx3="http://schemas.microsoft.com/office/drawing/2016/5/9/chartex" xmlns:cx4="http://schemas.microsoft.com/office/drawing/2016/5/10/chartex" xmlns:cx5="http://schemas.microsoft.com/office/drawing/2016/5/11/chartex" xmlns:cx6="http://schemas.microsoft.com/office/drawing/2016/5/12/chartex" xmlns:cx7="http://schemas.microsoft.com/office/drawing/2016/5/13/chartex" xmlns:cx8="http://schemas.microsoft.com/office/drawing/2016/5/14/chartex" xmlns:mc="http://schemas.openxmlformats.org/markup-compatibility/2006" xmlns:aink="http://schemas.microsoft.com/office/drawing/2016/ink" xmlns:am3d="http://schemas.microsoft.com/office/drawing/2017/model3d" xmlns:o="urn:schemas-microsoft-com:office:office" xmlns:oel="http://schemas.microsoft.com/office/2019/extlst" xmlns:r="http://schemas.openxmlformats.org/officeDocument/2006/relationships" xmlns:m="http://schemas.openxmlformats.org/officeDocument/2006/math" xmlns:v="urn:schemas-microsoft-com:vml" xmlns:wp14="http://schemas.microsoft.com/office/word/2010/wordprocessingDrawing" xmlns:wp="http://schemas.openxmlformats.org/drawingml/2006/wordprocessingDrawing" xmlns:w10="urn:schemas-microsoft-com:office:word" xmlns:w="http://schemas.openxmlformats.org/wordprocessingml/2006/main" xmlns:w14="http://schemas.microsoft.com/office/word/2010/wordml" xmlns:w15="http://schemas.microsoft.com/office/word/2012/wordml" xmlns:w16cex="http://schemas.microsoft.com/office/word/2018/wordml/cex" xmlns:w16cid="http://schemas.microsoft.com/office/word/2016/wordml/cid" xmlns:w16="http://schemas.microsoft.com/office/word/2018/wordml" xmlns:w16du="http://schemas.microsoft.com/office/word/2023/wordml/word16du" xmlns:w16sdtdh="http://schemas.microsoft.com/office/word/2020/wordml/sdtdatahash" xmlns:w16sdtfl="http://schemas.microsoft.com/office/word/2024/wordml/sdtformatlock" xmlns:w16se="http://schemas.microsoft.com/office/word/2015/wordml/symex" xmlns:wpg="http://schemas.microsoft.com/office/word/2010/wordprocessingGroup" xmlns:wpi="http://schemas.microsoft.com/office/word/2010/wordprocessingInk" xmlns:wne="http://schemas.microsoft.com/office/word/2006/wordml" xmlns:wps="http://schemas.microsoft.com/office/word/2010/wordprocessingShape" mc:Ignorable="w14 w15 w16se w16cid w16 w16cex w16sdtdh w16sdtfl w16du wp14">
   <w:footnote w:type="separator" w:id="-1">
     <w:p>
       <w:pPr>
@@ -2201,7 +3773,7 @@
 </file>
 
 <file path=word/numbering.xml><?xml version="1.0" encoding="utf-8"?>
-<w:numbering xmlns:wpc="http://schemas.microsoft.com/office/word/2010/wordprocessingCanvas" xmlns:cx="http://schemas.microsoft.com/office/drawing/2014/chartex" xmlns:mc="http://schemas.openxmlformats.org/markup-compatibility/2006" xmlns:o="urn:schemas-microsoft-com:office:office" xmlns:r="http://schemas.openxmlformats.org/officeDocument/2006/relationships" xmlns:m="http://schemas.openxmlformats.org/officeDocument/2006/math" xmlns:v="urn:schemas-microsoft-com:vml" xmlns:wp14="http://schemas.microsoft.com/office/word/2010/wordprocessingDrawing" xmlns:wp="http://schemas.openxmlformats.org/drawingml/2006/wordprocessingDrawing" xmlns:w10="urn:schemas-microsoft-com:office:word" xmlns:w="http://schemas.openxmlformats.org/wordprocessingml/2006/main" xmlns:w14="http://schemas.microsoft.com/office/word/2010/wordml" xmlns:w15="http://schemas.microsoft.com/office/word/2012/wordml" xmlns:w16se="http://schemas.microsoft.com/office/word/2015/wordml/symex" xmlns:wpg="http://schemas.microsoft.com/office/word/2010/wordprocessingGroup" xmlns:wpi="http://schemas.microsoft.com/office/word/2010/wordprocessingInk" xmlns:wne="http://schemas.microsoft.com/office/word/2006/wordml" xmlns:wps="http://schemas.microsoft.com/office/word/2010/wordprocessingShape" mc:Ignorable="w14 w15 w16se wp14">
+<w:numbering xmlns:wpc="http://schemas.microsoft.com/office/word/2010/wordprocessingCanvas" xmlns:cx="http://schemas.microsoft.com/office/drawing/2014/chartex" xmlns:cx1="http://schemas.microsoft.com/office/drawing/2015/9/8/chartex" xmlns:cx2="http://schemas.microsoft.com/office/drawing/2015/10/21/chartex" xmlns:cx3="http://schemas.microsoft.com/office/drawing/2016/5/9/chartex" xmlns:cx4="http://schemas.microsoft.com/office/drawing/2016/5/10/chartex" xmlns:cx5="http://schemas.microsoft.com/office/drawing/2016/5/11/chartex" xmlns:cx6="http://schemas.microsoft.com/office/drawing/2016/5/12/chartex" xmlns:cx7="http://schemas.microsoft.com/office/drawing/2016/5/13/chartex" xmlns:cx8="http://schemas.microsoft.com/office/drawing/2016/5/14/chartex" xmlns:mc="http://schemas.openxmlformats.org/markup-compatibility/2006" xmlns:aink="http://schemas.microsoft.com/office/drawing/2016/ink" xmlns:am3d="http://schemas.microsoft.com/office/drawing/2017/model3d" xmlns:o="urn:schemas-microsoft-com:office:office" xmlns:oel="http://schemas.microsoft.com/office/2019/extlst" xmlns:r="http://schemas.openxmlformats.org/officeDocument/2006/relationships" xmlns:m="http://schemas.openxmlformats.org/officeDocument/2006/math" xmlns:v="urn:schemas-microsoft-com:vml" xmlns:wp14="http://schemas.microsoft.com/office/word/2010/wordprocessingDrawing" xmlns:wp="http://schemas.openxmlformats.org/drawingml/2006/wordprocessingDrawing" xmlns:w10="urn:schemas-microsoft-com:office:word" xmlns:w="http://schemas.openxmlformats.org/wordprocessingml/2006/main" xmlns:w14="http://schemas.microsoft.com/office/word/2010/wordml" xmlns:w15="http://schemas.microsoft.com/office/word/2012/wordml" xmlns:w16cex="http://schemas.microsoft.com/office/word/2018/wordml/cex" xmlns:w16cid="http://schemas.microsoft.com/office/word/2016/wordml/cid" xmlns:w16="http://schemas.microsoft.com/office/word/2018/wordml" xmlns:w16du="http://schemas.microsoft.com/office/word/2023/wordml/word16du" xmlns:w16sdtdh="http://schemas.microsoft.com/office/word/2020/wordml/sdtdatahash" xmlns:w16sdtfl="http://schemas.microsoft.com/office/word/2024/wordml/sdtformatlock" xmlns:w16se="http://schemas.microsoft.com/office/word/2015/wordml/symex" xmlns:wpg="http://schemas.microsoft.com/office/word/2010/wordprocessingGroup" xmlns:wpi="http://schemas.microsoft.com/office/word/2010/wordprocessingInk" xmlns:wne="http://schemas.microsoft.com/office/word/2006/wordml" xmlns:wps="http://schemas.microsoft.com/office/word/2010/wordprocessingShape" mc:Ignorable="w14 w15 w16se w16cid w16 w16cex w16sdtdh w16sdtfl w16du wp14">
   <w:abstractNum w:abstractNumId="0" w15:restartNumberingAfterBreak="0">
     <w:nsid w:val="0250685B"/>
     <w:multiLevelType w:val="hybridMultilevel"/>
@@ -5038,89 +6610,89 @@
       </w:pPr>
     </w:lvl>
   </w:abstractNum>
-  <w:num w:numId="1">
+  <w:num w:numId="1" w16cid:durableId="166333378">
     <w:abstractNumId w:val="17"/>
   </w:num>
-  <w:num w:numId="2">
+  <w:num w:numId="2" w16cid:durableId="810288614">
     <w:abstractNumId w:val="13"/>
   </w:num>
-  <w:num w:numId="3">
+  <w:num w:numId="3" w16cid:durableId="1358583825">
     <w:abstractNumId w:val="12"/>
   </w:num>
-  <w:num w:numId="4">
+  <w:num w:numId="4" w16cid:durableId="1344282468">
     <w:abstractNumId w:val="15"/>
   </w:num>
-  <w:num w:numId="5">
+  <w:num w:numId="5" w16cid:durableId="1023628645">
     <w:abstractNumId w:val="23"/>
   </w:num>
-  <w:num w:numId="6">
+  <w:num w:numId="6" w16cid:durableId="294724932">
     <w:abstractNumId w:val="3"/>
   </w:num>
-  <w:num w:numId="7">
+  <w:num w:numId="7" w16cid:durableId="1838837549">
     <w:abstractNumId w:val="16"/>
   </w:num>
-  <w:num w:numId="8">
+  <w:num w:numId="8" w16cid:durableId="345904687">
     <w:abstractNumId w:val="11"/>
   </w:num>
-  <w:num w:numId="9">
+  <w:num w:numId="9" w16cid:durableId="923880632">
     <w:abstractNumId w:val="5"/>
   </w:num>
-  <w:num w:numId="10">
+  <w:num w:numId="10" w16cid:durableId="638803918">
     <w:abstractNumId w:val="0"/>
   </w:num>
-  <w:num w:numId="11">
+  <w:num w:numId="11" w16cid:durableId="1446382849">
     <w:abstractNumId w:val="25"/>
   </w:num>
-  <w:num w:numId="12">
+  <w:num w:numId="12" w16cid:durableId="528103158">
     <w:abstractNumId w:val="8"/>
   </w:num>
-  <w:num w:numId="13">
+  <w:num w:numId="13" w16cid:durableId="1538618495">
     <w:abstractNumId w:val="20"/>
   </w:num>
-  <w:num w:numId="14">
+  <w:num w:numId="14" w16cid:durableId="1828210444">
     <w:abstractNumId w:val="19"/>
   </w:num>
-  <w:num w:numId="15">
+  <w:num w:numId="15" w16cid:durableId="1032269308">
     <w:abstractNumId w:val="14"/>
   </w:num>
-  <w:num w:numId="16">
+  <w:num w:numId="16" w16cid:durableId="610551873">
     <w:abstractNumId w:val="6"/>
   </w:num>
-  <w:num w:numId="17">
+  <w:num w:numId="17" w16cid:durableId="939920547">
     <w:abstractNumId w:val="2"/>
   </w:num>
-  <w:num w:numId="18">
+  <w:num w:numId="18" w16cid:durableId="1158304207">
     <w:abstractNumId w:val="21"/>
   </w:num>
-  <w:num w:numId="19">
+  <w:num w:numId="19" w16cid:durableId="695229674">
     <w:abstractNumId w:val="22"/>
   </w:num>
-  <w:num w:numId="20">
+  <w:num w:numId="20" w16cid:durableId="540746346">
     <w:abstractNumId w:val="7"/>
   </w:num>
-  <w:num w:numId="21">
+  <w:num w:numId="21" w16cid:durableId="908730589">
     <w:abstractNumId w:val="10"/>
   </w:num>
-  <w:num w:numId="22">
+  <w:num w:numId="22" w16cid:durableId="1122455542">
     <w:abstractNumId w:val="18"/>
   </w:num>
-  <w:num w:numId="23">
+  <w:num w:numId="23" w16cid:durableId="1903635349">
     <w:abstractNumId w:val="1"/>
   </w:num>
-  <w:num w:numId="24">
+  <w:num w:numId="24" w16cid:durableId="1986396974">
     <w:abstractNumId w:val="24"/>
   </w:num>
-  <w:num w:numId="25">
+  <w:num w:numId="25" w16cid:durableId="1810904457">
     <w:abstractNumId w:val="9"/>
   </w:num>
-  <w:num w:numId="26">
+  <w:num w:numId="26" w16cid:durableId="656224759">
     <w:abstractNumId w:val="4"/>
   </w:num>
 </w:numbering>
 </file>
 
 <file path=word/styles.xml><?xml version="1.0" encoding="utf-8"?>
-<w:styles xmlns:mc="http://schemas.openxmlformats.org/markup-compatibility/2006" xmlns:r="http://schemas.openxmlformats.org/officeDocument/2006/relationships" xmlns:w="http://schemas.openxmlformats.org/wordprocessingml/2006/main" xmlns:w14="http://schemas.microsoft.com/office/word/2010/wordml" xmlns:w15="http://schemas.microsoft.com/office/word/2012/wordml" xmlns:w16se="http://schemas.microsoft.com/office/word/2015/wordml/symex" mc:Ignorable="w14 w15 w16se">
+<w:styles xmlns:mc="http://schemas.openxmlformats.org/markup-compatibility/2006" xmlns:r="http://schemas.openxmlformats.org/officeDocument/2006/relationships" xmlns:w="http://schemas.openxmlformats.org/wordprocessingml/2006/main" xmlns:w14="http://schemas.microsoft.com/office/word/2010/wordml" xmlns:w15="http://schemas.microsoft.com/office/word/2012/wordml" xmlns:w16cex="http://schemas.microsoft.com/office/word/2018/wordml/cex" xmlns:w16cid="http://schemas.microsoft.com/office/word/2016/wordml/cid" xmlns:w16="http://schemas.microsoft.com/office/word/2018/wordml" xmlns:w16du="http://schemas.microsoft.com/office/word/2023/wordml/word16du" xmlns:w16sdtdh="http://schemas.microsoft.com/office/word/2020/wordml/sdtdatahash" xmlns:w16sdtfl="http://schemas.microsoft.com/office/word/2024/wordml/sdtformatlock" xmlns:w16se="http://schemas.microsoft.com/office/word/2015/wordml/symex" mc:Ignorable="w14 w15 w16se w16cid w16 w16cex w16sdtdh w16sdtfl w16du">
   <w:docDefaults>
     <w:rPrDefault>
       <w:rPr>
@@ -5136,7 +6708,7 @@
       </w:pPr>
     </w:pPrDefault>
   </w:docDefaults>
-  <w:latentStyles w:defLockedState="0" w:defUIPriority="99" w:defSemiHidden="0" w:defUnhideWhenUsed="0" w:defQFormat="0" w:count="371">
+  <w:latentStyles w:defLockedState="0" w:defUIPriority="99" w:defSemiHidden="0" w:defUnhideWhenUsed="0" w:defQFormat="0" w:count="376">
     <w:lsdException w:name="Normal" w:uiPriority="0" w:qFormat="1"/>
     <w:lsdException w:name="heading 1" w:uiPriority="9" w:qFormat="1"/>
     <w:lsdException w:name="heading 2" w:semiHidden="1" w:uiPriority="9" w:unhideWhenUsed="1" w:qFormat="1"/>
@@ -5508,6 +7080,11 @@
     <w:lsdException w:name="List Table 5 Dark Accent 6" w:uiPriority="50"/>
     <w:lsdException w:name="List Table 6 Colorful Accent 6" w:uiPriority="51"/>
     <w:lsdException w:name="List Table 7 Colorful Accent 6" w:uiPriority="52"/>
+    <w:lsdException w:name="Mention" w:semiHidden="1" w:unhideWhenUsed="1"/>
+    <w:lsdException w:name="Smart Hyperlink" w:semiHidden="1" w:unhideWhenUsed="1"/>
+    <w:lsdException w:name="Hashtag" w:semiHidden="1" w:unhideWhenUsed="1"/>
+    <w:lsdException w:name="Unresolved Mention" w:semiHidden="1" w:unhideWhenUsed="1"/>
+    <w:lsdException w:name="Smart Link" w:semiHidden="1" w:unhideWhenUsed="1"/>
   </w:latentStyles>
   <w:style w:type="paragraph" w:default="1" w:styleId="Normal">
     <w:name w:val="Normal"/>
@@ -5591,7 +7168,6 @@
   <w:style w:type="character" w:default="1" w:styleId="Fuentedeprrafopredeter">
     <w:name w:val="Default Paragraph Font"/>
     <w:uiPriority w:val="1"/>
-    <w:semiHidden/>
     <w:unhideWhenUsed/>
   </w:style>
   <w:style w:type="table" w:default="1" w:styleId="Tablanormal">
@@ -5838,7 +7414,7 @@
       <w:contextualSpacing/>
     </w:pPr>
   </w:style>
-  <w:style w:type="character" w:styleId="Textoennegrita">
+  <w:style w:type="character" w:styleId="Fuerte">
     <w:name w:val="Strong"/>
     <w:basedOn w:val="Fuentedeprrafopredeter"/>
     <w:uiPriority w:val="22"/>
@@ -5906,568 +7482,6 @@
     <w:rsid w:val="009354B0"/>
   </w:style>
 </w:styles>
-</file>
-
-<file path=word/glossary/document.xml><?xml version="1.0" encoding="utf-8"?>
-<w:glossaryDocument xmlns:wpc="http://schemas.microsoft.com/office/word/2010/wordprocessingCanvas" xmlns:cx="http://schemas.microsoft.com/office/drawing/2014/chartex" xmlns:mc="http://schemas.openxmlformats.org/markup-compatibility/2006" xmlns:o="urn:schemas-microsoft-com:office:office" xmlns:r="http://schemas.openxmlformats.org/officeDocument/2006/relationships" xmlns:m="http://schemas.openxmlformats.org/officeDocument/2006/math" xmlns:v="urn:schemas-microsoft-com:vml" xmlns:wp14="http://schemas.microsoft.com/office/word/2010/wordprocessingDrawing" xmlns:wp="http://schemas.openxmlformats.org/drawingml/2006/wordprocessingDrawing" xmlns:w10="urn:schemas-microsoft-com:office:word" xmlns:w="http://schemas.openxmlformats.org/wordprocessingml/2006/main" xmlns:w14="http://schemas.microsoft.com/office/word/2010/wordml" xmlns:w15="http://schemas.microsoft.com/office/word/2012/wordml" xmlns:w16se="http://schemas.microsoft.com/office/word/2015/wordml/symex" xmlns:wpg="http://schemas.microsoft.com/office/word/2010/wordprocessingGroup" xmlns:wpi="http://schemas.microsoft.com/office/word/2010/wordprocessingInk" xmlns:wne="http://schemas.microsoft.com/office/word/2006/wordml" xmlns:wps="http://schemas.microsoft.com/office/word/2010/wordprocessingShape" mc:Ignorable="w14 w15 w16se wp14"/>
-</file>
-
-<file path=word/glossary/fontTable.xml><?xml version="1.0" encoding="utf-8"?>
-<w:fonts xmlns:mc="http://schemas.openxmlformats.org/markup-compatibility/2006" xmlns:r="http://schemas.openxmlformats.org/officeDocument/2006/relationships" xmlns:w="http://schemas.openxmlformats.org/wordprocessingml/2006/main" xmlns:w14="http://schemas.microsoft.com/office/word/2010/wordml" xmlns:w15="http://schemas.microsoft.com/office/word/2012/wordml" xmlns:w16se="http://schemas.microsoft.com/office/word/2015/wordml/symex" mc:Ignorable="w14 w15 w16se">
-  <w:font w:name="Courier New">
-    <w:panose1 w:val="02070309020205020404"/>
-    <w:charset w:val="00"/>
-    <w:family w:val="modern"/>
-    <w:pitch w:val="fixed"/>
-    <w:sig w:usb0="E0002EFF" w:usb1="C0007843" w:usb2="00000009" w:usb3="00000000" w:csb0="000001FF" w:csb1="00000000"/>
-  </w:font>
-  <w:font w:name="Times New Roman">
-    <w:panose1 w:val="02020603050405020304"/>
-    <w:charset w:val="00"/>
-    <w:family w:val="roman"/>
-    <w:pitch w:val="variable"/>
-    <w:sig w:usb0="E0002AFF" w:usb1="C0007843" w:usb2="00000009" w:usb3="00000000" w:csb0="000001FF" w:csb1="00000000"/>
-  </w:font>
-  <w:font w:name="Wingdings">
-    <w:panose1 w:val="05000000000000000000"/>
-    <w:charset w:val="02"/>
-    <w:family w:val="auto"/>
-    <w:pitch w:val="variable"/>
-    <w:sig w:usb0="00000000" w:usb1="10000000" w:usb2="00000000" w:usb3="00000000" w:csb0="80000000" w:csb1="00000000"/>
-  </w:font>
-  <w:font w:name="Symbol">
-    <w:panose1 w:val="05050102010706020507"/>
-    <w:charset w:val="02"/>
-    <w:family w:val="roman"/>
-    <w:pitch w:val="variable"/>
-    <w:sig w:usb0="00000000" w:usb1="10000000" w:usb2="00000000" w:usb3="00000000" w:csb0="80000000" w:csb1="00000000"/>
-  </w:font>
-  <w:font w:name="Calibri">
-    <w:panose1 w:val="020F0502020204030204"/>
-    <w:charset w:val="00"/>
-    <w:family w:val="swiss"/>
-    <w:pitch w:val="variable"/>
-    <w:sig w:usb0="E0002AFF" w:usb1="4000ACFF" w:usb2="00000001" w:usb3="00000000" w:csb0="000001FF" w:csb1="00000000"/>
-  </w:font>
-  <w:font w:name="Garamond">
-    <w:panose1 w:val="02020404030301010803"/>
-    <w:charset w:val="00"/>
-    <w:family w:val="roman"/>
-    <w:pitch w:val="variable"/>
-    <w:sig w:usb0="00000287" w:usb1="00000000" w:usb2="00000000" w:usb3="00000000" w:csb0="0000009F" w:csb1="00000000"/>
-  </w:font>
-  <w:font w:name="Calibri Light">
-    <w:panose1 w:val="020F0302020204030204"/>
-    <w:charset w:val="00"/>
-    <w:family w:val="swiss"/>
-    <w:pitch w:val="variable"/>
-    <w:sig w:usb0="A0002AEF" w:usb1="4000207B" w:usb2="00000000" w:usb3="00000000" w:csb0="000001FF" w:csb1="00000000"/>
-  </w:font>
-  <w:font w:name="Segoe UI">
-    <w:panose1 w:val="020B0502040204020203"/>
-    <w:charset w:val="00"/>
-    <w:family w:val="swiss"/>
-    <w:pitch w:val="variable"/>
-    <w:sig w:usb0="E4002EFF" w:usb1="C000E47F" w:usb2="00000009" w:usb3="00000000" w:csb0="000001FF" w:csb1="00000000"/>
-  </w:font>
-  <w:font w:name="CMBX12">
-    <w:altName w:val="MS Gothic"/>
-    <w:panose1 w:val="00000000000000000000"/>
-    <w:charset w:val="80"/>
-    <w:family w:val="auto"/>
-    <w:notTrueType/>
-    <w:pitch w:val="default"/>
-    <w:sig w:usb0="00000001" w:usb1="08070000" w:usb2="00000010" w:usb3="00000000" w:csb0="00020000" w:csb1="00000000"/>
-  </w:font>
-  <w:font w:name="Cambria Math">
-    <w:panose1 w:val="02040503050406030204"/>
-    <w:charset w:val="00"/>
-    <w:family w:val="roman"/>
-    <w:pitch w:val="variable"/>
-    <w:sig w:usb0="E00006FF" w:usb1="420024FF" w:usb2="02000000" w:usb3="00000000" w:csb0="0000019F" w:csb1="00000000"/>
-  </w:font>
-</w:fonts>
-</file>
-
-<file path=word/glossary/settings.xml><?xml version="1.0" encoding="utf-8"?>
-<w:settings xmlns:mc="http://schemas.openxmlformats.org/markup-compatibility/2006" xmlns:o="urn:schemas-microsoft-com:office:office" xmlns:r="http://schemas.openxmlformats.org/officeDocument/2006/relationships" xmlns:m="http://schemas.openxmlformats.org/officeDocument/2006/math" xmlns:v="urn:schemas-microsoft-com:vml" xmlns:w10="urn:schemas-microsoft-com:office:word" xmlns:w="http://schemas.openxmlformats.org/wordprocessingml/2006/main" xmlns:w14="http://schemas.microsoft.com/office/word/2010/wordml" xmlns:w15="http://schemas.microsoft.com/office/word/2012/wordml" xmlns:w16se="http://schemas.microsoft.com/office/word/2015/wordml/symex" xmlns:sl="http://schemas.openxmlformats.org/schemaLibrary/2006/main" mc:Ignorable="w14 w15 w16se">
-  <w:view w:val="normal"/>
-  <w:defaultTabStop w:val="708"/>
-  <w:hyphenationZone w:val="425"/>
-  <w:characterSpacingControl w:val="doNotCompress"/>
-  <w:compat>
-    <w:useFELayout/>
-    <w:compatSetting w:name="compatibilityMode" w:uri="http://schemas.microsoft.com/office/word" w:val="15"/>
-    <w:compatSetting w:name="overrideTableStyleFontSizeAndJustification" w:uri="http://schemas.microsoft.com/office/word" w:val="1"/>
-    <w:compatSetting w:name="enableOpenTypeFeatures" w:uri="http://schemas.microsoft.com/office/word" w:val="1"/>
-    <w:compatSetting w:name="doNotFlipMirrorIndents" w:uri="http://schemas.microsoft.com/office/word" w:val="1"/>
-    <w:compatSetting w:name="differentiateMultirowTableHeaders" w:uri="http://schemas.microsoft.com/office/word" w:val="1"/>
-  </w:compat>
-  <w:rsids>
-    <w:rsidRoot w:val="00B7658A"/>
-    <w:rsid w:val="00844003"/>
-    <w:rsid w:val="00B7658A"/>
-  </w:rsids>
-  <m:mathPr>
-    <m:mathFont m:val="Cambria Math"/>
-    <m:brkBin m:val="before"/>
-    <m:brkBinSub m:val="--"/>
-    <m:smallFrac m:val="0"/>
-    <m:dispDef/>
-    <m:lMargin m:val="0"/>
-    <m:rMargin m:val="0"/>
-    <m:defJc m:val="centerGroup"/>
-    <m:wrapIndent m:val="1440"/>
-    <m:intLim m:val="subSup"/>
-    <m:naryLim m:val="undOvr"/>
-  </m:mathPr>
-  <w:themeFontLang w:val="es-AR"/>
-  <w:clrSchemeMapping w:bg1="light1" w:t1="dark1" w:bg2="light2" w:t2="dark2" w:accent1="accent1" w:accent2="accent2" w:accent3="accent3" w:accent4="accent4" w:accent5="accent5" w:accent6="accent6" w:hyperlink="hyperlink" w:followedHyperlink="followedHyperlink"/>
-  <w:decimalSymbol w:val=","/>
-  <w:listSeparator w:val=";"/>
-  <w15:chartTrackingRefBased/>
-</w:settings>
-</file>
-
-<file path=word/glossary/styles.xml><?xml version="1.0" encoding="utf-8"?>
-<w:styles xmlns:mc="http://schemas.openxmlformats.org/markup-compatibility/2006" xmlns:r="http://schemas.openxmlformats.org/officeDocument/2006/relationships" xmlns:w="http://schemas.openxmlformats.org/wordprocessingml/2006/main" xmlns:w14="http://schemas.microsoft.com/office/word/2010/wordml" xmlns:w15="http://schemas.microsoft.com/office/word/2012/wordml" xmlns:w16se="http://schemas.microsoft.com/office/word/2015/wordml/symex" mc:Ignorable="w14 w15 w16se">
-  <w:docDefaults>
-    <w:rPrDefault>
-      <w:rPr>
-        <w:rFonts w:asciiTheme="minorHAnsi" w:eastAsiaTheme="minorEastAsia" w:hAnsiTheme="minorHAnsi" w:cstheme="minorBidi"/>
-        <w:sz w:val="22"/>
-        <w:szCs w:val="22"/>
-        <w:lang w:val="es-AR" w:eastAsia="es-AR" w:bidi="ar-SA"/>
-      </w:rPr>
-    </w:rPrDefault>
-    <w:pPrDefault>
-      <w:pPr>
-        <w:spacing w:after="160" w:line="259" w:lineRule="auto"/>
-      </w:pPr>
-    </w:pPrDefault>
-  </w:docDefaults>
-  <w:latentStyles w:defLockedState="0" w:defUIPriority="99" w:defSemiHidden="0" w:defUnhideWhenUsed="0" w:defQFormat="0" w:count="371">
-    <w:lsdException w:name="Normal" w:uiPriority="0" w:qFormat="1"/>
-    <w:lsdException w:name="heading 1" w:uiPriority="9" w:qFormat="1"/>
-    <w:lsdException w:name="heading 2" w:semiHidden="1" w:uiPriority="9" w:unhideWhenUsed="1" w:qFormat="1"/>
-    <w:lsdException w:name="heading 3" w:semiHidden="1" w:uiPriority="9" w:unhideWhenUsed="1" w:qFormat="1"/>
-    <w:lsdException w:name="heading 4" w:semiHidden="1" w:uiPriority="9" w:unhideWhenUsed="1" w:qFormat="1"/>
-    <w:lsdException w:name="heading 5" w:semiHidden="1" w:uiPriority="9" w:unhideWhenUsed="1" w:qFormat="1"/>
-    <w:lsdException w:name="heading 6" w:semiHidden="1" w:uiPriority="9" w:unhideWhenUsed="1" w:qFormat="1"/>
-    <w:lsdException w:name="heading 7" w:semiHidden="1" w:uiPriority="9" w:unhideWhenUsed="1" w:qFormat="1"/>
-    <w:lsdException w:name="heading 8" w:semiHidden="1" w:uiPriority="9" w:unhideWhenUsed="1" w:qFormat="1"/>
-    <w:lsdException w:name="heading 9" w:semiHidden="1" w:uiPriority="9" w:unhideWhenUsed="1" w:qFormat="1"/>
-    <w:lsdException w:name="index 1" w:semiHidden="1" w:unhideWhenUsed="1"/>
-    <w:lsdException w:name="index 2" w:semiHidden="1" w:unhideWhenUsed="1"/>
-    <w:lsdException w:name="index 3" w:semiHidden="1" w:unhideWhenUsed="1"/>
-    <w:lsdException w:name="index 4" w:semiHidden="1" w:unhideWhenUsed="1"/>
-    <w:lsdException w:name="index 5" w:semiHidden="1" w:unhideWhenUsed="1"/>
-    <w:lsdException w:name="index 6" w:semiHidden="1" w:unhideWhenUsed="1"/>
-    <w:lsdException w:name="index 7" w:semiHidden="1" w:unhideWhenUsed="1"/>
-    <w:lsdException w:name="index 8" w:semiHidden="1" w:unhideWhenUsed="1"/>
-    <w:lsdException w:name="index 9" w:semiHidden="1" w:unhideWhenUsed="1"/>
-    <w:lsdException w:name="toc 1" w:semiHidden="1" w:uiPriority="39" w:unhideWhenUsed="1"/>
-    <w:lsdException w:name="toc 2" w:semiHidden="1" w:uiPriority="39" w:unhideWhenUsed="1"/>
-    <w:lsdException w:name="toc 3" w:semiHidden="1" w:uiPriority="39" w:unhideWhenUsed="1"/>
-    <w:lsdException w:name="toc 4" w:semiHidden="1" w:uiPriority="39" w:unhideWhenUsed="1"/>
-    <w:lsdException w:name="toc 5" w:semiHidden="1" w:uiPriority="39" w:unhideWhenUsed="1"/>
-    <w:lsdException w:name="toc 6" w:semiHidden="1" w:uiPriority="39" w:unhideWhenUsed="1"/>
-    <w:lsdException w:name="toc 7" w:semiHidden="1" w:uiPriority="39" w:unhideWhenUsed="1"/>
-    <w:lsdException w:name="toc 8" w:semiHidden="1" w:uiPriority="39" w:unhideWhenUsed="1"/>
-    <w:lsdException w:name="toc 9" w:semiHidden="1" w:uiPriority="39" w:unhideWhenUsed="1"/>
-    <w:lsdException w:name="Normal Indent" w:semiHidden="1" w:unhideWhenUsed="1"/>
-    <w:lsdException w:name="footnote text" w:semiHidden="1" w:unhideWhenUsed="1"/>
-    <w:lsdException w:name="annotation text" w:semiHidden="1" w:unhideWhenUsed="1"/>
-    <w:lsdException w:name="header" w:semiHidden="1" w:unhideWhenUsed="1"/>
-    <w:lsdException w:name="footer" w:semiHidden="1" w:unhideWhenUsed="1"/>
-    <w:lsdException w:name="index heading" w:semiHidden="1" w:unhideWhenUsed="1"/>
-    <w:lsdException w:name="caption" w:semiHidden="1" w:uiPriority="35" w:unhideWhenUsed="1" w:qFormat="1"/>
-    <w:lsdException w:name="table of figures" w:semiHidden="1" w:unhideWhenUsed="1"/>
-    <w:lsdException w:name="envelope address" w:semiHidden="1" w:unhideWhenUsed="1"/>
-    <w:lsdException w:name="envelope return" w:semiHidden="1" w:unhideWhenUsed="1"/>
-    <w:lsdException w:name="footnote reference" w:semiHidden="1" w:unhideWhenUsed="1"/>
-    <w:lsdException w:name="annotation reference" w:semiHidden="1" w:unhideWhenUsed="1"/>
-    <w:lsdException w:name="line number" w:semiHidden="1" w:unhideWhenUsed="1"/>
-    <w:lsdException w:name="page number" w:semiHidden="1" w:unhideWhenUsed="1"/>
-    <w:lsdException w:name="endnote reference" w:semiHidden="1" w:unhideWhenUsed="1"/>
-    <w:lsdException w:name="endnote text" w:semiHidden="1" w:unhideWhenUsed="1"/>
-    <w:lsdException w:name="table of authorities" w:semiHidden="1" w:unhideWhenUsed="1"/>
-    <w:lsdException w:name="macro" w:semiHidden="1" w:unhideWhenUsed="1"/>
-    <w:lsdException w:name="toa heading" w:semiHidden="1" w:unhideWhenUsed="1"/>
-    <w:lsdException w:name="List" w:semiHidden="1" w:unhideWhenUsed="1"/>
-    <w:lsdException w:name="List Bullet" w:semiHidden="1" w:unhideWhenUsed="1"/>
-    <w:lsdException w:name="List Number" w:semiHidden="1" w:unhideWhenUsed="1"/>
-    <w:lsdException w:name="List 2" w:semiHidden="1" w:unhideWhenUsed="1"/>
-    <w:lsdException w:name="List 3" w:semiHidden="1" w:unhideWhenUsed="1"/>
-    <w:lsdException w:name="List 4" w:semiHidden="1" w:unhideWhenUsed="1"/>
-    <w:lsdException w:name="List 5" w:semiHidden="1" w:unhideWhenUsed="1"/>
-    <w:lsdException w:name="List Bullet 2" w:semiHidden="1" w:unhideWhenUsed="1"/>
-    <w:lsdException w:name="List Bullet 3" w:semiHidden="1" w:unhideWhenUsed="1"/>
-    <w:lsdException w:name="List Bullet 4" w:semiHidden="1" w:unhideWhenUsed="1"/>
-    <w:lsdException w:name="List Bullet 5" w:semiHidden="1" w:unhideWhenUsed="1"/>
-    <w:lsdException w:name="List Number 2" w:semiHidden="1" w:unhideWhenUsed="1"/>
-    <w:lsdException w:name="List Number 3" w:semiHidden="1" w:unhideWhenUsed="1"/>
-    <w:lsdException w:name="List Number 4" w:semiHidden="1" w:unhideWhenUsed="1"/>
-    <w:lsdException w:name="List Number 5" w:semiHidden="1" w:unhideWhenUsed="1"/>
-    <w:lsdException w:name="Title" w:uiPriority="10" w:qFormat="1"/>
-    <w:lsdException w:name="Closing" w:semiHidden="1" w:unhideWhenUsed="1"/>
-    <w:lsdException w:name="Signature" w:semiHidden="1" w:unhideWhenUsed="1"/>
-    <w:lsdException w:name="Default Paragraph Font" w:semiHidden="1" w:uiPriority="1" w:unhideWhenUsed="1"/>
-    <w:lsdException w:name="Body Text" w:semiHidden="1" w:unhideWhenUsed="1"/>
-    <w:lsdException w:name="Body Text Indent" w:semiHidden="1" w:unhideWhenUsed="1"/>
-    <w:lsdException w:name="List Continue" w:semiHidden="1" w:unhideWhenUsed="1"/>
-    <w:lsdException w:name="List Continue 2" w:semiHidden="1" w:unhideWhenUsed="1"/>
-    <w:lsdException w:name="List Continue 3" w:semiHidden="1" w:unhideWhenUsed="1"/>
-    <w:lsdException w:name="List Continue 4" w:semiHidden="1" w:unhideWhenUsed="1"/>
-    <w:lsdException w:name="List Continue 5" w:semiHidden="1" w:unhideWhenUsed="1"/>
-    <w:lsdException w:name="Message Header" w:semiHidden="1" w:unhideWhenUsed="1"/>
-    <w:lsdException w:name="Subtitle" w:uiPriority="11" w:qFormat="1"/>
-    <w:lsdException w:name="Salutation" w:semiHidden="1" w:unhideWhenUsed="1"/>
-    <w:lsdException w:name="Date" w:semiHidden="1" w:unhideWhenUsed="1"/>
-    <w:lsdException w:name="Body Text First Indent" w:semiHidden="1" w:unhideWhenUsed="1"/>
-    <w:lsdException w:name="Body Text First Indent 2" w:semiHidden="1" w:unhideWhenUsed="1"/>
-    <w:lsdException w:name="Note Heading" w:semiHidden="1" w:unhideWhenUsed="1"/>
-    <w:lsdException w:name="Body Text 2" w:semiHidden="1" w:unhideWhenUsed="1"/>
-    <w:lsdException w:name="Body Text 3" w:semiHidden="1" w:unhideWhenUsed="1"/>
-    <w:lsdException w:name="Body Text Indent 2" w:semiHidden="1" w:unhideWhenUsed="1"/>
-    <w:lsdException w:name="Body Text Indent 3" w:semiHidden="1" w:unhideWhenUsed="1"/>
-    <w:lsdException w:name="Block Text" w:semiHidden="1" w:unhideWhenUsed="1"/>
-    <w:lsdException w:name="Hyperlink" w:semiHidden="1" w:unhideWhenUsed="1"/>
-    <w:lsdException w:name="FollowedHyperlink" w:semiHidden="1" w:unhideWhenUsed="1"/>
-    <w:lsdException w:name="Strong" w:uiPriority="22" w:qFormat="1"/>
-    <w:lsdException w:name="Emphasis" w:uiPriority="20" w:qFormat="1"/>
-    <w:lsdException w:name="Document Map" w:semiHidden="1" w:unhideWhenUsed="1"/>
-    <w:lsdException w:name="Plain Text" w:semiHidden="1" w:unhideWhenUsed="1"/>
-    <w:lsdException w:name="E-mail Signature" w:semiHidden="1" w:unhideWhenUsed="1"/>
-    <w:lsdException w:name="HTML Top of Form" w:semiHidden="1" w:unhideWhenUsed="1"/>
-    <w:lsdException w:name="HTML Bottom of Form" w:semiHidden="1" w:unhideWhenUsed="1"/>
-    <w:lsdException w:name="Normal (Web)" w:semiHidden="1" w:unhideWhenUsed="1"/>
-    <w:lsdException w:name="HTML Acronym" w:semiHidden="1" w:unhideWhenUsed="1"/>
-    <w:lsdException w:name="HTML Address" w:semiHidden="1" w:unhideWhenUsed="1"/>
-    <w:lsdException w:name="HTML Cite" w:semiHidden="1" w:unhideWhenUsed="1"/>
-    <w:lsdException w:name="HTML Code" w:semiHidden="1" w:unhideWhenUsed="1"/>
-    <w:lsdException w:name="HTML Definition" w:semiHidden="1" w:unhideWhenUsed="1"/>
-    <w:lsdException w:name="HTML Keyboard" w:semiHidden="1" w:unhideWhenUsed="1"/>
-    <w:lsdException w:name="HTML Preformatted" w:semiHidden="1" w:unhideWhenUsed="1"/>
-    <w:lsdException w:name="HTML Sample" w:semiHidden="1" w:unhideWhenUsed="1"/>
-    <w:lsdException w:name="HTML Typewriter" w:semiHidden="1" w:unhideWhenUsed="1"/>
-    <w:lsdException w:name="HTML Variable" w:semiHidden="1" w:unhideWhenUsed="1"/>
-    <w:lsdException w:name="Normal Table" w:semiHidden="1" w:unhideWhenUsed="1"/>
-    <w:lsdException w:name="annotation subject" w:semiHidden="1" w:unhideWhenUsed="1"/>
-    <w:lsdException w:name="No List" w:semiHidden="1" w:unhideWhenUsed="1"/>
-    <w:lsdException w:name="Outline List 1" w:semiHidden="1" w:unhideWhenUsed="1"/>
-    <w:lsdException w:name="Outline List 2" w:semiHidden="1" w:unhideWhenUsed="1"/>
-    <w:lsdException w:name="Outline List 3" w:semiHidden="1" w:unhideWhenUsed="1"/>
-    <w:lsdException w:name="Table Simple 1" w:semiHidden="1" w:unhideWhenUsed="1"/>
-    <w:lsdException w:name="Table Simple 2" w:semiHidden="1" w:unhideWhenUsed="1"/>
-    <w:lsdException w:name="Table Simple 3" w:semiHidden="1" w:unhideWhenUsed="1"/>
-    <w:lsdException w:name="Table Classic 1" w:semiHidden="1" w:unhideWhenUsed="1"/>
-    <w:lsdException w:name="Table Classic 2" w:semiHidden="1" w:unhideWhenUsed="1"/>
-    <w:lsdException w:name="Table Classic 3" w:semiHidden="1" w:unhideWhenUsed="1"/>
-    <w:lsdException w:name="Table Classic 4" w:semiHidden="1" w:unhideWhenUsed="1"/>
-    <w:lsdException w:name="Table Colorful 1" w:semiHidden="1" w:unhideWhenUsed="1"/>
-    <w:lsdException w:name="Table Colorful 2" w:semiHidden="1" w:unhideWhenUsed="1"/>
-    <w:lsdException w:name="Table Colorful 3" w:semiHidden="1" w:unhideWhenUsed="1"/>
-    <w:lsdException w:name="Table Columns 1" w:semiHidden="1" w:unhideWhenUsed="1"/>
-    <w:lsdException w:name="Table Columns 2" w:semiHidden="1" w:unhideWhenUsed="1"/>
-    <w:lsdException w:name="Table Columns 3" w:semiHidden="1" w:unhideWhenUsed="1"/>
-    <w:lsdException w:name="Table Columns 4" w:semiHidden="1" w:unhideWhenUsed="1"/>
-    <w:lsdException w:name="Table Columns 5" w:semiHidden="1" w:unhideWhenUsed="1"/>
-    <w:lsdException w:name="Table Grid 1" w:semiHidden="1" w:unhideWhenUsed="1"/>
-    <w:lsdException w:name="Table Grid 2" w:semiHidden="1" w:unhideWhenUsed="1"/>
-    <w:lsdException w:name="Table Grid 3" w:semiHidden="1" w:unhideWhenUsed="1"/>
-    <w:lsdException w:name="Table Grid 4" w:semiHidden="1" w:unhideWhenUsed="1"/>
-    <w:lsdException w:name="Table Grid 5" w:semiHidden="1" w:unhideWhenUsed="1"/>
-    <w:lsdException w:name="Table Grid 6" w:semiHidden="1" w:unhideWhenUsed="1"/>
-    <w:lsdException w:name="Table Grid 7" w:semiHidden="1" w:unhideWhenUsed="1"/>
-    <w:lsdException w:name="Table Grid 8" w:semiHidden="1" w:unhideWhenUsed="1"/>
-    <w:lsdException w:name="Table List 1" w:semiHidden="1" w:unhideWhenUsed="1"/>
-    <w:lsdException w:name="Table List 2" w:semiHidden="1" w:unhideWhenUsed="1"/>
-    <w:lsdException w:name="Table List 3" w:semiHidden="1" w:unhideWhenUsed="1"/>
-    <w:lsdException w:name="Table List 4" w:semiHidden="1" w:unhideWhenUsed="1"/>
-    <w:lsdException w:name="Table List 5" w:semiHidden="1" w:unhideWhenUsed="1"/>
-    <w:lsdException w:name="Table List 6" w:semiHidden="1" w:unhideWhenUsed="1"/>
-    <w:lsdException w:name="Table List 7" w:semiHidden="1" w:unhideWhenUsed="1"/>
-    <w:lsdException w:name="Table List 8" w:semiHidden="1" w:unhideWhenUsed="1"/>
-    <w:lsdException w:name="Table 3D effects 1" w:semiHidden="1" w:unhideWhenUsed="1"/>
-    <w:lsdException w:name="Table 3D effects 2" w:semiHidden="1" w:unhideWhenUsed="1"/>
-    <w:lsdException w:name="Table 3D effects 3" w:semiHidden="1" w:unhideWhenUsed="1"/>
-    <w:lsdException w:name="Table Contemporary" w:semiHidden="1" w:unhideWhenUsed="1"/>
-    <w:lsdException w:name="Table Elegant" w:semiHidden="1" w:unhideWhenUsed="1"/>
-    <w:lsdException w:name="Table Professional" w:semiHidden="1" w:unhideWhenUsed="1"/>
-    <w:lsdException w:name="Table Subtle 1" w:semiHidden="1" w:unhideWhenUsed="1"/>
-    <w:lsdException w:name="Table Subtle 2" w:semiHidden="1" w:unhideWhenUsed="1"/>
-    <w:lsdException w:name="Table Web 1" w:semiHidden="1" w:unhideWhenUsed="1"/>
-    <w:lsdException w:name="Table Web 2" w:semiHidden="1" w:unhideWhenUsed="1"/>
-    <w:lsdException w:name="Table Web 3" w:semiHidden="1" w:unhideWhenUsed="1"/>
-    <w:lsdException w:name="Balloon Text" w:semiHidden="1" w:unhideWhenUsed="1"/>
-    <w:lsdException w:name="Table Grid" w:uiPriority="39"/>
-    <w:lsdException w:name="Table Theme" w:semiHidden="1" w:unhideWhenUsed="1"/>
-    <w:lsdException w:name="Placeholder Text" w:semiHidden="1"/>
-    <w:lsdException w:name="No Spacing" w:uiPriority="1" w:qFormat="1"/>
-    <w:lsdException w:name="Light Shading" w:uiPriority="60"/>
-    <w:lsdException w:name="Light List" w:uiPriority="61"/>
-    <w:lsdException w:name="Light Grid" w:uiPriority="62"/>
-    <w:lsdException w:name="Medium Shading 1" w:uiPriority="63"/>
-    <w:lsdException w:name="Medium Shading 2" w:uiPriority="64"/>
-    <w:lsdException w:name="Medium List 1" w:uiPriority="65"/>
-    <w:lsdException w:name="Medium List 2" w:uiPriority="66"/>
-    <w:lsdException w:name="Medium Grid 1" w:uiPriority="67"/>
-    <w:lsdException w:name="Medium Grid 2" w:uiPriority="68"/>
-    <w:lsdException w:name="Medium Grid 3" w:uiPriority="69"/>
-    <w:lsdException w:name="Dark List" w:uiPriority="70"/>
-    <w:lsdException w:name="Colorful Shading" w:uiPriority="71"/>
-    <w:lsdException w:name="Colorful List" w:uiPriority="72"/>
-    <w:lsdException w:name="Colorful Grid" w:uiPriority="73"/>
-    <w:lsdException w:name="Light Shading Accent 1" w:uiPriority="60"/>
-    <w:lsdException w:name="Light List Accent 1" w:uiPriority="61"/>
-    <w:lsdException w:name="Light Grid Accent 1" w:uiPriority="62"/>
-    <w:lsdException w:name="Medium Shading 1 Accent 1" w:uiPriority="63"/>
-    <w:lsdException w:name="Medium Shading 2 Accent 1" w:uiPriority="64"/>
-    <w:lsdException w:name="Medium List 1 Accent 1" w:uiPriority="65"/>
-    <w:lsdException w:name="Revision" w:semiHidden="1"/>
-    <w:lsdException w:name="List Paragraph" w:uiPriority="34" w:qFormat="1"/>
-    <w:lsdException w:name="Quote" w:uiPriority="29" w:qFormat="1"/>
-    <w:lsdException w:name="Intense Quote" w:uiPriority="30" w:qFormat="1"/>
-    <w:lsdException w:name="Medium List 2 Accent 1" w:uiPriority="66"/>
-    <w:lsdException w:name="Medium Grid 1 Accent 1" w:uiPriority="67"/>
-    <w:lsdException w:name="Medium Grid 2 Accent 1" w:uiPriority="68"/>
-    <w:lsdException w:name="Medium Grid 3 Accent 1" w:uiPriority="69"/>
-    <w:lsdException w:name="Dark List Accent 1" w:uiPriority="70"/>
-    <w:lsdException w:name="Colorful Shading Accent 1" w:uiPriority="71"/>
-    <w:lsdException w:name="Colorful List Accent 1" w:uiPriority="72"/>
-    <w:lsdException w:name="Colorful Grid Accent 1" w:uiPriority="73"/>
-    <w:lsdException w:name="Light Shading Accent 2" w:uiPriority="60"/>
-    <w:lsdException w:name="Light List Accent 2" w:uiPriority="61"/>
-    <w:lsdException w:name="Light Grid Accent 2" w:uiPriority="62"/>
-    <w:lsdException w:name="Medium Shading 1 Accent 2" w:uiPriority="63"/>
-    <w:lsdException w:name="Medium Shading 2 Accent 2" w:uiPriority="64"/>
-    <w:lsdException w:name="Medium List 1 Accent 2" w:uiPriority="65"/>
-    <w:lsdException w:name="Medium List 2 Accent 2" w:uiPriority="66"/>
-    <w:lsdException w:name="Medium Grid 1 Accent 2" w:uiPriority="67"/>
-    <w:lsdException w:name="Medium Grid 2 Accent 2" w:uiPriority="68"/>
-    <w:lsdException w:name="Medium Grid 3 Accent 2" w:uiPriority="69"/>
-    <w:lsdException w:name="Dark List Accent 2" w:uiPriority="70"/>
-    <w:lsdException w:name="Colorful Shading Accent 2" w:uiPriority="71"/>
-    <w:lsdException w:name="Colorful List Accent 2" w:uiPriority="72"/>
-    <w:lsdException w:name="Colorful Grid Accent 2" w:uiPriority="73"/>
-    <w:lsdException w:name="Light Shading Accent 3" w:uiPriority="60"/>
-    <w:lsdException w:name="Light List Accent 3" w:uiPriority="61"/>
-    <w:lsdException w:name="Light Grid Accent 3" w:uiPriority="62"/>
-    <w:lsdException w:name="Medium Shading 1 Accent 3" w:uiPriority="63"/>
-    <w:lsdException w:name="Medium Shading 2 Accent 3" w:uiPriority="64"/>
-    <w:lsdException w:name="Medium List 1 Accent 3" w:uiPriority="65"/>
-    <w:lsdException w:name="Medium List 2 Accent 3" w:uiPriority="66"/>
-    <w:lsdException w:name="Medium Grid 1 Accent 3" w:uiPriority="67"/>
-    <w:lsdException w:name="Medium Grid 2 Accent 3" w:uiPriority="68"/>
-    <w:lsdException w:name="Medium Grid 3 Accent 3" w:uiPriority="69"/>
-    <w:lsdException w:name="Dark List Accent 3" w:uiPriority="70"/>
-    <w:lsdException w:name="Colorful Shading Accent 3" w:uiPriority="71"/>
-    <w:lsdException w:name="Colorful List Accent 3" w:uiPriority="72"/>
-    <w:lsdException w:name="Colorful Grid Accent 3" w:uiPriority="73"/>
-    <w:lsdException w:name="Light Shading Accent 4" w:uiPriority="60"/>
-    <w:lsdException w:name="Light List Accent 4" w:uiPriority="61"/>
-    <w:lsdException w:name="Light Grid Accent 4" w:uiPriority="62"/>
-    <w:lsdException w:name="Medium Shading 1 Accent 4" w:uiPriority="63"/>
-    <w:lsdException w:name="Medium Shading 2 Accent 4" w:uiPriority="64"/>
-    <w:lsdException w:name="Medium List 1 Accent 4" w:uiPriority="65"/>
-    <w:lsdException w:name="Medium List 2 Accent 4" w:uiPriority="66"/>
-    <w:lsdException w:name="Medium Grid 1 Accent 4" w:uiPriority="67"/>
-    <w:lsdException w:name="Medium Grid 2 Accent 4" w:uiPriority="68"/>
-    <w:lsdException w:name="Medium Grid 3 Accent 4" w:uiPriority="69"/>
-    <w:lsdException w:name="Dark List Accent 4" w:uiPriority="70"/>
-    <w:lsdException w:name="Colorful Shading Accent 4" w:uiPriority="71"/>
-    <w:lsdException w:name="Colorful List Accent 4" w:uiPriority="72"/>
-    <w:lsdException w:name="Colorful Grid Accent 4" w:uiPriority="73"/>
-    <w:lsdException w:name="Light Shading Accent 5" w:uiPriority="60"/>
-    <w:lsdException w:name="Light List Accent 5" w:uiPriority="61"/>
-    <w:lsdException w:name="Light Grid Accent 5" w:uiPriority="62"/>
-    <w:lsdException w:name="Medium Shading 1 Accent 5" w:uiPriority="63"/>
-    <w:lsdException w:name="Medium Shading 2 Accent 5" w:uiPriority="64"/>
-    <w:lsdException w:name="Medium List 1 Accent 5" w:uiPriority="65"/>
-    <w:lsdException w:name="Medium List 2 Accent 5" w:uiPriority="66"/>
-    <w:lsdException w:name="Medium Grid 1 Accent 5" w:uiPriority="67"/>
-    <w:lsdException w:name="Medium Grid 2 Accent 5" w:uiPriority="68"/>
-    <w:lsdException w:name="Medium Grid 3 Accent 5" w:uiPriority="69"/>
-    <w:lsdException w:name="Dark List Accent 5" w:uiPriority="70"/>
-    <w:lsdException w:name="Colorful Shading Accent 5" w:uiPriority="71"/>
-    <w:lsdException w:name="Colorful List Accent 5" w:uiPriority="72"/>
-    <w:lsdException w:name="Colorful Grid Accent 5" w:uiPriority="73"/>
-    <w:lsdException w:name="Light Shading Accent 6" w:uiPriority="60"/>
-    <w:lsdException w:name="Light List Accent 6" w:uiPriority="61"/>
-    <w:lsdException w:name="Light Grid Accent 6" w:uiPriority="62"/>
-    <w:lsdException w:name="Medium Shading 1 Accent 6" w:uiPriority="63"/>
-    <w:lsdException w:name="Medium Shading 2 Accent 6" w:uiPriority="64"/>
-    <w:lsdException w:name="Medium List 1 Accent 6" w:uiPriority="65"/>
-    <w:lsdException w:name="Medium List 2 Accent 6" w:uiPriority="66"/>
-    <w:lsdException w:name="Medium Grid 1 Accent 6" w:uiPriority="67"/>
-    <w:lsdException w:name="Medium Grid 2 Accent 6" w:uiPriority="68"/>
-    <w:lsdException w:name="Medium Grid 3 Accent 6" w:uiPriority="69"/>
-    <w:lsdException w:name="Dark List Accent 6" w:uiPriority="70"/>
-    <w:lsdException w:name="Colorful Shading Accent 6" w:uiPriority="71"/>
-    <w:lsdException w:name="Colorful List Accent 6" w:uiPriority="72"/>
-    <w:lsdException w:name="Colorful Grid Accent 6" w:uiPriority="73"/>
-    <w:lsdException w:name="Subtle Emphasis" w:uiPriority="19" w:qFormat="1"/>
-    <w:lsdException w:name="Intense Emphasis" w:uiPriority="21" w:qFormat="1"/>
-    <w:lsdException w:name="Subtle Reference" w:uiPriority="31" w:qFormat="1"/>
-    <w:lsdException w:name="Intense Reference" w:uiPriority="32" w:qFormat="1"/>
-    <w:lsdException w:name="Book Title" w:uiPriority="33" w:qFormat="1"/>
-    <w:lsdException w:name="Bibliography" w:semiHidden="1" w:uiPriority="37" w:unhideWhenUsed="1"/>
-    <w:lsdException w:name="TOC Heading" w:semiHidden="1" w:uiPriority="39" w:unhideWhenUsed="1" w:qFormat="1"/>
-    <w:lsdException w:name="Plain Table 1" w:uiPriority="41"/>
-    <w:lsdException w:name="Plain Table 2" w:uiPriority="42"/>
-    <w:lsdException w:name="Plain Table 3" w:uiPriority="43"/>
-    <w:lsdException w:name="Plain Table 4" w:uiPriority="44"/>
-    <w:lsdException w:name="Plain Table 5" w:uiPriority="45"/>
-    <w:lsdException w:name="Grid Table Light" w:uiPriority="40"/>
-    <w:lsdException w:name="Grid Table 1 Light" w:uiPriority="46"/>
-    <w:lsdException w:name="Grid Table 2" w:uiPriority="47"/>
-    <w:lsdException w:name="Grid Table 3" w:uiPriority="48"/>
-    <w:lsdException w:name="Grid Table 4" w:uiPriority="49"/>
-    <w:lsdException w:name="Grid Table 5 Dark" w:uiPriority="50"/>
-    <w:lsdException w:name="Grid Table 6 Colorful" w:uiPriority="51"/>
-    <w:lsdException w:name="Grid Table 7 Colorful" w:uiPriority="52"/>
-    <w:lsdException w:name="Grid Table 1 Light Accent 1" w:uiPriority="46"/>
-    <w:lsdException w:name="Grid Table 2 Accent 1" w:uiPriority="47"/>
-    <w:lsdException w:name="Grid Table 3 Accent 1" w:uiPriority="48"/>
-    <w:lsdException w:name="Grid Table 4 Accent 1" w:uiPriority="49"/>
-    <w:lsdException w:name="Grid Table 5 Dark Accent 1" w:uiPriority="50"/>
-    <w:lsdException w:name="Grid Table 6 Colorful Accent 1" w:uiPriority="51"/>
-    <w:lsdException w:name="Grid Table 7 Colorful Accent 1" w:uiPriority="52"/>
-    <w:lsdException w:name="Grid Table 1 Light Accent 2" w:uiPriority="46"/>
-    <w:lsdException w:name="Grid Table 2 Accent 2" w:uiPriority="47"/>
-    <w:lsdException w:name="Grid Table 3 Accent 2" w:uiPriority="48"/>
-    <w:lsdException w:name="Grid Table 4 Accent 2" w:uiPriority="49"/>
-    <w:lsdException w:name="Grid Table 5 Dark Accent 2" w:uiPriority="50"/>
-    <w:lsdException w:name="Grid Table 6 Colorful Accent 2" w:uiPriority="51"/>
-    <w:lsdException w:name="Grid Table 7 Colorful Accent 2" w:uiPriority="52"/>
-    <w:lsdException w:name="Grid Table 1 Light Accent 3" w:uiPriority="46"/>
-    <w:lsdException w:name="Grid Table 2 Accent 3" w:uiPriority="47"/>
-    <w:lsdException w:name="Grid Table 3 Accent 3" w:uiPriority="48"/>
-    <w:lsdException w:name="Grid Table 4 Accent 3" w:uiPriority="49"/>
-    <w:lsdException w:name="Grid Table 5 Dark Accent 3" w:uiPriority="50"/>
-    <w:lsdException w:name="Grid Table 6 Colorful Accent 3" w:uiPriority="51"/>
-    <w:lsdException w:name="Grid Table 7 Colorful Accent 3" w:uiPriority="52"/>
-    <w:lsdException w:name="Grid Table 1 Light Accent 4" w:uiPriority="46"/>
-    <w:lsdException w:name="Grid Table 2 Accent 4" w:uiPriority="47"/>
-    <w:lsdException w:name="Grid Table 3 Accent 4" w:uiPriority="48"/>
-    <w:lsdException w:name="Grid Table 4 Accent 4" w:uiPriority="49"/>
-    <w:lsdException w:name="Grid Table 5 Dark Accent 4" w:uiPriority="50"/>
-    <w:lsdException w:name="Grid Table 6 Colorful Accent 4" w:uiPriority="51"/>
-    <w:lsdException w:name="Grid Table 7 Colorful Accent 4" w:uiPriority="52"/>
-    <w:lsdException w:name="Grid Table 1 Light Accent 5" w:uiPriority="46"/>
-    <w:lsdException w:name="Grid Table 2 Accent 5" w:uiPriority="47"/>
-    <w:lsdException w:name="Grid Table 3 Accent 5" w:uiPriority="48"/>
-    <w:lsdException w:name="Grid Table 4 Accent 5" w:uiPriority="49"/>
-    <w:lsdException w:name="Grid Table 5 Dark Accent 5" w:uiPriority="50"/>
-    <w:lsdException w:name="Grid Table 6 Colorful Accent 5" w:uiPriority="51"/>
-    <w:lsdException w:name="Grid Table 7 Colorful Accent 5" w:uiPriority="52"/>
-    <w:lsdException w:name="Grid Table 1 Light Accent 6" w:uiPriority="46"/>
-    <w:lsdException w:name="Grid Table 2 Accent 6" w:uiPriority="47"/>
-    <w:lsdException w:name="Grid Table 3 Accent 6" w:uiPriority="48"/>
-    <w:lsdException w:name="Grid Table 4 Accent 6" w:uiPriority="49"/>
-    <w:lsdException w:name="Grid Table 5 Dark Accent 6" w:uiPriority="50"/>
-    <w:lsdException w:name="Grid Table 6 Colorful Accent 6" w:uiPriority="51"/>
-    <w:lsdException w:name="Grid Table 7 Colorful Accent 6" w:uiPriority="52"/>
-    <w:lsdException w:name="List Table 1 Light" w:uiPriority="46"/>
-    <w:lsdException w:name="List Table 2" w:uiPriority="47"/>
-    <w:lsdException w:name="List Table 3" w:uiPriority="48"/>
-    <w:lsdException w:name="List Table 4" w:uiPriority="49"/>
-    <w:lsdException w:name="List Table 5 Dark" w:uiPriority="50"/>
-    <w:lsdException w:name="List Table 6 Colorful" w:uiPriority="51"/>
-    <w:lsdException w:name="List Table 7 Colorful" w:uiPriority="52"/>
-    <w:lsdException w:name="List Table 1 Light Accent 1" w:uiPriority="46"/>
-    <w:lsdException w:name="List Table 2 Accent 1" w:uiPriority="47"/>
-    <w:lsdException w:name="List Table 3 Accent 1" w:uiPriority="48"/>
-    <w:lsdException w:name="List Table 4 Accent 1" w:uiPriority="49"/>
-    <w:lsdException w:name="List Table 5 Dark Accent 1" w:uiPriority="50"/>
-    <w:lsdException w:name="List Table 6 Colorful Accent 1" w:uiPriority="51"/>
-    <w:lsdException w:name="List Table 7 Colorful Accent 1" w:uiPriority="52"/>
-    <w:lsdException w:name="List Table 1 Light Accent 2" w:uiPriority="46"/>
-    <w:lsdException w:name="List Table 2 Accent 2" w:uiPriority="47"/>
-    <w:lsdException w:name="List Table 3 Accent 2" w:uiPriority="48"/>
-    <w:lsdException w:name="List Table 4 Accent 2" w:uiPriority="49"/>
-    <w:lsdException w:name="List Table 5 Dark Accent 2" w:uiPriority="50"/>
-    <w:lsdException w:name="List Table 6 Colorful Accent 2" w:uiPriority="51"/>
-    <w:lsdException w:name="List Table 7 Colorful Accent 2" w:uiPriority="52"/>
-    <w:lsdException w:name="List Table 1 Light Accent 3" w:uiPriority="46"/>
-    <w:lsdException w:name="List Table 2 Accent 3" w:uiPriority="47"/>
-    <w:lsdException w:name="List Table 3 Accent 3" w:uiPriority="48"/>
-    <w:lsdException w:name="List Table 4 Accent 3" w:uiPriority="49"/>
-    <w:lsdException w:name="List Table 5 Dark Accent 3" w:uiPriority="50"/>
-    <w:lsdException w:name="List Table 6 Colorful Accent 3" w:uiPriority="51"/>
-    <w:lsdException w:name="List Table 7 Colorful Accent 3" w:uiPriority="52"/>
-    <w:lsdException w:name="List Table 1 Light Accent 4" w:uiPriority="46"/>
-    <w:lsdException w:name="List Table 2 Accent 4" w:uiPriority="47"/>
-    <w:lsdException w:name="List Table 3 Accent 4" w:uiPriority="48"/>
-    <w:lsdException w:name="List Table 4 Accent 4" w:uiPriority="49"/>
-    <w:lsdException w:name="List Table 5 Dark Accent 4" w:uiPriority="50"/>
-    <w:lsdException w:name="List Table 6 Colorful Accent 4" w:uiPriority="51"/>
-    <w:lsdException w:name="List Table 7 Colorful Accent 4" w:uiPriority="52"/>
-    <w:lsdException w:name="List Table 1 Light Accent 5" w:uiPriority="46"/>
-    <w:lsdException w:name="List Table 2 Accent 5" w:uiPriority="47"/>
-    <w:lsdException w:name="List Table 3 Accent 5" w:uiPriority="48"/>
-    <w:lsdException w:name="List Table 4 Accent 5" w:uiPriority="49"/>
-    <w:lsdException w:name="List Table 5 Dark Accent 5" w:uiPriority="50"/>
-    <w:lsdException w:name="List Table 6 Colorful Accent 5" w:uiPriority="51"/>
-    <w:lsdException w:name="List Table 7 Colorful Accent 5" w:uiPriority="52"/>
-    <w:lsdException w:name="List Table 1 Light Accent 6" w:uiPriority="46"/>
-    <w:lsdException w:name="List Table 2 Accent 6" w:uiPriority="47"/>
-    <w:lsdException w:name="List Table 3 Accent 6" w:uiPriority="48"/>
-    <w:lsdException w:name="List Table 4 Accent 6" w:uiPriority="49"/>
-    <w:lsdException w:name="List Table 5 Dark Accent 6" w:uiPriority="50"/>
-    <w:lsdException w:name="List Table 6 Colorful Accent 6" w:uiPriority="51"/>
-    <w:lsdException w:name="List Table 7 Colorful Accent 6" w:uiPriority="52"/>
-  </w:latentStyles>
-  <w:style w:type="paragraph" w:default="1" w:styleId="Normal">
-    <w:name w:val="Normal"/>
-    <w:qFormat/>
-  </w:style>
-  <w:style w:type="character" w:default="1" w:styleId="Fuentedeprrafopredeter">
-    <w:name w:val="Default Paragraph Font"/>
-    <w:uiPriority w:val="1"/>
-    <w:semiHidden/>
-    <w:unhideWhenUsed/>
-  </w:style>
-  <w:style w:type="table" w:default="1" w:styleId="Tablanormal">
-    <w:name w:val="Normal Table"/>
-    <w:uiPriority w:val="99"/>
-    <w:semiHidden/>
-    <w:unhideWhenUsed/>
-    <w:tblPr>
-      <w:tblInd w:w="0" w:type="dxa"/>
-      <w:tblCellMar>
-        <w:top w:w="0" w:type="dxa"/>
-        <w:left w:w="108" w:type="dxa"/>
-        <w:bottom w:w="0" w:type="dxa"/>
-        <w:right w:w="108" w:type="dxa"/>
-      </w:tblCellMar>
-    </w:tblPr>
-  </w:style>
-  <w:style w:type="numbering" w:default="1" w:styleId="Sinlista">
-    <w:name w:val="No List"/>
-    <w:uiPriority w:val="99"/>
-    <w:semiHidden/>
-    <w:unhideWhenUsed/>
-  </w:style>
-  <w:style w:type="character" w:styleId="Textodelmarcadordeposicin">
-    <w:name w:val="Placeholder Text"/>
-    <w:basedOn w:val="Fuentedeprrafopredeter"/>
-    <w:uiPriority w:val="99"/>
-    <w:semiHidden/>
-    <w:rsid w:val="00B7658A"/>
-    <w:rPr>
-      <w:color w:val="808080"/>
-    </w:rPr>
-  </w:style>
-</w:styles>
-</file>
-
-<file path=word/glossary/webSettings.xml><?xml version="1.0" encoding="utf-8"?>
-<w:webSettings xmlns:mc="http://schemas.openxmlformats.org/markup-compatibility/2006" xmlns:r="http://schemas.openxmlformats.org/officeDocument/2006/relationships" xmlns:w="http://schemas.openxmlformats.org/wordprocessingml/2006/main" xmlns:w14="http://schemas.microsoft.com/office/word/2010/wordml" xmlns:w15="http://schemas.microsoft.com/office/word/2012/wordml" xmlns:w16se="http://schemas.microsoft.com/office/word/2015/wordml/symex" mc:Ignorable="w14 w15 w16se">
-  <w:optimizeForBrowser/>
-  <w:allowPNG/>
-</w:webSettings>
 </file>
 
 <file path=word/theme/theme1.xml><?xml version="1.0" encoding="utf-8"?>

</xml_diff>

<commit_message>
Cambios pequeños en la visualización de gráficos y actualización del informe.
</commit_message>
<xml_diff>
--- a/TP4/informe/Entregable.docx
+++ b/TP4/informe/Entregable.docx
@@ -1,6 +1,6 @@
 
 <file path=word/document.xml><?xml version="1.0" encoding="utf-8"?>
-<w:document xmlns:wpc="http://schemas.microsoft.com/office/word/2010/wordprocessingCanvas" xmlns:cx="http://schemas.microsoft.com/office/drawing/2014/chartex" xmlns:cx1="http://schemas.microsoft.com/office/drawing/2015/9/8/chartex" xmlns:cx2="http://schemas.microsoft.com/office/drawing/2015/10/21/chartex" xmlns:cx3="http://schemas.microsoft.com/office/drawing/2016/5/9/chartex" xmlns:cx4="http://schemas.microsoft.com/office/drawing/2016/5/10/chartex" xmlns:cx5="http://schemas.microsoft.com/office/drawing/2016/5/11/chartex" xmlns:cx6="http://schemas.microsoft.com/office/drawing/2016/5/12/chartex" xmlns:cx7="http://schemas.microsoft.com/office/drawing/2016/5/13/chartex" xmlns:cx8="http://schemas.microsoft.com/office/drawing/2016/5/14/chartex" xmlns:mc="http://schemas.openxmlformats.org/markup-compatibility/2006" xmlns:aink="http://schemas.microsoft.com/office/drawing/2016/ink" xmlns:am3d="http://schemas.microsoft.com/office/drawing/2017/model3d" xmlns:o="urn:schemas-microsoft-com:office:office" xmlns:oel="http://schemas.microsoft.com/office/2019/extlst" xmlns:r="http://schemas.openxmlformats.org/officeDocument/2006/relationships" xmlns:m="http://schemas.openxmlformats.org/officeDocument/2006/math" xmlns:v="urn:schemas-microsoft-com:vml" xmlns:wp14="http://schemas.microsoft.com/office/word/2010/wordprocessingDrawing" xmlns:wp="http://schemas.openxmlformats.org/drawingml/2006/wordprocessingDrawing" xmlns:w10="urn:schemas-microsoft-com:office:word" xmlns:w="http://schemas.openxmlformats.org/wordprocessingml/2006/main" xmlns:w14="http://schemas.microsoft.com/office/word/2010/wordml" xmlns:w15="http://schemas.microsoft.com/office/word/2012/wordml" xmlns:w16cex="http://schemas.microsoft.com/office/word/2018/wordml/cex" xmlns:w16cid="http://schemas.microsoft.com/office/word/2016/wordml/cid" xmlns:w16="http://schemas.microsoft.com/office/word/2018/wordml" xmlns:w16du="http://schemas.microsoft.com/office/word/2023/wordml/word16du" xmlns:w16sdtdh="http://schemas.microsoft.com/office/word/2020/wordml/sdtdatahash" xmlns:w16sdtfl="http://schemas.microsoft.com/office/word/2024/wordml/sdtformatlock" xmlns:w16se="http://schemas.microsoft.com/office/word/2015/wordml/symex" xmlns:wpg="http://schemas.microsoft.com/office/word/2010/wordprocessingGroup" xmlns:wpi="http://schemas.microsoft.com/office/word/2010/wordprocessingInk" xmlns:wne="http://schemas.microsoft.com/office/word/2006/wordml" xmlns:wps="http://schemas.microsoft.com/office/word/2010/wordprocessingShape" mc:Ignorable="w14 w15 w16se w16cid w16 w16cex w16sdtdh w16sdtfl w16du wp14">
+<w:document xmlns:wpc="http://schemas.microsoft.com/office/word/2010/wordprocessingCanvas" xmlns:cx="http://schemas.microsoft.com/office/drawing/2014/chartex" xmlns:mc="http://schemas.openxmlformats.org/markup-compatibility/2006" xmlns:o="urn:schemas-microsoft-com:office:office" xmlns:r="http://schemas.openxmlformats.org/officeDocument/2006/relationships" xmlns:m="http://schemas.openxmlformats.org/officeDocument/2006/math" xmlns:v="urn:schemas-microsoft-com:vml" xmlns:wp14="http://schemas.microsoft.com/office/word/2010/wordprocessingDrawing" xmlns:wp="http://schemas.openxmlformats.org/drawingml/2006/wordprocessingDrawing" xmlns:w10="urn:schemas-microsoft-com:office:word" xmlns:w="http://schemas.openxmlformats.org/wordprocessingml/2006/main" xmlns:w14="http://schemas.microsoft.com/office/word/2010/wordml" xmlns:w15="http://schemas.microsoft.com/office/word/2012/wordml" xmlns:w16se="http://schemas.microsoft.com/office/word/2015/wordml/symex" xmlns:wpg="http://schemas.microsoft.com/office/word/2010/wordprocessingGroup" xmlns:wpi="http://schemas.microsoft.com/office/word/2010/wordprocessingInk" xmlns:wne="http://schemas.microsoft.com/office/word/2006/wordml" xmlns:wps="http://schemas.microsoft.com/office/word/2010/wordprocessingShape" mc:Ignorable="w14 w15 w16se wp14">
   <w:body>
     <w:p>
       <w:pPr>
@@ -327,7 +327,7 @@
           <w:r>
             <w:fldChar w:fldCharType="separate"/>
           </w:r>
-          <w:hyperlink w:anchor="_Toc239847465" w:history="1">
+          <w:hyperlink w:anchor="_Toc239930233" w:history="1">
             <w:r>
               <w:rPr>
                 <w:rStyle w:val="Hipervnculo"/>
@@ -354,7 +354,7 @@
                 <w:noProof/>
                 <w:webHidden/>
               </w:rPr>
-              <w:instrText xml:space="preserve"> PAGEREF _Toc239847465 \h </w:instrText>
+              <w:instrText xml:space="preserve"> PAGEREF _Toc239930233 \h </w:instrText>
             </w:r>
             <w:r>
               <w:rPr>
@@ -398,7 +398,7 @@
               <w:lang w:eastAsia="es-AR"/>
             </w:rPr>
           </w:pPr>
-          <w:hyperlink w:anchor="_Toc239847466" w:history="1">
+          <w:hyperlink w:anchor="_Toc239930234" w:history="1">
             <w:r>
               <w:rPr>
                 <w:rStyle w:val="Hipervnculo"/>
@@ -425,7 +425,7 @@
                 <w:noProof/>
                 <w:webHidden/>
               </w:rPr>
-              <w:instrText xml:space="preserve"> PAGEREF _Toc239847466 \h </w:instrText>
+              <w:instrText xml:space="preserve"> PAGEREF _Toc239930234 \h </w:instrText>
             </w:r>
             <w:r>
               <w:rPr>
@@ -469,7 +469,7 @@
               <w:lang w:eastAsia="es-AR"/>
             </w:rPr>
           </w:pPr>
-          <w:hyperlink w:anchor="_Toc239847467" w:history="1">
+          <w:hyperlink w:anchor="_Toc239930235" w:history="1">
             <w:r>
               <w:rPr>
                 <w:rStyle w:val="Hipervnculo"/>
@@ -496,7 +496,7 @@
                 <w:noProof/>
                 <w:webHidden/>
               </w:rPr>
-              <w:instrText xml:space="preserve"> PAGEREF _Toc239847467 \h </w:instrText>
+              <w:instrText xml:space="preserve"> PAGEREF _Toc239930235 \h </w:instrText>
             </w:r>
             <w:r>
               <w:rPr>
@@ -540,7 +540,7 @@
               <w:lang w:eastAsia="es-AR"/>
             </w:rPr>
           </w:pPr>
-          <w:hyperlink w:anchor="_Toc239847468" w:history="1">
+          <w:hyperlink w:anchor="_Toc239930236" w:history="1">
             <w:r>
               <w:rPr>
                 <w:rStyle w:val="Hipervnculo"/>
@@ -567,7 +567,7 @@
                 <w:noProof/>
                 <w:webHidden/>
               </w:rPr>
-              <w:instrText xml:space="preserve"> PAGEREF _Toc239847468 \h </w:instrText>
+              <w:instrText xml:space="preserve"> PAGEREF _Toc239930236 \h </w:instrText>
             </w:r>
             <w:r>
               <w:rPr>
@@ -611,11 +611,12 @@
               <w:lang w:eastAsia="es-AR"/>
             </w:rPr>
           </w:pPr>
-          <w:hyperlink w:anchor="_Toc239847469" w:history="1">
+          <w:hyperlink w:anchor="_Toc239930237" w:history="1">
             <w:r>
               <w:rPr>
                 <w:rStyle w:val="Hipervnculo"/>
                 <w:noProof/>
+                <w:highlight w:val="yellow"/>
               </w:rPr>
               <w:t>Diagrama de Bloques</w:t>
             </w:r>
@@ -638,7 +639,7 @@
                 <w:noProof/>
                 <w:webHidden/>
               </w:rPr>
-              <w:instrText xml:space="preserve"> PAGEREF _Toc239847469 \h </w:instrText>
+              <w:instrText xml:space="preserve"> PAGEREF _Toc239930237 \h </w:instrText>
             </w:r>
             <w:r>
               <w:rPr>
@@ -658,7 +659,7 @@
                 <w:noProof/>
                 <w:webHidden/>
               </w:rPr>
-              <w:t>4</w:t>
+              <w:t>5</w:t>
             </w:r>
             <w:r>
               <w:rPr>
@@ -682,7 +683,7 @@
               <w:lang w:eastAsia="es-AR"/>
             </w:rPr>
           </w:pPr>
-          <w:hyperlink w:anchor="_Toc239847470" w:history="1">
+          <w:hyperlink w:anchor="_Toc239930238" w:history="1">
             <w:r>
               <w:rPr>
                 <w:rStyle w:val="Hipervnculo"/>
@@ -709,7 +710,7 @@
                 <w:noProof/>
                 <w:webHidden/>
               </w:rPr>
-              <w:instrText xml:space="preserve"> PAGEREF _Toc239847470 \h </w:instrText>
+              <w:instrText xml:space="preserve"> PAGEREF _Toc239930238 \h </w:instrText>
             </w:r>
             <w:r>
               <w:rPr>
@@ -729,7 +730,7 @@
                 <w:noProof/>
                 <w:webHidden/>
               </w:rPr>
-              <w:t>4</w:t>
+              <w:t>5</w:t>
             </w:r>
             <w:r>
               <w:rPr>
@@ -753,7 +754,7 @@
               <w:lang w:eastAsia="es-AR"/>
             </w:rPr>
           </w:pPr>
-          <w:hyperlink w:anchor="_Toc239847471" w:history="1">
+          <w:hyperlink w:anchor="_Toc239930239" w:history="1">
             <w:r>
               <w:rPr>
                 <w:rStyle w:val="Hipervnculo"/>
@@ -781,7 +782,7 @@
                 <w:noProof/>
                 <w:webHidden/>
               </w:rPr>
-              <w:instrText xml:space="preserve"> PAGEREF _Toc239847471 \h </w:instrText>
+              <w:instrText xml:space="preserve"> PAGEREF _Toc239930239 \h </w:instrText>
             </w:r>
             <w:r>
               <w:rPr>
@@ -825,7 +826,7 @@
               <w:lang w:eastAsia="es-AR"/>
             </w:rPr>
           </w:pPr>
-          <w:hyperlink w:anchor="_Toc239847472" w:history="1">
+          <w:hyperlink w:anchor="_Toc239930240" w:history="1">
             <w:r>
               <w:rPr>
                 <w:rStyle w:val="Hipervnculo"/>
@@ -852,7 +853,7 @@
                 <w:noProof/>
                 <w:webHidden/>
               </w:rPr>
-              <w:instrText xml:space="preserve"> PAGEREF _Toc239847472 \h </w:instrText>
+              <w:instrText xml:space="preserve"> PAGEREF _Toc239930240 \h </w:instrText>
             </w:r>
             <w:r>
               <w:rPr>
@@ -896,7 +897,7 @@
               <w:lang w:eastAsia="es-AR"/>
             </w:rPr>
           </w:pPr>
-          <w:hyperlink w:anchor="_Toc239847473" w:history="1">
+          <w:hyperlink w:anchor="_Toc239930241" w:history="1">
             <w:r>
               <w:rPr>
                 <w:rStyle w:val="Hipervnculo"/>
@@ -923,7 +924,7 @@
                 <w:noProof/>
                 <w:webHidden/>
               </w:rPr>
-              <w:instrText xml:space="preserve"> PAGEREF _Toc239847473 \h </w:instrText>
+              <w:instrText xml:space="preserve"> PAGEREF _Toc239930241 \h </w:instrText>
             </w:r>
             <w:r>
               <w:rPr>
@@ -943,7 +944,7 @@
                 <w:noProof/>
                 <w:webHidden/>
               </w:rPr>
-              <w:t>5</w:t>
+              <w:t>6</w:t>
             </w:r>
             <w:r>
               <w:rPr>
@@ -967,7 +968,7 @@
               <w:lang w:eastAsia="es-AR"/>
             </w:rPr>
           </w:pPr>
-          <w:hyperlink w:anchor="_Toc239847474" w:history="1">
+          <w:hyperlink w:anchor="_Toc239930242" w:history="1">
             <w:r>
               <w:rPr>
                 <w:rStyle w:val="Hipervnculo"/>
@@ -995,7 +996,7 @@
                 <w:noProof/>
                 <w:webHidden/>
               </w:rPr>
-              <w:instrText xml:space="preserve"> PAGEREF _Toc239847474 \h </w:instrText>
+              <w:instrText xml:space="preserve"> PAGEREF _Toc239930242 \h </w:instrText>
             </w:r>
             <w:r>
               <w:rPr>
@@ -1039,14 +1040,30 @@
               <w:lang w:eastAsia="es-AR"/>
             </w:rPr>
           </w:pPr>
-          <w:hyperlink w:anchor="_Toc239847475" w:history="1">
+          <w:hyperlink w:anchor="_Toc239930243" w:history="1">
             <w:r>
               <w:rPr>
                 <w:rStyle w:val="Hipervnculo"/>
                 <w:rFonts w:eastAsia="CMBX12"/>
                 <w:noProof/>
               </w:rPr>
-              <w:t>3. Síntesis y Renderizado de Vuelo Filtrado</w:t>
+              <w:t>3. Síntesis y Renderizado de</w:t>
+            </w:r>
+            <w:r>
+              <w:rPr>
+                <w:rStyle w:val="Hipervnculo"/>
+                <w:rFonts w:eastAsia="CMBX12"/>
+                <w:noProof/>
+              </w:rPr>
+              <w:t xml:space="preserve"> </w:t>
+            </w:r>
+            <w:r>
+              <w:rPr>
+                <w:rStyle w:val="Hipervnculo"/>
+                <w:rFonts w:eastAsia="CMBX12"/>
+                <w:noProof/>
+              </w:rPr>
+              <w:t>Vuelo Filtrado</w:t>
             </w:r>
             <w:r>
               <w:rPr>
@@ -1067,7 +1084,7 @@
                 <w:noProof/>
                 <w:webHidden/>
               </w:rPr>
-              <w:instrText xml:space="preserve"> PAGEREF _Toc239847475 \h </w:instrText>
+              <w:instrText xml:space="preserve"> PAGEREF _Toc239930243 \h </w:instrText>
             </w:r>
             <w:r>
               <w:rPr>
@@ -1088,6 +1105,652 @@
                 <w:webHidden/>
               </w:rPr>
               <w:t>7</w:t>
+            </w:r>
+            <w:r>
+              <w:rPr>
+                <w:noProof/>
+                <w:webHidden/>
+              </w:rPr>
+              <w:fldChar w:fldCharType="end"/>
+            </w:r>
+          </w:hyperlink>
+        </w:p>
+        <w:p>
+          <w:pPr>
+            <w:pStyle w:val="TDC2"/>
+            <w:tabs>
+              <w:tab w:val="right" w:leader="dot" w:pos="8494"/>
+            </w:tabs>
+            <w:rPr>
+              <w:rFonts w:asciiTheme="minorHAnsi" w:eastAsiaTheme="minorEastAsia" w:hAnsiTheme="minorHAnsi"/>
+              <w:noProof/>
+              <w:sz w:val="22"/>
+              <w:lang w:eastAsia="es-AR"/>
+            </w:rPr>
+          </w:pPr>
+          <w:hyperlink w:anchor="_Toc239930244" w:history="1">
+            <w:r>
+              <w:rPr>
+                <w:rStyle w:val="Hipervnculo"/>
+                <w:noProof/>
+              </w:rPr>
+              <w:t>Caso A</w:t>
+            </w:r>
+            <w:r>
+              <w:rPr>
+                <w:noProof/>
+                <w:webHidden/>
+              </w:rPr>
+              <w:tab/>
+            </w:r>
+            <w:r>
+              <w:rPr>
+                <w:noProof/>
+                <w:webHidden/>
+              </w:rPr>
+              <w:fldChar w:fldCharType="begin"/>
+            </w:r>
+            <w:r>
+              <w:rPr>
+                <w:noProof/>
+                <w:webHidden/>
+              </w:rPr>
+              <w:instrText xml:space="preserve"> PAGEREF _Toc239930244 \h </w:instrText>
+            </w:r>
+            <w:r>
+              <w:rPr>
+                <w:noProof/>
+                <w:webHidden/>
+              </w:rPr>
+            </w:r>
+            <w:r>
+              <w:rPr>
+                <w:noProof/>
+                <w:webHidden/>
+              </w:rPr>
+              <w:fldChar w:fldCharType="separate"/>
+            </w:r>
+            <w:r>
+              <w:rPr>
+                <w:noProof/>
+                <w:webHidden/>
+              </w:rPr>
+              <w:t>8</w:t>
+            </w:r>
+            <w:r>
+              <w:rPr>
+                <w:noProof/>
+                <w:webHidden/>
+              </w:rPr>
+              <w:fldChar w:fldCharType="end"/>
+            </w:r>
+          </w:hyperlink>
+        </w:p>
+        <w:p>
+          <w:pPr>
+            <w:pStyle w:val="TDC2"/>
+            <w:tabs>
+              <w:tab w:val="right" w:leader="dot" w:pos="8494"/>
+            </w:tabs>
+            <w:rPr>
+              <w:rFonts w:asciiTheme="minorHAnsi" w:eastAsiaTheme="minorEastAsia" w:hAnsiTheme="minorHAnsi"/>
+              <w:noProof/>
+              <w:sz w:val="22"/>
+              <w:lang w:eastAsia="es-AR"/>
+            </w:rPr>
+          </w:pPr>
+          <w:hyperlink w:anchor="_Toc239930245" w:history="1">
+            <w:r>
+              <w:rPr>
+                <w:rStyle w:val="Hipervnculo"/>
+                <w:noProof/>
+              </w:rPr>
+              <w:t>Caso B</w:t>
+            </w:r>
+            <w:r>
+              <w:rPr>
+                <w:noProof/>
+                <w:webHidden/>
+              </w:rPr>
+              <w:tab/>
+            </w:r>
+            <w:r>
+              <w:rPr>
+                <w:noProof/>
+                <w:webHidden/>
+              </w:rPr>
+              <w:fldChar w:fldCharType="begin"/>
+            </w:r>
+            <w:r>
+              <w:rPr>
+                <w:noProof/>
+                <w:webHidden/>
+              </w:rPr>
+              <w:instrText xml:space="preserve"> PAGEREF _Toc239930245 \h </w:instrText>
+            </w:r>
+            <w:r>
+              <w:rPr>
+                <w:noProof/>
+                <w:webHidden/>
+              </w:rPr>
+            </w:r>
+            <w:r>
+              <w:rPr>
+                <w:noProof/>
+                <w:webHidden/>
+              </w:rPr>
+              <w:fldChar w:fldCharType="separate"/>
+            </w:r>
+            <w:r>
+              <w:rPr>
+                <w:noProof/>
+                <w:webHidden/>
+              </w:rPr>
+              <w:t>9</w:t>
+            </w:r>
+            <w:r>
+              <w:rPr>
+                <w:noProof/>
+                <w:webHidden/>
+              </w:rPr>
+              <w:fldChar w:fldCharType="end"/>
+            </w:r>
+          </w:hyperlink>
+        </w:p>
+        <w:p>
+          <w:pPr>
+            <w:pStyle w:val="TDC1"/>
+            <w:tabs>
+              <w:tab w:val="right" w:leader="dot" w:pos="8494"/>
+            </w:tabs>
+            <w:rPr>
+              <w:rFonts w:asciiTheme="minorHAnsi" w:eastAsiaTheme="minorEastAsia" w:hAnsiTheme="minorHAnsi"/>
+              <w:noProof/>
+              <w:sz w:val="22"/>
+              <w:lang w:eastAsia="es-AR"/>
+            </w:rPr>
+          </w:pPr>
+          <w:hyperlink w:anchor="_Toc239930246" w:history="1">
+            <w:r>
+              <w:rPr>
+                <w:rStyle w:val="Hipervnculo"/>
+                <w:noProof/>
+                <w:lang w:eastAsia="es-AR"/>
+              </w:rPr>
+              <w:t>4. Modelado de Condiciones Reales de Vuelo</w:t>
+            </w:r>
+            <w:r>
+              <w:rPr>
+                <w:noProof/>
+                <w:webHidden/>
+              </w:rPr>
+              <w:tab/>
+            </w:r>
+            <w:r>
+              <w:rPr>
+                <w:noProof/>
+                <w:webHidden/>
+              </w:rPr>
+              <w:fldChar w:fldCharType="begin"/>
+            </w:r>
+            <w:r>
+              <w:rPr>
+                <w:noProof/>
+                <w:webHidden/>
+              </w:rPr>
+              <w:instrText xml:space="preserve"> PAGEREF _Toc239930246 \h </w:instrText>
+            </w:r>
+            <w:r>
+              <w:rPr>
+                <w:noProof/>
+                <w:webHidden/>
+              </w:rPr>
+            </w:r>
+            <w:r>
+              <w:rPr>
+                <w:noProof/>
+                <w:webHidden/>
+              </w:rPr>
+              <w:fldChar w:fldCharType="separate"/>
+            </w:r>
+            <w:r>
+              <w:rPr>
+                <w:noProof/>
+                <w:webHidden/>
+              </w:rPr>
+              <w:t>10</w:t>
+            </w:r>
+            <w:r>
+              <w:rPr>
+                <w:noProof/>
+                <w:webHidden/>
+              </w:rPr>
+              <w:fldChar w:fldCharType="end"/>
+            </w:r>
+          </w:hyperlink>
+        </w:p>
+        <w:p>
+          <w:pPr>
+            <w:pStyle w:val="TDC2"/>
+            <w:tabs>
+              <w:tab w:val="right" w:leader="dot" w:pos="8494"/>
+            </w:tabs>
+            <w:rPr>
+              <w:rFonts w:asciiTheme="minorHAnsi" w:eastAsiaTheme="minorEastAsia" w:hAnsiTheme="minorHAnsi"/>
+              <w:noProof/>
+              <w:sz w:val="22"/>
+              <w:lang w:eastAsia="es-AR"/>
+            </w:rPr>
+          </w:pPr>
+          <w:hyperlink w:anchor="_Toc239930247" w:history="1">
+            <w:r>
+              <w:rPr>
+                <w:rStyle w:val="Hipervnculo"/>
+                <w:noProof/>
+                <w:lang w:eastAsia="es-AR"/>
+              </w:rPr>
+              <w:t>Velocidad y Aceleración</w:t>
+            </w:r>
+            <w:r>
+              <w:rPr>
+                <w:noProof/>
+                <w:webHidden/>
+              </w:rPr>
+              <w:tab/>
+            </w:r>
+            <w:r>
+              <w:rPr>
+                <w:noProof/>
+                <w:webHidden/>
+              </w:rPr>
+              <w:fldChar w:fldCharType="begin"/>
+            </w:r>
+            <w:r>
+              <w:rPr>
+                <w:noProof/>
+                <w:webHidden/>
+              </w:rPr>
+              <w:instrText xml:space="preserve"> PAGEREF _Toc239930247 \h </w:instrText>
+            </w:r>
+            <w:r>
+              <w:rPr>
+                <w:noProof/>
+                <w:webHidden/>
+              </w:rPr>
+            </w:r>
+            <w:r>
+              <w:rPr>
+                <w:noProof/>
+                <w:webHidden/>
+              </w:rPr>
+              <w:fldChar w:fldCharType="separate"/>
+            </w:r>
+            <w:r>
+              <w:rPr>
+                <w:noProof/>
+                <w:webHidden/>
+              </w:rPr>
+              <w:t>10</w:t>
+            </w:r>
+            <w:r>
+              <w:rPr>
+                <w:noProof/>
+                <w:webHidden/>
+              </w:rPr>
+              <w:fldChar w:fldCharType="end"/>
+            </w:r>
+          </w:hyperlink>
+        </w:p>
+        <w:p>
+          <w:pPr>
+            <w:pStyle w:val="TDC2"/>
+            <w:tabs>
+              <w:tab w:val="right" w:leader="dot" w:pos="8494"/>
+            </w:tabs>
+            <w:rPr>
+              <w:rFonts w:asciiTheme="minorHAnsi" w:eastAsiaTheme="minorEastAsia" w:hAnsiTheme="minorHAnsi"/>
+              <w:noProof/>
+              <w:sz w:val="22"/>
+              <w:lang w:eastAsia="es-AR"/>
+            </w:rPr>
+          </w:pPr>
+          <w:hyperlink w:anchor="_Toc239930248" w:history="1">
+            <w:r>
+              <w:rPr>
+                <w:rStyle w:val="Hipervnculo"/>
+                <w:noProof/>
+                <w:lang w:eastAsia="es-AR"/>
+              </w:rPr>
+              <w:t>Implementación de Parámetros</w:t>
+            </w:r>
+            <w:r>
+              <w:rPr>
+                <w:noProof/>
+                <w:webHidden/>
+              </w:rPr>
+              <w:tab/>
+            </w:r>
+            <w:r>
+              <w:rPr>
+                <w:noProof/>
+                <w:webHidden/>
+              </w:rPr>
+              <w:fldChar w:fldCharType="begin"/>
+            </w:r>
+            <w:r>
+              <w:rPr>
+                <w:noProof/>
+                <w:webHidden/>
+              </w:rPr>
+              <w:instrText xml:space="preserve"> PAGEREF _Toc239930248 \h </w:instrText>
+            </w:r>
+            <w:r>
+              <w:rPr>
+                <w:noProof/>
+                <w:webHidden/>
+              </w:rPr>
+            </w:r>
+            <w:r>
+              <w:rPr>
+                <w:noProof/>
+                <w:webHidden/>
+              </w:rPr>
+              <w:fldChar w:fldCharType="separate"/>
+            </w:r>
+            <w:r>
+              <w:rPr>
+                <w:noProof/>
+                <w:webHidden/>
+              </w:rPr>
+              <w:t>11</w:t>
+            </w:r>
+            <w:r>
+              <w:rPr>
+                <w:noProof/>
+                <w:webHidden/>
+              </w:rPr>
+              <w:fldChar w:fldCharType="end"/>
+            </w:r>
+          </w:hyperlink>
+        </w:p>
+        <w:p>
+          <w:pPr>
+            <w:pStyle w:val="TDC2"/>
+            <w:tabs>
+              <w:tab w:val="right" w:leader="dot" w:pos="8494"/>
+            </w:tabs>
+            <w:rPr>
+              <w:rFonts w:asciiTheme="minorHAnsi" w:eastAsiaTheme="minorEastAsia" w:hAnsiTheme="minorHAnsi"/>
+              <w:noProof/>
+              <w:sz w:val="22"/>
+              <w:lang w:eastAsia="es-AR"/>
+            </w:rPr>
+          </w:pPr>
+          <w:hyperlink w:anchor="_Toc239930249" w:history="1">
+            <w:r>
+              <w:rPr>
+                <w:rStyle w:val="Hipervnculo"/>
+                <w:noProof/>
+                <w:lang w:eastAsia="es-AR"/>
+              </w:rPr>
+              <w:t>Restricción en Curvas</w:t>
+            </w:r>
+            <w:r>
+              <w:rPr>
+                <w:noProof/>
+                <w:webHidden/>
+              </w:rPr>
+              <w:tab/>
+            </w:r>
+            <w:r>
+              <w:rPr>
+                <w:noProof/>
+                <w:webHidden/>
+              </w:rPr>
+              <w:fldChar w:fldCharType="begin"/>
+            </w:r>
+            <w:r>
+              <w:rPr>
+                <w:noProof/>
+                <w:webHidden/>
+              </w:rPr>
+              <w:instrText xml:space="preserve"> PAGEREF _Toc239930249 \h </w:instrText>
+            </w:r>
+            <w:r>
+              <w:rPr>
+                <w:noProof/>
+                <w:webHidden/>
+              </w:rPr>
+            </w:r>
+            <w:r>
+              <w:rPr>
+                <w:noProof/>
+                <w:webHidden/>
+              </w:rPr>
+              <w:fldChar w:fldCharType="separate"/>
+            </w:r>
+            <w:r>
+              <w:rPr>
+                <w:noProof/>
+                <w:webHidden/>
+              </w:rPr>
+              <w:t>11</w:t>
+            </w:r>
+            <w:r>
+              <w:rPr>
+                <w:noProof/>
+                <w:webHidden/>
+              </w:rPr>
+              <w:fldChar w:fldCharType="end"/>
+            </w:r>
+          </w:hyperlink>
+        </w:p>
+        <w:p>
+          <w:pPr>
+            <w:pStyle w:val="TDC2"/>
+            <w:tabs>
+              <w:tab w:val="right" w:leader="dot" w:pos="8494"/>
+            </w:tabs>
+            <w:rPr>
+              <w:rFonts w:asciiTheme="minorHAnsi" w:eastAsiaTheme="minorEastAsia" w:hAnsiTheme="minorHAnsi"/>
+              <w:noProof/>
+              <w:sz w:val="22"/>
+              <w:lang w:eastAsia="es-AR"/>
+            </w:rPr>
+          </w:pPr>
+          <w:hyperlink w:anchor="_Toc239930250" w:history="1">
+            <w:r>
+              <w:rPr>
+                <w:rStyle w:val="Hipervnculo"/>
+                <w:noProof/>
+                <w:lang w:eastAsia="es-AR"/>
+              </w:rPr>
+              <w:t>Calibración Numérica (Desacople Cinemático)</w:t>
+            </w:r>
+            <w:r>
+              <w:rPr>
+                <w:noProof/>
+                <w:webHidden/>
+              </w:rPr>
+              <w:tab/>
+            </w:r>
+            <w:r>
+              <w:rPr>
+                <w:noProof/>
+                <w:webHidden/>
+              </w:rPr>
+              <w:fldChar w:fldCharType="begin"/>
+            </w:r>
+            <w:r>
+              <w:rPr>
+                <w:noProof/>
+                <w:webHidden/>
+              </w:rPr>
+              <w:instrText xml:space="preserve"> PAGEREF _Toc239930250 \h </w:instrText>
+            </w:r>
+            <w:r>
+              <w:rPr>
+                <w:noProof/>
+                <w:webHidden/>
+              </w:rPr>
+            </w:r>
+            <w:r>
+              <w:rPr>
+                <w:noProof/>
+                <w:webHidden/>
+              </w:rPr>
+              <w:fldChar w:fldCharType="separate"/>
+            </w:r>
+            <w:r>
+              <w:rPr>
+                <w:noProof/>
+                <w:webHidden/>
+              </w:rPr>
+              <w:t>12</w:t>
+            </w:r>
+            <w:r>
+              <w:rPr>
+                <w:noProof/>
+                <w:webHidden/>
+              </w:rPr>
+              <w:fldChar w:fldCharType="end"/>
+            </w:r>
+          </w:hyperlink>
+        </w:p>
+        <w:p>
+          <w:pPr>
+            <w:pStyle w:val="TDC2"/>
+            <w:tabs>
+              <w:tab w:val="right" w:leader="dot" w:pos="8494"/>
+            </w:tabs>
+            <w:rPr>
+              <w:rFonts w:asciiTheme="minorHAnsi" w:eastAsiaTheme="minorEastAsia" w:hAnsiTheme="minorHAnsi"/>
+              <w:noProof/>
+              <w:sz w:val="22"/>
+              <w:lang w:eastAsia="es-AR"/>
+            </w:rPr>
+          </w:pPr>
+          <w:hyperlink w:anchor="_Toc239930251" w:history="1">
+            <w:r>
+              <w:rPr>
+                <w:rStyle w:val="Hipervnculo"/>
+                <w:noProof/>
+                <w:lang w:eastAsia="es-AR"/>
+              </w:rPr>
+              <w:t>Resultados del Flujo Óptico</w:t>
+            </w:r>
+            <w:r>
+              <w:rPr>
+                <w:noProof/>
+                <w:webHidden/>
+              </w:rPr>
+              <w:tab/>
+            </w:r>
+            <w:r>
+              <w:rPr>
+                <w:noProof/>
+                <w:webHidden/>
+              </w:rPr>
+              <w:fldChar w:fldCharType="begin"/>
+            </w:r>
+            <w:r>
+              <w:rPr>
+                <w:noProof/>
+                <w:webHidden/>
+              </w:rPr>
+              <w:instrText xml:space="preserve"> PAGEREF _Toc239930251 \h </w:instrText>
+            </w:r>
+            <w:r>
+              <w:rPr>
+                <w:noProof/>
+                <w:webHidden/>
+              </w:rPr>
+            </w:r>
+            <w:r>
+              <w:rPr>
+                <w:noProof/>
+                <w:webHidden/>
+              </w:rPr>
+              <w:fldChar w:fldCharType="separate"/>
+            </w:r>
+            <w:r>
+              <w:rPr>
+                <w:noProof/>
+                <w:webHidden/>
+              </w:rPr>
+              <w:t>12</w:t>
+            </w:r>
+            <w:r>
+              <w:rPr>
+                <w:noProof/>
+                <w:webHidden/>
+              </w:rPr>
+              <w:fldChar w:fldCharType="end"/>
+            </w:r>
+          </w:hyperlink>
+        </w:p>
+        <w:p>
+          <w:pPr>
+            <w:pStyle w:val="TDC2"/>
+            <w:tabs>
+              <w:tab w:val="right" w:leader="dot" w:pos="8494"/>
+            </w:tabs>
+            <w:rPr>
+              <w:rFonts w:asciiTheme="minorHAnsi" w:eastAsiaTheme="minorEastAsia" w:hAnsiTheme="minorHAnsi"/>
+              <w:noProof/>
+              <w:sz w:val="22"/>
+              <w:lang w:eastAsia="es-AR"/>
+            </w:rPr>
+          </w:pPr>
+          <w:hyperlink w:anchor="_Toc239930252" w:history="1">
+            <w:r>
+              <w:rPr>
+                <w:rStyle w:val="Hipervnculo"/>
+                <w:noProof/>
+                <w:lang w:eastAsia="es-AR"/>
+              </w:rPr>
+              <w:t>Conclusión</w:t>
+            </w:r>
+            <w:r>
+              <w:rPr>
+                <w:noProof/>
+                <w:webHidden/>
+              </w:rPr>
+              <w:tab/>
+            </w:r>
+            <w:r>
+              <w:rPr>
+                <w:noProof/>
+                <w:webHidden/>
+              </w:rPr>
+              <w:fldChar w:fldCharType="begin"/>
+            </w:r>
+            <w:r>
+              <w:rPr>
+                <w:noProof/>
+                <w:webHidden/>
+              </w:rPr>
+              <w:instrText xml:space="preserve"> PAGEREF _Toc239930252 \h </w:instrText>
+            </w:r>
+            <w:r>
+              <w:rPr>
+                <w:noProof/>
+                <w:webHidden/>
+              </w:rPr>
+            </w:r>
+            <w:r>
+              <w:rPr>
+                <w:noProof/>
+                <w:webHidden/>
+              </w:rPr>
+              <w:fldChar w:fldCharType="separate"/>
+            </w:r>
+            <w:r>
+              <w:rPr>
+                <w:noProof/>
+                <w:webHidden/>
+              </w:rPr>
+              <w:t>12</w:t>
             </w:r>
             <w:r>
               <w:rPr>
@@ -1120,7 +1783,7 @@
       <w:pPr>
         <w:pStyle w:val="Ttulo1"/>
       </w:pPr>
-      <w:bookmarkStart w:id="0" w:name="_Toc239847465"/>
+      <w:bookmarkStart w:id="0" w:name="_Toc239930233"/>
       <w:r>
         <w:lastRenderedPageBreak/>
         <w:t>Introducción:</w:t>
@@ -1233,7 +1896,7 @@
       <w:pPr>
         <w:pStyle w:val="Ttulo1"/>
       </w:pPr>
-      <w:bookmarkStart w:id="1" w:name="_Toc239847466"/>
+      <w:bookmarkStart w:id="1" w:name="_Toc239930234"/>
       <w:r>
         <w:t>1. E</w:t>
       </w:r>
@@ -1272,7 +1935,7 @@
             <v:path o:extrusionok="f" gradientshapeok="t" o:connecttype="rect"/>
             <o:lock v:ext="edit" aspectratio="t"/>
           </v:shapetype>
-          <v:shape id="_x0000_i1025" type="#_x0000_t75" style="width:324.95pt;height:242.9pt">
+          <v:shape id="_x0000_i1025" type="#_x0000_t75" style="width:325.05pt;height:242.85pt">
             <v:imagedata r:id="rId10" o:title="trayectoria_cartesiana"/>
           </v:shape>
         </w:pict>
@@ -1280,15 +1943,27 @@
     </w:p>
     <w:p>
       <w:pPr>
+        <w:jc w:val="center"/>
+      </w:pPr>
+      <w:r>
+        <w:lastRenderedPageBreak/>
+        <w:pict w14:anchorId="2686562D">
+          <v:shape id="_x0000_i1053" type="#_x0000_t75" style="width:425pt;height:212.8pt">
+            <v:imagedata r:id="rId11" o:title="zoom_relativo"/>
+          </v:shape>
+        </w:pict>
+      </w:r>
+    </w:p>
+    <w:p>
+      <w:pPr>
         <w:pStyle w:val="Ttulo2"/>
         <w:rPr>
           <w:rFonts w:eastAsia="Times New Roman" w:cs="Times New Roman"/>
           <w:lang w:eastAsia="es-AR"/>
         </w:rPr>
       </w:pPr>
-      <w:bookmarkStart w:id="2" w:name="_Toc239847467"/>
-      <w:r>
-        <w:lastRenderedPageBreak/>
+      <w:bookmarkStart w:id="2" w:name="_Toc239930235"/>
+      <w:r>
         <w:t>Vínculo teórico con Interpolación Numérica:</w:t>
       </w:r>
       <w:bookmarkEnd w:id="2"/>
@@ -1530,7 +2205,7 @@
           <w:lang w:eastAsia="es-AR"/>
         </w:rPr>
       </w:pPr>
-      <w:bookmarkStart w:id="3" w:name="_Toc239847468"/>
+      <w:bookmarkStart w:id="3" w:name="_Toc239930236"/>
       <w:r>
         <w:t>Justificación de los parámetros computacionales:</w:t>
       </w:r>
@@ -1627,8 +2302,12 @@
       <w:pPr>
         <w:pStyle w:val="Ttulo2"/>
       </w:pPr>
-      <w:bookmarkStart w:id="4" w:name="_Toc239847469"/>
-      <w:r>
+      <w:bookmarkStart w:id="4" w:name="_Toc239930237"/>
+      <w:r>
+        <w:rPr>
+          <w:highlight w:val="yellow"/>
+        </w:rPr>
+        <w:lastRenderedPageBreak/>
         <w:t>Diagrama de Bloques</w:t>
       </w:r>
       <w:bookmarkEnd w:id="4"/>
@@ -1638,7 +2317,7 @@
       <w:pPr>
         <w:pStyle w:val="Ttulo2"/>
       </w:pPr>
-      <w:bookmarkStart w:id="5" w:name="_Toc239847470"/>
+      <w:bookmarkStart w:id="5" w:name="_Toc239930238"/>
       <w:r>
         <w:t>Rapidez instantánea</w:t>
       </w:r>
@@ -1679,10 +2358,9 @@
           <w:szCs w:val="24"/>
           <w:lang w:eastAsia="es-AR"/>
         </w:rPr>
-        <w:lastRenderedPageBreak/>
         <w:pict w14:anchorId="123CAF66">
-          <v:shape id="_x0000_i1026" type="#_x0000_t75" style="width:425.1pt;height:212.85pt">
-            <v:imagedata r:id="rId11" o:title="rapidez_instantanea"/>
+          <v:shape id="_x0000_i1026" type="#_x0000_t75" style="width:425pt;height:212.8pt">
+            <v:imagedata r:id="rId12" o:title="rapidez_instantanea"/>
           </v:shape>
         </w:pict>
       </w:r>
@@ -1713,7 +2391,7 @@
           <w:rFonts w:eastAsia="CMBX12"/>
         </w:rPr>
       </w:pPr>
-      <w:bookmarkStart w:id="6" w:name="_Toc239847471"/>
+      <w:bookmarkStart w:id="6" w:name="_Toc239930239"/>
       <w:r>
         <w:rPr>
           <w:rFonts w:eastAsia="CMBX12"/>
@@ -1731,7 +2409,7 @@
       <w:pPr>
         <w:pStyle w:val="Ttulo2"/>
       </w:pPr>
-      <w:bookmarkStart w:id="7" w:name="_Toc239847472"/>
+      <w:bookmarkStart w:id="7" w:name="_Toc239930240"/>
       <w:r>
         <w:t>Método global</w:t>
       </w:r>
@@ -1773,8 +2451,9 @@
       <w:pPr>
         <w:pStyle w:val="Ttulo2"/>
       </w:pPr>
-      <w:bookmarkStart w:id="8" w:name="_Toc239847473"/>
-      <w:r>
+      <w:bookmarkStart w:id="8" w:name="_Toc239930241"/>
+      <w:r>
+        <w:lastRenderedPageBreak/>
         <w:t>Método local</w:t>
       </w:r>
       <w:bookmarkEnd w:id="8"/>
@@ -1833,12 +2512,11 @@
           <w:lang w:eastAsia="es-AR"/>
         </w:rPr>
       </w:pPr>
-      <w:bookmarkStart w:id="9" w:name="_Toc239847474"/>
-      <w:r>
-        <w:rPr>
-          <w:lang w:eastAsia="es-AR"/>
-        </w:rPr>
-        <w:lastRenderedPageBreak/>
+      <w:bookmarkStart w:id="9" w:name="_Toc239930242"/>
+      <w:r>
+        <w:rPr>
+          <w:lang w:eastAsia="es-AR"/>
+        </w:rPr>
         <w:t>Resultados</w:t>
       </w:r>
       <w:bookmarkEnd w:id="9"/>
@@ -1846,17 +2524,18 @@
     <w:p>
       <w:r>
         <w:pict w14:anchorId="04EC8283">
-          <v:shape id="_x0000_i1027" type="#_x0000_t75" style="width:425.1pt;height:330.55pt">
-            <v:imagedata r:id="rId12" o:title="comparacion_plano_cartesiano"/>
+          <v:shape id="_x0000_i1084" type="#_x0000_t75" style="width:425pt;height:330.45pt">
+            <v:imagedata r:id="rId13" o:title="comparacion_plano_cartesiano"/>
           </v:shape>
         </w:pict>
       </w:r>
     </w:p>
     <w:p>
       <w:r>
-        <w:pict w14:anchorId="758B00C6">
-          <v:shape id="_x0000_i1028" type="#_x0000_t75" style="width:424.5pt;height:233.55pt">
-            <v:imagedata r:id="rId13" o:title="comparacion_altitud"/>
+        <w:lastRenderedPageBreak/>
+        <w:pict w14:anchorId="3724899F">
+          <v:shape id="_x0000_i1055" type="#_x0000_t75" style="width:425pt;height:233.75pt">
+            <v:imagedata r:id="rId14" o:title="comparacion_zoom_relativo"/>
           </v:shape>
         </w:pict>
       </w:r>
@@ -1873,37 +2552,78 @@
           <w:color w:val="000000"/>
           <w:szCs w:val="28"/>
         </w:rPr>
-        <w:t xml:space="preserve">El polinomio global es rígido, intentar que una única función pase cerca de todos los nodos del vuelo suele generar sobretiros y oscilaciones severas en los tramos intermedios y extremos (fenómeno de Runge). Un cambio brusco en la trayectoria del dron afecta a toda la curva global. Si bien esta aplicación del </w:t>
+        <w:t>El polinomio global es rígido, intentar que una única función pase cerca de todos los nodos del vuelo suele generar sobretiros y oscilaciones severas en los tramos intermedios y extremos</w:t>
       </w:r>
       <w:r>
         <w:rPr>
           <w:color w:val="000000"/>
           <w:szCs w:val="28"/>
         </w:rPr>
-        <w:lastRenderedPageBreak/>
-        <w:t>polinomio cumple muy bien el recorrido del dron, en los otros grados probados, las oscilaciones eran mucho más fuertes.</w:t>
-      </w:r>
-    </w:p>
-    <w:p>
+        <w:t>, si bien nosotros encontramos un polinomio de grado 16 que se adaptó muy bien al recorrido</w:t>
+      </w:r>
       <w:r>
         <w:rPr>
           <w:color w:val="000000"/>
           <w:szCs w:val="28"/>
         </w:rPr>
-        <w:t xml:space="preserve">El Spline Cúbico Natural es superior para este caso. Al ser local, una ráfaga de viento o un giro cerrado en una esquina del mapa solo afecta a ese tramo específico. Además, los polinomios cúbicos garantizan que la trayectoria final tenga posición, velocidad y aceleración continuas, lo que elimina el ruido del video original y genera un modelado </w:t>
+        <w:t>.</w:t>
       </w:r>
       <w:r>
         <w:rPr>
           <w:color w:val="000000"/>
           <w:szCs w:val="28"/>
         </w:rPr>
-        <w:t>más estable</w:t>
+        <w:t xml:space="preserve"> Con respecto a esto nosotros encontramos algo llamado el fenómeno de Runge, que e</w:t>
       </w:r>
       <w:r>
         <w:rPr>
           <w:color w:val="000000"/>
           <w:szCs w:val="28"/>
         </w:rPr>
+        <w:t>s la oscilación grande que aparece cerca de los extremos de un intervalo cuando interpolás una función con un polinomio de grado alto usando nodos equiespaciados.</w:t>
+      </w:r>
+      <w:r>
+        <w:rPr>
+          <w:color w:val="000000"/>
+          <w:szCs w:val="28"/>
+        </w:rPr>
+        <w:t xml:space="preserve"> Un cambio brusco en la trayectoria del dron afecta a toda la curva global. Si bien esta aplicación del polinomio cumple muy bien el recorrido del dron, en los otros grados probados, las oscilaciones eran mucho más fuertes</w:t>
+      </w:r>
+      <w:r>
+        <w:rPr>
+          <w:color w:val="000000"/>
+          <w:szCs w:val="28"/>
+        </w:rPr>
+        <w:t>, pero se puede apreciar este efecto igualmente en el inicio/final</w:t>
+      </w:r>
+      <w:r>
+        <w:rPr>
+          <w:color w:val="000000"/>
+          <w:szCs w:val="28"/>
+        </w:rPr>
+        <w:t>.</w:t>
+      </w:r>
+    </w:p>
+    <w:p>
+      <w:r>
+        <w:rPr>
+          <w:color w:val="000000"/>
+          <w:szCs w:val="28"/>
+        </w:rPr>
+        <w:t xml:space="preserve">El Spline Cúbico Natural es superior para este caso. Al ser local, una ráfaga de viento o un giro cerrado en una esquina del mapa solo afecta a ese tramo específico. Además, los polinomios cúbicos garantizan que la trayectoria final tenga posición, velocidad y aceleración continuas, lo que elimina el ruido del video original y genera un modelado </w:t>
+      </w:r>
+      <w:r>
+        <w:rPr>
+          <w:color w:val="000000"/>
+          <w:szCs w:val="28"/>
+        </w:rPr>
+        <w:t>más estable</w:t>
+      </w:r>
+      <w:r>
+        <w:rPr>
+          <w:color w:val="000000"/>
+          <w:szCs w:val="28"/>
+        </w:rPr>
         <w:t xml:space="preserve"> para el vuelo del dron.</w:t>
       </w:r>
     </w:p>
@@ -1911,7 +2631,7 @@
       <w:pPr>
         <w:pStyle w:val="Ttulo1"/>
       </w:pPr>
-      <w:bookmarkStart w:id="10" w:name="_Toc239847475"/>
+      <w:bookmarkStart w:id="10" w:name="_Toc239930243"/>
       <w:r>
         <w:rPr>
           <w:rFonts w:eastAsia="CMBX12"/>
@@ -1935,6 +2655,503 @@
     </w:p>
     <w:p>
       <w:pPr>
+        <w:rPr>
+          <w:color w:val="000000"/>
+          <w:szCs w:val="28"/>
+        </w:rPr>
+      </w:pPr>
+      <w:r>
+        <w:rPr>
+          <w:color w:val="000000"/>
+          <w:szCs w:val="28"/>
+        </w:rPr>
+        <w:lastRenderedPageBreak/>
+        <w:t>El algoritmo toma la trayectoria suavizada por el spline y la muestra densamente para medir con alta precisión la longitud de arco real (distancia recorrida acumulada) evaluando la hipotenusa entre saltos diferenciales de (X, Y).</w:t>
+      </w:r>
+    </w:p>
+    <w:p>
+      <w:pPr>
+        <w:rPr>
+          <w:color w:val="000000"/>
+          <w:szCs w:val="28"/>
+        </w:rPr>
+      </w:pPr>
+      <w:r>
+        <w:rPr>
+          <w:color w:val="000000"/>
+          <w:szCs w:val="28"/>
+        </w:rPr>
+        <w:t>Luego</w:t>
+      </w:r>
+      <w:r>
+        <w:rPr>
+          <w:color w:val="000000"/>
+          <w:szCs w:val="28"/>
+        </w:rPr>
+        <w:t>, e</w:t>
+      </w:r>
+      <w:r>
+        <w:rPr>
+          <w:color w:val="000000"/>
+          <w:szCs w:val="28"/>
+        </w:rPr>
+        <w:t>n el caso B, se reparametriza la trayectoria para mantener aproximadamente constante la rapidez espacial, de modo que la distancia recorrida entre frames consecutivos sea prácticamente igual</w:t>
+      </w:r>
+      <w:r>
+        <w:rPr>
+          <w:color w:val="000000"/>
+          <w:szCs w:val="28"/>
+        </w:rPr>
+        <w:t>, mientras que en</w:t>
+      </w:r>
+      <w:r>
+        <w:rPr>
+          <w:color w:val="000000"/>
+          <w:szCs w:val="28"/>
+        </w:rPr>
+        <w:t xml:space="preserve"> el caso</w:t>
+      </w:r>
+      <w:r>
+        <w:rPr>
+          <w:color w:val="000000"/>
+          <w:szCs w:val="28"/>
+        </w:rPr>
+        <w:t> A, se busca mantener constante la rapidez aparente en pantalla compensando las variaciones del zoom</w:t>
+      </w:r>
+      <w:r>
+        <w:rPr>
+          <w:color w:val="000000"/>
+          <w:szCs w:val="28"/>
+        </w:rPr>
+        <w:t>, esto es porque al aplicarle zoom al video, la velocidad que es constante se pierde, entonces tuvimos que compensarla para que</w:t>
+      </w:r>
+    </w:p>
+    <w:p>
+      <w:pPr>
+        <w:pStyle w:val="Ttulo2"/>
+      </w:pPr>
+      <w:bookmarkStart w:id="11" w:name="_Toc239930244"/>
+      <w:r>
+        <w:rPr>
+          <w:rFonts w:eastAsiaTheme="minorHAnsi"/>
+        </w:rPr>
+        <w:t>Caso A</w:t>
+      </w:r>
+      <w:bookmarkEnd w:id="11"/>
+    </w:p>
+    <w:p>
+      <w:r>
+        <w:t>Mantiene la información del zoom relativo original Z(t), por lo que la cámara escala dinámicamente el recorte del mapa en función de la altura real construida.</w:t>
+      </w:r>
+    </w:p>
+    <w:p>
+      <w:pPr>
+        <w:rPr>
+          <w:color w:val="000000"/>
+          <w:szCs w:val="28"/>
+        </w:rPr>
+      </w:pPr>
+      <w:r>
+        <w:rPr>
+          <w:color w:val="000000"/>
+          <w:szCs w:val="28"/>
+        </w:rPr>
+        <w:t>Resultados:</w:t>
+      </w:r>
+    </w:p>
+    <w:p>
+      <w:pPr>
+        <w:jc w:val="center"/>
+        <w:rPr>
+          <w:color w:val="000000"/>
+          <w:szCs w:val="28"/>
+        </w:rPr>
+      </w:pPr>
+      <w:r>
+        <w:rPr>
+          <w:color w:val="000000"/>
+          <w:szCs w:val="28"/>
+        </w:rPr>
+        <w:pict w14:anchorId="71A00D29">
+          <v:shape id="_x0000_i1037" type="#_x0000_t75" style="width:407.8pt;height:204.7pt">
+            <v:imagedata r:id="rId15" o:title="rapidez_instantanea"/>
+          </v:shape>
+        </w:pict>
+      </w:r>
+    </w:p>
+    <w:p>
+      <w:pPr>
+        <w:jc w:val="center"/>
+        <w:rPr>
+          <w:color w:val="000000"/>
+          <w:szCs w:val="28"/>
+        </w:rPr>
+      </w:pPr>
+      <w:r>
+        <w:rPr>
+          <w:color w:val="000000"/>
+          <w:szCs w:val="28"/>
+        </w:rPr>
+        <w:pict w14:anchorId="732816B5">
+          <v:shape id="_x0000_i1050" type="#_x0000_t75" style="width:403pt;height:202.05pt">
+            <v:imagedata r:id="rId16" o:title="zoom_relativo"/>
+          </v:shape>
+        </w:pict>
+      </w:r>
+    </w:p>
+    <w:p>
+      <w:pPr>
+        <w:jc w:val="center"/>
+        <w:rPr>
+          <w:color w:val="000000"/>
+          <w:szCs w:val="28"/>
+        </w:rPr>
+      </w:pPr>
+      <w:r>
+        <w:rPr>
+          <w:color w:val="000000"/>
+          <w:szCs w:val="28"/>
+        </w:rPr>
+        <w:lastRenderedPageBreak/>
+        <w:pict w14:anchorId="68C21724">
+          <v:shape id="_x0000_i1039" type="#_x0000_t75" style="width:402.45pt;height:201.5pt">
+            <v:imagedata r:id="rId17" o:title="flujo_optico"/>
+          </v:shape>
+        </w:pict>
+      </w:r>
+    </w:p>
+    <w:p>
+      <w:pPr>
+        <w:rPr>
+          <w:color w:val="000000"/>
+          <w:szCs w:val="28"/>
+        </w:rPr>
+      </w:pPr>
+      <w:r>
+        <w:rPr>
+          <w:color w:val="000000"/>
+          <w:szCs w:val="28"/>
+        </w:rPr>
+        <w:t>Con respecto a este video, nuestra mayor dificultad fue intentar mantener constante la velocidad, pero cuando se le aplica un zoom que no es constante, siempre teníamos problemas para que se mantenga así, entonces aplicamos algún tipo de corrección para el zoom, pero aun así tuvimos dificultades para mantenerla constante correctamente.</w:t>
+      </w:r>
+    </w:p>
+    <w:p>
+      <w:pPr>
+        <w:pStyle w:val="Ttulo2"/>
+      </w:pPr>
+      <w:bookmarkStart w:id="12" w:name="_Toc239930245"/>
+      <w:r>
+        <w:t>Caso B</w:t>
+      </w:r>
+      <w:bookmarkEnd w:id="12"/>
+    </w:p>
+    <w:p>
+      <w:r>
+        <w:t>Fija el factor de zoom en una constante de Z=1.0 durante toda la línea de tiempo, eliminando las perturbaciones de altitud.</w:t>
+      </w:r>
+    </w:p>
+    <w:p>
+      <w:r>
+        <w:t>Resultados:</w:t>
+      </w:r>
+    </w:p>
+    <w:p>
+      <w:pPr>
+        <w:jc w:val="center"/>
+        <w:rPr>
+          <w:color w:val="000000"/>
+          <w:szCs w:val="28"/>
+        </w:rPr>
+      </w:pPr>
+      <w:r>
+        <w:rPr>
+          <w:color w:val="000000"/>
+          <w:szCs w:val="28"/>
+        </w:rPr>
+        <w:pict w14:anchorId="7A0D12A9">
+          <v:shape id="_x0000_i1056" type="#_x0000_t75" style="width:422.35pt;height:211.7pt">
+            <v:imagedata r:id="rId18" o:title="rapidez_instantanea"/>
+          </v:shape>
+        </w:pict>
+      </w:r>
+    </w:p>
+    <w:p>
+      <w:pPr>
+        <w:jc w:val="center"/>
+        <w:rPr>
+          <w:color w:val="000000"/>
+          <w:szCs w:val="28"/>
+        </w:rPr>
+      </w:pPr>
+      <w:r>
+        <w:rPr>
+          <w:color w:val="000000"/>
+          <w:szCs w:val="28"/>
+        </w:rPr>
+        <w:lastRenderedPageBreak/>
+        <w:pict w14:anchorId="0ADB0CA6">
+          <v:shape id="_x0000_i1057" type="#_x0000_t75" style="width:422.35pt;height:210.65pt">
+            <v:imagedata r:id="rId19" o:title="zoom_relativo"/>
+          </v:shape>
+        </w:pict>
+      </w:r>
+    </w:p>
+    <w:p>
+      <w:pPr>
+        <w:pStyle w:val="Ttulo2"/>
+      </w:pPr>
+      <w:r>
+        <w:pict w14:anchorId="418BC20E">
+          <v:shape id="_x0000_i1058" type="#_x0000_t75" style="width:425pt;height:212.8pt">
+            <v:imagedata r:id="rId20" o:title="flujo_optico"/>
+          </v:shape>
+        </w:pict>
+      </w:r>
+    </w:p>
+    <w:p>
+      <w:pPr>
+        <w:pStyle w:val="Ttulo2"/>
+      </w:pPr>
+      <w:r>
+        <w:t>Conclusiones:</w:t>
+      </w:r>
+    </w:p>
+    <w:p>
+      <w:pPr>
+        <w:rPr>
+          <w:lang w:eastAsia="es-AR"/>
+        </w:rPr>
+      </w:pPr>
+      <w:bookmarkStart w:id="13" w:name="_Toc239930246"/>
+      <w:r>
+        <w:rPr>
+          <w:lang w:eastAsia="es-AR"/>
+        </w:rPr>
+        <w:t>La física dicta que la aceleración lateral al tomar una curva es</w:t>
+      </w:r>
+      <w:r>
+        <w:rPr>
+          <w:lang w:eastAsia="es-AR"/>
+        </w:rPr>
+        <w:t xml:space="preserve"> </w:t>
+      </w:r>
+      <m:oMath>
+        <m:sSub>
+          <m:sSubPr>
+            <m:ctrlPr>
+              <w:rPr>
+                <w:rFonts w:ascii="Cambria Math" w:hAnsi="Cambria Math"/>
+                <w:lang w:eastAsia="es-AR"/>
+              </w:rPr>
+            </m:ctrlPr>
+          </m:sSubPr>
+          <m:e>
+            <m:r>
+              <w:rPr>
+                <w:rFonts w:ascii="Cambria Math" w:hAnsi="Cambria Math"/>
+                <w:lang w:eastAsia="es-AR"/>
+              </w:rPr>
+              <m:t>a</m:t>
+            </m:r>
+          </m:e>
+          <m:sub>
+            <m:r>
+              <w:rPr>
+                <w:rFonts w:ascii="Cambria Math" w:hAnsi="Cambria Math"/>
+                <w:lang w:eastAsia="es-AR"/>
+              </w:rPr>
+              <m:t>c</m:t>
+            </m:r>
+          </m:sub>
+        </m:sSub>
+        <m:r>
+          <m:rPr>
+            <m:sty m:val="p"/>
+          </m:rPr>
+          <w:rPr>
+            <w:rFonts w:ascii="Cambria Math" w:hAnsi="Cambria Math"/>
+            <w:lang w:eastAsia="es-AR"/>
+          </w:rPr>
+          <m:t xml:space="preserve">= </m:t>
+        </m:r>
+        <m:f>
+          <m:fPr>
+            <m:ctrlPr>
+              <w:rPr>
+                <w:rFonts w:ascii="Cambria Math" w:hAnsi="Cambria Math"/>
+                <w:lang w:eastAsia="es-AR"/>
+              </w:rPr>
+            </m:ctrlPr>
+          </m:fPr>
+          <m:num>
+            <m:sSup>
+              <m:sSupPr>
+                <m:ctrlPr>
+                  <w:rPr>
+                    <w:rFonts w:ascii="Cambria Math" w:hAnsi="Cambria Math"/>
+                    <w:lang w:eastAsia="es-AR"/>
+                  </w:rPr>
+                </m:ctrlPr>
+              </m:sSupPr>
+              <m:e>
+                <m:r>
+                  <w:rPr>
+                    <w:rFonts w:ascii="Cambria Math" w:hAnsi="Cambria Math"/>
+                    <w:lang w:eastAsia="es-AR"/>
+                  </w:rPr>
+                  <m:t>v</m:t>
+                </m:r>
+              </m:e>
+              <m:sup>
+                <m:r>
+                  <m:rPr>
+                    <m:sty m:val="p"/>
+                  </m:rPr>
+                  <w:rPr>
+                    <w:rFonts w:ascii="Cambria Math" w:hAnsi="Cambria Math"/>
+                    <w:lang w:eastAsia="es-AR"/>
+                  </w:rPr>
+                  <m:t>2</m:t>
+                </m:r>
+              </m:sup>
+            </m:sSup>
+          </m:num>
+          <m:den>
+            <m:r>
+              <w:rPr>
+                <w:rFonts w:ascii="Cambria Math" w:hAnsi="Cambria Math"/>
+                <w:lang w:eastAsia="es-AR"/>
+              </w:rPr>
+              <m:t>r</m:t>
+            </m:r>
+          </m:den>
+        </m:f>
+      </m:oMath>
+      <w:r>
+        <w:rPr>
+          <w:lang w:eastAsia="es-AR"/>
+        </w:rPr>
+        <w:t>. Al</w:t>
+      </w:r>
+      <w:r>
+        <w:rPr>
+          <w:lang w:eastAsia="es-AR"/>
+        </w:rPr>
+        <w:t xml:space="preserve"> forzar que la rapidez escalar </w:t>
+      </w:r>
+      <m:oMath>
+        <m:r>
+          <w:rPr>
+            <w:rFonts w:ascii="Cambria Math" w:hAnsi="Cambria Math"/>
+            <w:lang w:eastAsia="es-AR"/>
+          </w:rPr>
+          <m:t>v=</m:t>
+        </m:r>
+        <m:sSub>
+          <m:sSubPr>
+            <m:ctrlPr>
+              <w:rPr>
+                <w:rFonts w:ascii="Cambria Math" w:hAnsi="Cambria Math"/>
+                <w:i/>
+                <w:lang w:eastAsia="es-AR"/>
+              </w:rPr>
+            </m:ctrlPr>
+          </m:sSubPr>
+          <m:e>
+            <m:r>
+              <w:rPr>
+                <w:rFonts w:ascii="Cambria Math" w:hAnsi="Cambria Math"/>
+                <w:lang w:eastAsia="es-AR"/>
+              </w:rPr>
+              <m:t>v</m:t>
+            </m:r>
+          </m:e>
+          <m:sub>
+            <m:r>
+              <w:rPr>
+                <w:rFonts w:ascii="Cambria Math" w:hAnsi="Cambria Math"/>
+                <w:lang w:eastAsia="es-AR"/>
+              </w:rPr>
+              <m:t>o</m:t>
+            </m:r>
+          </m:sub>
+        </m:sSub>
+      </m:oMath>
+      <w:r>
+        <w:rPr>
+          <w:lang w:eastAsia="es-AR"/>
+        </w:rPr>
+        <w:t xml:space="preserve"> incluso al girar en curvas cerradas (donde el radio r tiende a cero), la aceleración requerida tiende a infinito</w:t>
+      </w:r>
+      <w:r>
+        <w:rPr>
+          <w:lang w:eastAsia="es-AR"/>
+        </w:rPr>
+        <w:t>, ese es el motivo de algunas de los picos que se aprecian en las funciones de velocidad</w:t>
+      </w:r>
+      <w:r>
+        <w:rPr>
+          <w:lang w:eastAsia="es-AR"/>
+        </w:rPr>
+        <w:t>.</w:t>
+      </w:r>
+    </w:p>
+    <w:p>
+      <w:pPr>
+        <w:rPr>
+          <w:color w:val="000000"/>
+          <w:szCs w:val="28"/>
+        </w:rPr>
+      </w:pPr>
+      <w:r>
+        <w:rPr>
+          <w:color w:val="000000"/>
+          <w:szCs w:val="28"/>
+        </w:rPr>
+        <w:t>En el mundo real, para generar esa fuerza lateral, un dron tendría que alcanzar un ángulo de inclinación irrealizable, el dron perdería estabilidad vertical y se estrellaría.</w:t>
+      </w:r>
+    </w:p>
+    <w:p>
+      <w:pPr>
+        <w:rPr>
+          <w:color w:val="000000"/>
+          <w:szCs w:val="28"/>
+        </w:rPr>
+      </w:pPr>
+      <w:r>
+        <w:rPr>
+          <w:color w:val="000000"/>
+          <w:szCs w:val="28"/>
+        </w:rPr>
+        <w:t xml:space="preserve">Al no frenar en las curvas, el desplazamiento en pixeles de la imagen satelital entre frames contiguos durante un giro brusco será tan grande que violará la hipótesis central de Lucas-Kanade (desplazamientos “suficientemente pequeños”). Esto causará que el flujo óptico pierda el rastro en los vértices más agudos de la trayectoria, demostrando por qué una rapidez estrictamente </w:t>
+      </w:r>
+      <w:r>
+        <w:rPr>
+          <w:color w:val="000000"/>
+          <w:szCs w:val="28"/>
+        </w:rPr>
+        <w:lastRenderedPageBreak/>
+        <w:t>constante es incompatible con misiones de fotogrametría automáticas que tienen cambios de dirección</w:t>
+      </w:r>
+      <w:r>
+        <w:rPr>
+          <w:color w:val="000000"/>
+          <w:szCs w:val="28"/>
+        </w:rPr>
+        <w:t>, esto explicaría el fuerte ruido que hay en la gráfica de flujo óptico</w:t>
+      </w:r>
+      <w:r>
+        <w:rPr>
+          <w:color w:val="000000"/>
+          <w:szCs w:val="28"/>
+        </w:rPr>
+        <w:t>.</w:t>
+      </w:r>
+      <w:bookmarkStart w:id="14" w:name="_GoBack"/>
+      <w:bookmarkEnd w:id="14"/>
+    </w:p>
+    <w:p>
+      <w:pPr>
         <w:pStyle w:val="Ttulo1"/>
         <w:rPr>
           <w:lang w:eastAsia="es-AR"/>
@@ -1946,6 +3163,7 @@
         </w:rPr>
         <w:t>4. Modelado de Condiciones Reales de Vuelo</w:t>
       </w:r>
+      <w:bookmarkEnd w:id="13"/>
     </w:p>
     <w:p>
       <w:pPr>
@@ -1969,7 +3187,19 @@
         <w:rPr>
           <w:lang w:eastAsia="es-AR"/>
         </w:rPr>
-        <w:t>s comerciales algunos sistemas y marcas mas recomendados con los que nos topamos fueron ArduPilot y PX4, los cuales son ecosistemas de código abierto, como también el software de DJI.</w:t>
+        <w:t xml:space="preserve">s comerciales algunos sistemas y marcas </w:t>
+      </w:r>
+      <w:r>
+        <w:rPr>
+          <w:lang w:eastAsia="es-AR"/>
+        </w:rPr>
+        <w:t>más</w:t>
+      </w:r>
+      <w:r>
+        <w:rPr>
+          <w:lang w:eastAsia="es-AR"/>
+        </w:rPr>
+        <w:t xml:space="preserve"> recomendados con los que nos topamos fueron ArduPilot y PX4, los cuales son ecosistemas de código abierto, como también el software de DJI.</w:t>
       </w:r>
     </w:p>
     <w:p>
@@ -1979,12 +3209,20 @@
           <w:lang w:eastAsia="es-AR"/>
         </w:rPr>
       </w:pPr>
-      <w:r>
-        <w:rPr>
-          <w:lang w:eastAsia="es-AR"/>
-        </w:rPr>
-        <w:t>Velocidad y Aceleracion</w:t>
-      </w:r>
+      <w:bookmarkStart w:id="15" w:name="_Toc239930247"/>
+      <w:r>
+        <w:rPr>
+          <w:lang w:eastAsia="es-AR"/>
+        </w:rPr>
+        <w:t xml:space="preserve">Velocidad y </w:t>
+      </w:r>
+      <w:r>
+        <w:rPr>
+          <w:lang w:eastAsia="es-AR"/>
+        </w:rPr>
+        <w:t>Aceleración</w:t>
+      </w:r>
+      <w:bookmarkEnd w:id="15"/>
     </w:p>
     <w:p>
       <w:pPr>
@@ -2083,14 +3321,7 @@
             <w:rFonts w:ascii="Cambria Math" w:hAnsi="Cambria Math"/>
             <w:lang w:eastAsia="es-AR"/>
           </w:rPr>
-          <m:t>2.0</m:t>
-        </m:r>
-        <m:r>
-          <w:rPr>
-            <w:rFonts w:ascii="Cambria Math" w:hAnsi="Cambria Math"/>
-            <w:lang w:eastAsia="es-AR"/>
-          </w:rPr>
-          <m:t xml:space="preserve"> </m:t>
+          <m:t xml:space="preserve">2.0 </m:t>
         </m:r>
         <m:sSup>
           <m:sSupPr>
@@ -2397,7 +3628,6 @@
           <w:rFonts w:eastAsiaTheme="minorEastAsia"/>
           <w:lang w:val="es-ES" w:eastAsia="es-AR"/>
         </w:rPr>
-        <w:lastRenderedPageBreak/>
         <w:t xml:space="preserve">Para evitar que en la implementación se utilicen </w:t>
       </w:r>
       <w:r>
@@ -2632,38 +3862,33 @@
           <w:rFonts w:eastAsiaTheme="minorEastAsia"/>
           <w:lang w:eastAsia="es-AR"/>
         </w:rPr>
-        <w:t xml:space="preserve"> </w:t>
+        <w:t xml:space="preserve"> algoritmo de doble barrido</w:t>
       </w:r>
       <w:r>
         <w:rPr>
           <w:rFonts w:eastAsiaTheme="minorEastAsia"/>
           <w:lang w:eastAsia="es-AR"/>
         </w:rPr>
-        <w:t>algoritmo de doble barrido</w:t>
-      </w:r>
-      <w:r>
+        <w:t>.</w:t>
+      </w:r>
+    </w:p>
+    <w:p>
+      <w:pPr>
+        <w:pStyle w:val="Ttulo2"/>
         <w:rPr>
           <w:rFonts w:eastAsiaTheme="minorEastAsia"/>
           <w:lang w:eastAsia="es-AR"/>
         </w:rPr>
-        <w:t>.</w:t>
-      </w:r>
-    </w:p>
-    <w:p>
-      <w:pPr>
-        <w:pStyle w:val="Ttulo2"/>
+      </w:pPr>
+      <w:bookmarkStart w:id="16" w:name="_Toc239930248"/>
+      <w:r>
         <w:rPr>
           <w:rFonts w:eastAsiaTheme="minorEastAsia"/>
           <w:lang w:eastAsia="es-AR"/>
         </w:rPr>
-      </w:pPr>
-      <w:r>
-        <w:rPr>
-          <w:rFonts w:eastAsiaTheme="minorEastAsia"/>
-          <w:lang w:eastAsia="es-AR"/>
-        </w:rPr>
         <w:t>Implementación de Parámetros</w:t>
       </w:r>
+      <w:bookmarkEnd w:id="16"/>
     </w:p>
     <w:p>
       <w:pPr>
@@ -2773,6 +3998,7 @@
           <w:rFonts w:eastAsiaTheme="minorEastAsia"/>
           <w:lang w:eastAsia="es-AR"/>
         </w:rPr>
+        <w:lastRenderedPageBreak/>
         <w:t xml:space="preserve">Segundo </w:t>
       </w:r>
       <w:r>
@@ -2828,6 +4054,7 @@
           <w:lang w:eastAsia="es-AR"/>
         </w:rPr>
       </w:pPr>
+      <w:bookmarkStart w:id="17" w:name="_Toc239930249"/>
       <w:r>
         <w:rPr>
           <w:rFonts w:eastAsiaTheme="minorEastAsia"/>
@@ -2835,6 +4062,7 @@
         </w:rPr>
         <w:t>Restricción en Curvas</w:t>
       </w:r>
+      <w:bookmarkEnd w:id="17"/>
     </w:p>
     <w:p>
       <w:pPr>
@@ -3013,6 +4241,7 @@
           <w:lang w:eastAsia="es-AR"/>
         </w:rPr>
       </w:pPr>
+      <w:bookmarkStart w:id="18" w:name="_Toc239930250"/>
       <w:r>
         <w:rPr>
           <w:rFonts w:eastAsiaTheme="minorEastAsia"/>
@@ -3020,6 +4249,7 @@
         </w:rPr>
         <w:t>Calibración Numérica (Desacople Cinemático)</w:t>
       </w:r>
+      <w:bookmarkEnd w:id="18"/>
     </w:p>
     <w:p>
       <w:pPr>
@@ -3163,14 +4393,7 @@
             <w:rFonts w:ascii="Cambria Math" w:eastAsiaTheme="minorEastAsia" w:hAnsi="Cambria Math"/>
             <w:lang w:eastAsia="es-AR"/>
           </w:rPr>
-          <m:t>=3</m:t>
-        </m:r>
-        <m:r>
-          <w:rPr>
-            <w:rFonts w:ascii="Cambria Math" w:eastAsiaTheme="minorEastAsia" w:hAnsi="Cambria Math"/>
-            <w:lang w:eastAsia="es-AR"/>
-          </w:rPr>
-          <m:t>.0</m:t>
+          <m:t>=3.0</m:t>
         </m:r>
         <m:sSup>
           <m:sSupPr>
@@ -3389,113 +4612,123 @@
           <w:lang w:eastAsia="es-AR"/>
         </w:rPr>
       </w:pPr>
+      <w:bookmarkStart w:id="19" w:name="_Toc239930251"/>
       <w:r>
         <w:rPr>
           <w:rFonts w:eastAsiaTheme="minorEastAsia"/>
           <w:lang w:eastAsia="es-AR"/>
         </w:rPr>
+        <w:t>Resultados del Flujo Óptico</w:t>
+      </w:r>
+      <w:bookmarkEnd w:id="19"/>
+    </w:p>
+    <w:p>
+      <w:pPr>
+        <w:rPr>
+          <w:rFonts w:eastAsiaTheme="minorEastAsia"/>
+          <w:lang w:eastAsia="es-AR"/>
+        </w:rPr>
+      </w:pPr>
+      <w:r>
+        <w:rPr>
+          <w:rFonts w:eastAsiaTheme="minorEastAsia"/>
+          <w:lang w:eastAsia="es-AR"/>
+        </w:rPr>
+        <w:t xml:space="preserve">Finalmente, al someter el video sintetizado con estas condiciones reales al algoritmo de Lucas-Kanade, las gráficas resultantes </w:t>
+      </w:r>
+      <w:r>
+        <w:rPr>
+          <w:rFonts w:eastAsiaTheme="minorEastAsia"/>
+          <w:lang w:eastAsia="es-AR"/>
+        </w:rPr>
+        <w:t>muestran que el nuevo</w:t>
+      </w:r>
+      <w:r>
+        <w:rPr>
+          <w:rFonts w:eastAsiaTheme="minorEastAsia"/>
+          <w:lang w:eastAsia="es-AR"/>
+        </w:rPr>
+        <w:t xml:space="preserve"> modelo</w:t>
+      </w:r>
+      <w:r>
+        <w:rPr>
+          <w:rFonts w:eastAsiaTheme="minorEastAsia"/>
+          <w:lang w:eastAsia="es-AR"/>
+        </w:rPr>
+        <w:t xml:space="preserve"> utilizado es muy satisfactorio</w:t>
+      </w:r>
+      <w:r>
+        <w:rPr>
+          <w:rFonts w:eastAsiaTheme="minorEastAsia"/>
+          <w:lang w:eastAsia="es-AR"/>
+        </w:rPr>
+        <w:t xml:space="preserve">. A diferencia de los incisos previos, la rapidez escalar instantánea dejó de ser constante, </w:t>
+      </w:r>
+      <w:r>
+        <w:rPr>
+          <w:rFonts w:eastAsiaTheme="minorEastAsia"/>
+          <w:lang w:eastAsia="es-AR"/>
+        </w:rPr>
+        <w:t>se muestran</w:t>
+      </w:r>
+      <w:r>
+        <w:rPr>
+          <w:rFonts w:eastAsiaTheme="minorEastAsia"/>
+          <w:lang w:eastAsia="es-AR"/>
+        </w:rPr>
+        <w:t xml:space="preserve"> rampas de aceleración limpias y frenadas pronunciadas en coincidencia exacta con los vértices más cerrados de la trayectoria. Se logró un vuelo matemáticamente libre del ruido de alta frecuencia del gimbal original, pero con un comportamiento dinámico </w:t>
+      </w:r>
+      <w:r>
+        <w:rPr>
+          <w:rFonts w:eastAsiaTheme="minorEastAsia"/>
+          <w:lang w:eastAsia="es-AR"/>
+        </w:rPr>
+        <w:t>muy cercano al</w:t>
+      </w:r>
+      <w:r>
+        <w:rPr>
+          <w:rFonts w:eastAsiaTheme="minorEastAsia"/>
+          <w:lang w:eastAsia="es-AR"/>
+        </w:rPr>
+        <w:t xml:space="preserve"> de un autopiloto comercial.</w:t>
+      </w:r>
+    </w:p>
+    <w:p>
+      <w:pPr>
+        <w:pStyle w:val="Ttulo2"/>
+        <w:rPr>
+          <w:rFonts w:eastAsiaTheme="minorEastAsia"/>
+          <w:lang w:eastAsia="es-AR"/>
+        </w:rPr>
+      </w:pPr>
+      <w:bookmarkStart w:id="20" w:name="_Toc239930252"/>
+      <w:r>
+        <w:rPr>
+          <w:rFonts w:eastAsiaTheme="minorEastAsia"/>
+          <w:lang w:eastAsia="es-AR"/>
+        </w:rPr>
+        <w:t>Conclusión</w:t>
+      </w:r>
+      <w:bookmarkEnd w:id="20"/>
+    </w:p>
+    <w:p>
+      <w:pPr>
+        <w:rPr>
+          <w:lang w:eastAsia="es-AR"/>
+        </w:rPr>
+      </w:pPr>
+      <w:r>
+        <w:rPr>
+          <w:lang w:eastAsia="es-AR"/>
+        </w:rPr>
+        <w:t xml:space="preserve">En conclusión, logramos simular un vuelo físicamente realista aplicando parámetros de drones comerciales. Al definir la escala en 50 px/m, pudimos trasladar estas limitaciones al código de forma directa. Para mantener la eficiencia del sistema, usamos un algoritmo de doble barrido con la ecuación de </w:t>
+      </w:r>
+      <w:r>
+        <w:rPr>
+          <w:lang w:eastAsia="es-AR"/>
+        </w:rPr>
         <w:lastRenderedPageBreak/>
-        <w:t>Resultados del Flujo Óptico</w:t>
-      </w:r>
-    </w:p>
-    <w:p>
-      <w:pPr>
-        <w:rPr>
-          <w:rFonts w:eastAsiaTheme="minorEastAsia"/>
-          <w:lang w:eastAsia="es-AR"/>
-        </w:rPr>
-      </w:pPr>
-      <w:r>
-        <w:rPr>
-          <w:rFonts w:eastAsiaTheme="minorEastAsia"/>
-          <w:lang w:eastAsia="es-AR"/>
-        </w:rPr>
-        <w:t xml:space="preserve">Finalmente, al someter el video sintetizado con estas condiciones reales al algoritmo de Lucas-Kanade, las gráficas resultantes </w:t>
-      </w:r>
-      <w:r>
-        <w:rPr>
-          <w:rFonts w:eastAsiaTheme="minorEastAsia"/>
-          <w:lang w:eastAsia="es-AR"/>
-        </w:rPr>
-        <w:t>muestran que el nuevo</w:t>
-      </w:r>
-      <w:r>
-        <w:rPr>
-          <w:rFonts w:eastAsiaTheme="minorEastAsia"/>
-          <w:lang w:eastAsia="es-AR"/>
-        </w:rPr>
-        <w:t xml:space="preserve"> modelo</w:t>
-      </w:r>
-      <w:r>
-        <w:rPr>
-          <w:rFonts w:eastAsiaTheme="minorEastAsia"/>
-          <w:lang w:eastAsia="es-AR"/>
-        </w:rPr>
-        <w:t xml:space="preserve"> utilizado es muy satisfactorio</w:t>
-      </w:r>
-      <w:r>
-        <w:rPr>
-          <w:rFonts w:eastAsiaTheme="minorEastAsia"/>
-          <w:lang w:eastAsia="es-AR"/>
-        </w:rPr>
-        <w:t xml:space="preserve">. A diferencia de los incisos previos, la rapidez escalar instantánea dejó de ser constante, </w:t>
-      </w:r>
-      <w:r>
-        <w:rPr>
-          <w:rFonts w:eastAsiaTheme="minorEastAsia"/>
-          <w:lang w:eastAsia="es-AR"/>
-        </w:rPr>
-        <w:t>se muestran</w:t>
-      </w:r>
-      <w:r>
-        <w:rPr>
-          <w:rFonts w:eastAsiaTheme="minorEastAsia"/>
-          <w:lang w:eastAsia="es-AR"/>
-        </w:rPr>
-        <w:t xml:space="preserve"> rampas de aceleración limpias y frenadas pronunciadas en coincidencia exacta con los vértices más cerrados de la trayectoria. Se logró un vuelo matemáticamente libre del ruido de alta frecuencia del gimbal original, pero con un comportamiento dinámico </w:t>
-      </w:r>
-      <w:r>
-        <w:rPr>
-          <w:rFonts w:eastAsiaTheme="minorEastAsia"/>
-          <w:lang w:eastAsia="es-AR"/>
-        </w:rPr>
-        <w:t>muy cercano al</w:t>
-      </w:r>
-      <w:r>
-        <w:rPr>
-          <w:rFonts w:eastAsiaTheme="minorEastAsia"/>
-          <w:lang w:eastAsia="es-AR"/>
-        </w:rPr>
-        <w:t xml:space="preserve"> de un autopiloto comercial.</w:t>
-      </w:r>
-    </w:p>
-    <w:p>
-      <w:pPr>
-        <w:pStyle w:val="Ttulo2"/>
-        <w:rPr>
-          <w:rFonts w:eastAsiaTheme="minorEastAsia"/>
-          <w:lang w:eastAsia="es-AR"/>
-        </w:rPr>
-      </w:pPr>
-      <w:r>
-        <w:rPr>
-          <w:rFonts w:eastAsiaTheme="minorEastAsia"/>
-          <w:lang w:eastAsia="es-AR"/>
-        </w:rPr>
-        <w:t>Conclusión</w:t>
-      </w:r>
-    </w:p>
-    <w:p>
-      <w:pPr>
-        <w:rPr>
-          <w:lang w:eastAsia="es-AR"/>
-        </w:rPr>
-      </w:pPr>
-      <w:r>
-        <w:rPr>
-          <w:lang w:eastAsia="es-AR"/>
-        </w:rPr>
-        <w:t>En conclusión, logramos simular un vuelo físicamente realista aplicando parámetros de drones comerciales. Al definir la escala en 50 px/m, pudimos trasladar estas limitaciones al código de forma directa. Para mantener la eficiencia del sistema, usamos un algoritmo de doble barrido con la ecuación de Torricelli; esto nos permitió simular el frenado en las curvas respetando los límites de aceleración, sin la necesidad de calcular el Jerk. Finalmente, las gráficas de Lucas-Kanade confirmaron que el modelo funciona tal como esperábamos</w:t>
+        <w:t>Torricelli; esto nos permitió simular el frenado en las curvas respetando los límites de aceleración, sin la necesidad de calcular el Jerk. Finalmente, las gráficas de Lucas-Kanade confirmaron que el modelo funciona tal como esperábamos</w:t>
       </w:r>
       <w:r>
         <w:rPr>
@@ -3574,7 +4807,7 @@
     <w:p/>
     <w:p/>
     <w:sectPr>
-      <w:footerReference w:type="default" r:id="rId14"/>
+      <w:footerReference w:type="default" r:id="rId21"/>
       <w:pgSz w:w="11906" w:h="16838"/>
       <w:pgMar w:top="1417" w:right="1701" w:bottom="1417" w:left="1701" w:header="708" w:footer="708" w:gutter="0"/>
       <w:cols w:space="708"/>
@@ -3586,7 +4819,7 @@
 </file>
 
 <file path=word/endnotes.xml><?xml version="1.0" encoding="utf-8"?>
-<w:endnotes xmlns:wpc="http://schemas.microsoft.com/office/word/2010/wordprocessingCanvas" xmlns:cx="http://schemas.microsoft.com/office/drawing/2014/chartex" xmlns:cx1="http://schemas.microsoft.com/office/drawing/2015/9/8/chartex" xmlns:cx2="http://schemas.microsoft.com/office/drawing/2015/10/21/chartex" xmlns:cx3="http://schemas.microsoft.com/office/drawing/2016/5/9/chartex" xmlns:cx4="http://schemas.microsoft.com/office/drawing/2016/5/10/chartex" xmlns:cx5="http://schemas.microsoft.com/office/drawing/2016/5/11/chartex" xmlns:cx6="http://schemas.microsoft.com/office/drawing/2016/5/12/chartex" xmlns:cx7="http://schemas.microsoft.com/office/drawing/2016/5/13/chartex" xmlns:cx8="http://schemas.microsoft.com/office/drawing/2016/5/14/chartex" xmlns:mc="http://schemas.openxmlformats.org/markup-compatibility/2006" xmlns:aink="http://schemas.microsoft.com/office/drawing/2016/ink" xmlns:am3d="http://schemas.microsoft.com/office/drawing/2017/model3d" xmlns:o="urn:schemas-microsoft-com:office:office" xmlns:oel="http://schemas.microsoft.com/office/2019/extlst" xmlns:r="http://schemas.openxmlformats.org/officeDocument/2006/relationships" xmlns:m="http://schemas.openxmlformats.org/officeDocument/2006/math" xmlns:v="urn:schemas-microsoft-com:vml" xmlns:wp14="http://schemas.microsoft.com/office/word/2010/wordprocessingDrawing" xmlns:wp="http://schemas.openxmlformats.org/drawingml/2006/wordprocessingDrawing" xmlns:w10="urn:schemas-microsoft-com:office:word" xmlns:w="http://schemas.openxmlformats.org/wordprocessingml/2006/main" xmlns:w14="http://schemas.microsoft.com/office/word/2010/wordml" xmlns:w15="http://schemas.microsoft.com/office/word/2012/wordml" xmlns:w16cex="http://schemas.microsoft.com/office/word/2018/wordml/cex" xmlns:w16cid="http://schemas.microsoft.com/office/word/2016/wordml/cid" xmlns:w16="http://schemas.microsoft.com/office/word/2018/wordml" xmlns:w16du="http://schemas.microsoft.com/office/word/2023/wordml/word16du" xmlns:w16sdtdh="http://schemas.microsoft.com/office/word/2020/wordml/sdtdatahash" xmlns:w16sdtfl="http://schemas.microsoft.com/office/word/2024/wordml/sdtformatlock" xmlns:w16se="http://schemas.microsoft.com/office/word/2015/wordml/symex" xmlns:wpg="http://schemas.microsoft.com/office/word/2010/wordprocessingGroup" xmlns:wpi="http://schemas.microsoft.com/office/word/2010/wordprocessingInk" xmlns:wne="http://schemas.microsoft.com/office/word/2006/wordml" xmlns:wps="http://schemas.microsoft.com/office/word/2010/wordprocessingShape" mc:Ignorable="w14 w15 w16se w16cid w16 w16cex w16sdtdh w16sdtfl w16du wp14">
+<w:endnotes xmlns:wpc="http://schemas.microsoft.com/office/word/2010/wordprocessingCanvas" xmlns:cx="http://schemas.microsoft.com/office/drawing/2014/chartex" xmlns:mc="http://schemas.openxmlformats.org/markup-compatibility/2006" xmlns:o="urn:schemas-microsoft-com:office:office" xmlns:r="http://schemas.openxmlformats.org/officeDocument/2006/relationships" xmlns:m="http://schemas.openxmlformats.org/officeDocument/2006/math" xmlns:v="urn:schemas-microsoft-com:vml" xmlns:wp14="http://schemas.microsoft.com/office/word/2010/wordprocessingDrawing" xmlns:wp="http://schemas.openxmlformats.org/drawingml/2006/wordprocessingDrawing" xmlns:w10="urn:schemas-microsoft-com:office:word" xmlns:w="http://schemas.openxmlformats.org/wordprocessingml/2006/main" xmlns:w14="http://schemas.microsoft.com/office/word/2010/wordml" xmlns:w15="http://schemas.microsoft.com/office/word/2012/wordml" xmlns:w16se="http://schemas.microsoft.com/office/word/2015/wordml/symex" xmlns:wpg="http://schemas.microsoft.com/office/word/2010/wordprocessingGroup" xmlns:wpi="http://schemas.microsoft.com/office/word/2010/wordprocessingInk" xmlns:wne="http://schemas.microsoft.com/office/word/2006/wordml" xmlns:wps="http://schemas.microsoft.com/office/word/2010/wordprocessingShape" mc:Ignorable="w14 w15 w16se wp14">
   <w:endnote w:type="separator" w:id="-1">
     <w:p>
       <w:pPr>
@@ -3611,7 +4844,7 @@
 </file>
 
 <file path=word/footer1.xml><?xml version="1.0" encoding="utf-8"?>
-<w:ftr xmlns:wpc="http://schemas.microsoft.com/office/word/2010/wordprocessingCanvas" xmlns:cx="http://schemas.microsoft.com/office/drawing/2014/chartex" xmlns:cx1="http://schemas.microsoft.com/office/drawing/2015/9/8/chartex" xmlns:cx2="http://schemas.microsoft.com/office/drawing/2015/10/21/chartex" xmlns:cx3="http://schemas.microsoft.com/office/drawing/2016/5/9/chartex" xmlns:cx4="http://schemas.microsoft.com/office/drawing/2016/5/10/chartex" xmlns:cx5="http://schemas.microsoft.com/office/drawing/2016/5/11/chartex" xmlns:cx6="http://schemas.microsoft.com/office/drawing/2016/5/12/chartex" xmlns:cx7="http://schemas.microsoft.com/office/drawing/2016/5/13/chartex" xmlns:cx8="http://schemas.microsoft.com/office/drawing/2016/5/14/chartex" xmlns:mc="http://schemas.openxmlformats.org/markup-compatibility/2006" xmlns:aink="http://schemas.microsoft.com/office/drawing/2016/ink" xmlns:am3d="http://schemas.microsoft.com/office/drawing/2017/model3d" xmlns:o="urn:schemas-microsoft-com:office:office" xmlns:oel="http://schemas.microsoft.com/office/2019/extlst" xmlns:r="http://schemas.openxmlformats.org/officeDocument/2006/relationships" xmlns:m="http://schemas.openxmlformats.org/officeDocument/2006/math" xmlns:v="urn:schemas-microsoft-com:vml" xmlns:wp14="http://schemas.microsoft.com/office/word/2010/wordprocessingDrawing" xmlns:wp="http://schemas.openxmlformats.org/drawingml/2006/wordprocessingDrawing" xmlns:w10="urn:schemas-microsoft-com:office:word" xmlns:w="http://schemas.openxmlformats.org/wordprocessingml/2006/main" xmlns:w14="http://schemas.microsoft.com/office/word/2010/wordml" xmlns:w15="http://schemas.microsoft.com/office/word/2012/wordml" xmlns:w16cex="http://schemas.microsoft.com/office/word/2018/wordml/cex" xmlns:w16cid="http://schemas.microsoft.com/office/word/2016/wordml/cid" xmlns:w16="http://schemas.microsoft.com/office/word/2018/wordml" xmlns:w16du="http://schemas.microsoft.com/office/word/2023/wordml/word16du" xmlns:w16sdtdh="http://schemas.microsoft.com/office/word/2020/wordml/sdtdatahash" xmlns:w16sdtfl="http://schemas.microsoft.com/office/word/2024/wordml/sdtformatlock" xmlns:w16se="http://schemas.microsoft.com/office/word/2015/wordml/symex" xmlns:wpg="http://schemas.microsoft.com/office/word/2010/wordprocessingGroup" xmlns:wpi="http://schemas.microsoft.com/office/word/2010/wordprocessingInk" xmlns:wne="http://schemas.microsoft.com/office/word/2006/wordml" xmlns:wps="http://schemas.microsoft.com/office/word/2010/wordprocessingShape" mc:Ignorable="w14 w15 w16se w16cid w16 w16cex w16sdtdh w16sdtfl w16du wp14">
+<w:ftr xmlns:wpc="http://schemas.microsoft.com/office/word/2010/wordprocessingCanvas" xmlns:cx="http://schemas.microsoft.com/office/drawing/2014/chartex" xmlns:mc="http://schemas.openxmlformats.org/markup-compatibility/2006" xmlns:o="urn:schemas-microsoft-com:office:office" xmlns:r="http://schemas.openxmlformats.org/officeDocument/2006/relationships" xmlns:m="http://schemas.openxmlformats.org/officeDocument/2006/math" xmlns:v="urn:schemas-microsoft-com:vml" xmlns:wp14="http://schemas.microsoft.com/office/word/2010/wordprocessingDrawing" xmlns:wp="http://schemas.openxmlformats.org/drawingml/2006/wordprocessingDrawing" xmlns:w10="urn:schemas-microsoft-com:office:word" xmlns:w="http://schemas.openxmlformats.org/wordprocessingml/2006/main" xmlns:w14="http://schemas.microsoft.com/office/word/2010/wordml" xmlns:w15="http://schemas.microsoft.com/office/word/2012/wordml" xmlns:w16se="http://schemas.microsoft.com/office/word/2015/wordml/symex" xmlns:wpg="http://schemas.microsoft.com/office/word/2010/wordprocessingGroup" xmlns:wpi="http://schemas.microsoft.com/office/word/2010/wordprocessingInk" xmlns:wne="http://schemas.microsoft.com/office/word/2006/wordml" xmlns:wps="http://schemas.microsoft.com/office/word/2010/wordprocessingShape" mc:Ignorable="w14 w15 w16se wp14">
   <w:p>
     <w:pPr>
       <w:tabs>
@@ -3677,7 +4910,7 @@
         <w:szCs w:val="24"/>
         <w:lang w:val="es-MX"/>
       </w:rPr>
-      <w:t>7</w:t>
+      <w:t>11</w:t>
     </w:r>
     <w:r>
       <w:rPr>
@@ -3728,7 +4961,7 @@
         <w:szCs w:val="24"/>
         <w:lang w:val="es-MX"/>
       </w:rPr>
-      <w:t>7</w:t>
+      <w:t>13</w:t>
     </w:r>
     <w:r>
       <w:rPr>
@@ -3748,7 +4981,7 @@
 </file>
 
 <file path=word/footnotes.xml><?xml version="1.0" encoding="utf-8"?>
-<w:footnotes xmlns:wpc="http://schemas.microsoft.com/office/word/2010/wordprocessingCanvas" xmlns:cx="http://schemas.microsoft.com/office/drawing/2014/chartex" xmlns:cx1="http://schemas.microsoft.com/office/drawing/2015/9/8/chartex" xmlns:cx2="http://schemas.microsoft.com/office/drawing/2015/10/21/chartex" xmlns:cx3="http://schemas.microsoft.com/office/drawing/2016/5/9/chartex" xmlns:cx4="http://schemas.microsoft.com/office/drawing/2016/5/10/chartex" xmlns:cx5="http://schemas.microsoft.com/office/drawing/2016/5/11/chartex" xmlns:cx6="http://schemas.microsoft.com/office/drawing/2016/5/12/chartex" xmlns:cx7="http://schemas.microsoft.com/office/drawing/2016/5/13/chartex" xmlns:cx8="http://schemas.microsoft.com/office/drawing/2016/5/14/chartex" xmlns:mc="http://schemas.openxmlformats.org/markup-compatibility/2006" xmlns:aink="http://schemas.microsoft.com/office/drawing/2016/ink" xmlns:am3d="http://schemas.microsoft.com/office/drawing/2017/model3d" xmlns:o="urn:schemas-microsoft-com:office:office" xmlns:oel="http://schemas.microsoft.com/office/2019/extlst" xmlns:r="http://schemas.openxmlformats.org/officeDocument/2006/relationships" xmlns:m="http://schemas.openxmlformats.org/officeDocument/2006/math" xmlns:v="urn:schemas-microsoft-com:vml" xmlns:wp14="http://schemas.microsoft.com/office/word/2010/wordprocessingDrawing" xmlns:wp="http://schemas.openxmlformats.org/drawingml/2006/wordprocessingDrawing" xmlns:w10="urn:schemas-microsoft-com:office:word" xmlns:w="http://schemas.openxmlformats.org/wordprocessingml/2006/main" xmlns:w14="http://schemas.microsoft.com/office/word/2010/wordml" xmlns:w15="http://schemas.microsoft.com/office/word/2012/wordml" xmlns:w16cex="http://schemas.microsoft.com/office/word/2018/wordml/cex" xmlns:w16cid="http://schemas.microsoft.com/office/word/2016/wordml/cid" xmlns:w16="http://schemas.microsoft.com/office/word/2018/wordml" xmlns:w16du="http://schemas.microsoft.com/office/word/2023/wordml/word16du" xmlns:w16sdtdh="http://schemas.microsoft.com/office/word/2020/wordml/sdtdatahash" xmlns:w16sdtfl="http://schemas.microsoft.com/office/word/2024/wordml/sdtformatlock" xmlns:w16se="http://schemas.microsoft.com/office/word/2015/wordml/symex" xmlns:wpg="http://schemas.microsoft.com/office/word/2010/wordprocessingGroup" xmlns:wpi="http://schemas.microsoft.com/office/word/2010/wordprocessingInk" xmlns:wne="http://schemas.microsoft.com/office/word/2006/wordml" xmlns:wps="http://schemas.microsoft.com/office/word/2010/wordprocessingShape" mc:Ignorable="w14 w15 w16se w16cid w16 w16cex w16sdtdh w16sdtfl w16du wp14">
+<w:footnotes xmlns:wpc="http://schemas.microsoft.com/office/word/2010/wordprocessingCanvas" xmlns:cx="http://schemas.microsoft.com/office/drawing/2014/chartex" xmlns:mc="http://schemas.openxmlformats.org/markup-compatibility/2006" xmlns:o="urn:schemas-microsoft-com:office:office" xmlns:r="http://schemas.openxmlformats.org/officeDocument/2006/relationships" xmlns:m="http://schemas.openxmlformats.org/officeDocument/2006/math" xmlns:v="urn:schemas-microsoft-com:vml" xmlns:wp14="http://schemas.microsoft.com/office/word/2010/wordprocessingDrawing" xmlns:wp="http://schemas.openxmlformats.org/drawingml/2006/wordprocessingDrawing" xmlns:w10="urn:schemas-microsoft-com:office:word" xmlns:w="http://schemas.openxmlformats.org/wordprocessingml/2006/main" xmlns:w14="http://schemas.microsoft.com/office/word/2010/wordml" xmlns:w15="http://schemas.microsoft.com/office/word/2012/wordml" xmlns:w16se="http://schemas.microsoft.com/office/word/2015/wordml/symex" xmlns:wpg="http://schemas.microsoft.com/office/word/2010/wordprocessingGroup" xmlns:wpi="http://schemas.microsoft.com/office/word/2010/wordprocessingInk" xmlns:wne="http://schemas.microsoft.com/office/word/2006/wordml" xmlns:wps="http://schemas.microsoft.com/office/word/2010/wordprocessingShape" mc:Ignorable="w14 w15 w16se wp14">
   <w:footnote w:type="separator" w:id="-1">
     <w:p>
       <w:pPr>
@@ -3773,7 +5006,7 @@
 </file>
 
 <file path=word/numbering.xml><?xml version="1.0" encoding="utf-8"?>
-<w:numbering xmlns:wpc="http://schemas.microsoft.com/office/word/2010/wordprocessingCanvas" xmlns:cx="http://schemas.microsoft.com/office/drawing/2014/chartex" xmlns:cx1="http://schemas.microsoft.com/office/drawing/2015/9/8/chartex" xmlns:cx2="http://schemas.microsoft.com/office/drawing/2015/10/21/chartex" xmlns:cx3="http://schemas.microsoft.com/office/drawing/2016/5/9/chartex" xmlns:cx4="http://schemas.microsoft.com/office/drawing/2016/5/10/chartex" xmlns:cx5="http://schemas.microsoft.com/office/drawing/2016/5/11/chartex" xmlns:cx6="http://schemas.microsoft.com/office/drawing/2016/5/12/chartex" xmlns:cx7="http://schemas.microsoft.com/office/drawing/2016/5/13/chartex" xmlns:cx8="http://schemas.microsoft.com/office/drawing/2016/5/14/chartex" xmlns:mc="http://schemas.openxmlformats.org/markup-compatibility/2006" xmlns:aink="http://schemas.microsoft.com/office/drawing/2016/ink" xmlns:am3d="http://schemas.microsoft.com/office/drawing/2017/model3d" xmlns:o="urn:schemas-microsoft-com:office:office" xmlns:oel="http://schemas.microsoft.com/office/2019/extlst" xmlns:r="http://schemas.openxmlformats.org/officeDocument/2006/relationships" xmlns:m="http://schemas.openxmlformats.org/officeDocument/2006/math" xmlns:v="urn:schemas-microsoft-com:vml" xmlns:wp14="http://schemas.microsoft.com/office/word/2010/wordprocessingDrawing" xmlns:wp="http://schemas.openxmlformats.org/drawingml/2006/wordprocessingDrawing" xmlns:w10="urn:schemas-microsoft-com:office:word" xmlns:w="http://schemas.openxmlformats.org/wordprocessingml/2006/main" xmlns:w14="http://schemas.microsoft.com/office/word/2010/wordml" xmlns:w15="http://schemas.microsoft.com/office/word/2012/wordml" xmlns:w16cex="http://schemas.microsoft.com/office/word/2018/wordml/cex" xmlns:w16cid="http://schemas.microsoft.com/office/word/2016/wordml/cid" xmlns:w16="http://schemas.microsoft.com/office/word/2018/wordml" xmlns:w16du="http://schemas.microsoft.com/office/word/2023/wordml/word16du" xmlns:w16sdtdh="http://schemas.microsoft.com/office/word/2020/wordml/sdtdatahash" xmlns:w16sdtfl="http://schemas.microsoft.com/office/word/2024/wordml/sdtformatlock" xmlns:w16se="http://schemas.microsoft.com/office/word/2015/wordml/symex" xmlns:wpg="http://schemas.microsoft.com/office/word/2010/wordprocessingGroup" xmlns:wpi="http://schemas.microsoft.com/office/word/2010/wordprocessingInk" xmlns:wne="http://schemas.microsoft.com/office/word/2006/wordml" xmlns:wps="http://schemas.microsoft.com/office/word/2010/wordprocessingShape" mc:Ignorable="w14 w15 w16se w16cid w16 w16cex w16sdtdh w16sdtfl w16du wp14">
+<w:numbering xmlns:wpc="http://schemas.microsoft.com/office/word/2010/wordprocessingCanvas" xmlns:cx="http://schemas.microsoft.com/office/drawing/2014/chartex" xmlns:mc="http://schemas.openxmlformats.org/markup-compatibility/2006" xmlns:o="urn:schemas-microsoft-com:office:office" xmlns:r="http://schemas.openxmlformats.org/officeDocument/2006/relationships" xmlns:m="http://schemas.openxmlformats.org/officeDocument/2006/math" xmlns:v="urn:schemas-microsoft-com:vml" xmlns:wp14="http://schemas.microsoft.com/office/word/2010/wordprocessingDrawing" xmlns:wp="http://schemas.openxmlformats.org/drawingml/2006/wordprocessingDrawing" xmlns:w10="urn:schemas-microsoft-com:office:word" xmlns:w="http://schemas.openxmlformats.org/wordprocessingml/2006/main" xmlns:w14="http://schemas.microsoft.com/office/word/2010/wordml" xmlns:w15="http://schemas.microsoft.com/office/word/2012/wordml" xmlns:w16se="http://schemas.microsoft.com/office/word/2015/wordml/symex" xmlns:wpg="http://schemas.microsoft.com/office/word/2010/wordprocessingGroup" xmlns:wpi="http://schemas.microsoft.com/office/word/2010/wordprocessingInk" xmlns:wne="http://schemas.microsoft.com/office/word/2006/wordml" xmlns:wps="http://schemas.microsoft.com/office/word/2010/wordprocessingShape" mc:Ignorable="w14 w15 w16se wp14">
   <w:abstractNum w:abstractNumId="0" w15:restartNumberingAfterBreak="0">
     <w:nsid w:val="0250685B"/>
     <w:multiLevelType w:val="hybridMultilevel"/>
@@ -6610,89 +7843,89 @@
       </w:pPr>
     </w:lvl>
   </w:abstractNum>
-  <w:num w:numId="1" w16cid:durableId="166333378">
+  <w:num w:numId="1">
     <w:abstractNumId w:val="17"/>
   </w:num>
-  <w:num w:numId="2" w16cid:durableId="810288614">
+  <w:num w:numId="2">
     <w:abstractNumId w:val="13"/>
   </w:num>
-  <w:num w:numId="3" w16cid:durableId="1358583825">
+  <w:num w:numId="3">
     <w:abstractNumId w:val="12"/>
   </w:num>
-  <w:num w:numId="4" w16cid:durableId="1344282468">
+  <w:num w:numId="4">
     <w:abstractNumId w:val="15"/>
   </w:num>
-  <w:num w:numId="5" w16cid:durableId="1023628645">
+  <w:num w:numId="5">
     <w:abstractNumId w:val="23"/>
   </w:num>
-  <w:num w:numId="6" w16cid:durableId="294724932">
+  <w:num w:numId="6">
     <w:abstractNumId w:val="3"/>
   </w:num>
-  <w:num w:numId="7" w16cid:durableId="1838837549">
+  <w:num w:numId="7">
     <w:abstractNumId w:val="16"/>
   </w:num>
-  <w:num w:numId="8" w16cid:durableId="345904687">
+  <w:num w:numId="8">
     <w:abstractNumId w:val="11"/>
   </w:num>
-  <w:num w:numId="9" w16cid:durableId="923880632">
+  <w:num w:numId="9">
     <w:abstractNumId w:val="5"/>
   </w:num>
-  <w:num w:numId="10" w16cid:durableId="638803918">
+  <w:num w:numId="10">
     <w:abstractNumId w:val="0"/>
   </w:num>
-  <w:num w:numId="11" w16cid:durableId="1446382849">
+  <w:num w:numId="11">
     <w:abstractNumId w:val="25"/>
   </w:num>
-  <w:num w:numId="12" w16cid:durableId="528103158">
+  <w:num w:numId="12">
     <w:abstractNumId w:val="8"/>
   </w:num>
-  <w:num w:numId="13" w16cid:durableId="1538618495">
+  <w:num w:numId="13">
     <w:abstractNumId w:val="20"/>
   </w:num>
-  <w:num w:numId="14" w16cid:durableId="1828210444">
+  <w:num w:numId="14">
     <w:abstractNumId w:val="19"/>
   </w:num>
-  <w:num w:numId="15" w16cid:durableId="1032269308">
+  <w:num w:numId="15">
     <w:abstractNumId w:val="14"/>
   </w:num>
-  <w:num w:numId="16" w16cid:durableId="610551873">
+  <w:num w:numId="16">
     <w:abstractNumId w:val="6"/>
   </w:num>
-  <w:num w:numId="17" w16cid:durableId="939920547">
+  <w:num w:numId="17">
     <w:abstractNumId w:val="2"/>
   </w:num>
-  <w:num w:numId="18" w16cid:durableId="1158304207">
+  <w:num w:numId="18">
     <w:abstractNumId w:val="21"/>
   </w:num>
-  <w:num w:numId="19" w16cid:durableId="695229674">
+  <w:num w:numId="19">
     <w:abstractNumId w:val="22"/>
   </w:num>
-  <w:num w:numId="20" w16cid:durableId="540746346">
+  <w:num w:numId="20">
     <w:abstractNumId w:val="7"/>
   </w:num>
-  <w:num w:numId="21" w16cid:durableId="908730589">
+  <w:num w:numId="21">
     <w:abstractNumId w:val="10"/>
   </w:num>
-  <w:num w:numId="22" w16cid:durableId="1122455542">
+  <w:num w:numId="22">
     <w:abstractNumId w:val="18"/>
   </w:num>
-  <w:num w:numId="23" w16cid:durableId="1903635349">
+  <w:num w:numId="23">
     <w:abstractNumId w:val="1"/>
   </w:num>
-  <w:num w:numId="24" w16cid:durableId="1986396974">
+  <w:num w:numId="24">
     <w:abstractNumId w:val="24"/>
   </w:num>
-  <w:num w:numId="25" w16cid:durableId="1810904457">
+  <w:num w:numId="25">
     <w:abstractNumId w:val="9"/>
   </w:num>
-  <w:num w:numId="26" w16cid:durableId="656224759">
+  <w:num w:numId="26">
     <w:abstractNumId w:val="4"/>
   </w:num>
 </w:numbering>
 </file>
 
 <file path=word/styles.xml><?xml version="1.0" encoding="utf-8"?>
-<w:styles xmlns:mc="http://schemas.openxmlformats.org/markup-compatibility/2006" xmlns:r="http://schemas.openxmlformats.org/officeDocument/2006/relationships" xmlns:w="http://schemas.openxmlformats.org/wordprocessingml/2006/main" xmlns:w14="http://schemas.microsoft.com/office/word/2010/wordml" xmlns:w15="http://schemas.microsoft.com/office/word/2012/wordml" xmlns:w16cex="http://schemas.microsoft.com/office/word/2018/wordml/cex" xmlns:w16cid="http://schemas.microsoft.com/office/word/2016/wordml/cid" xmlns:w16="http://schemas.microsoft.com/office/word/2018/wordml" xmlns:w16du="http://schemas.microsoft.com/office/word/2023/wordml/word16du" xmlns:w16sdtdh="http://schemas.microsoft.com/office/word/2020/wordml/sdtdatahash" xmlns:w16sdtfl="http://schemas.microsoft.com/office/word/2024/wordml/sdtformatlock" xmlns:w16se="http://schemas.microsoft.com/office/word/2015/wordml/symex" mc:Ignorable="w14 w15 w16se w16cid w16 w16cex w16sdtdh w16sdtfl w16du">
+<w:styles xmlns:mc="http://schemas.openxmlformats.org/markup-compatibility/2006" xmlns:r="http://schemas.openxmlformats.org/officeDocument/2006/relationships" xmlns:w="http://schemas.openxmlformats.org/wordprocessingml/2006/main" xmlns:w14="http://schemas.microsoft.com/office/word/2010/wordml" xmlns:w15="http://schemas.microsoft.com/office/word/2012/wordml" xmlns:w16se="http://schemas.microsoft.com/office/word/2015/wordml/symex" mc:Ignorable="w14 w15 w16se">
   <w:docDefaults>
     <w:rPrDefault>
       <w:rPr>
@@ -6708,7 +7941,7 @@
       </w:pPr>
     </w:pPrDefault>
   </w:docDefaults>
-  <w:latentStyles w:defLockedState="0" w:defUIPriority="99" w:defSemiHidden="0" w:defUnhideWhenUsed="0" w:defQFormat="0" w:count="376">
+  <w:latentStyles w:defLockedState="0" w:defUIPriority="99" w:defSemiHidden="0" w:defUnhideWhenUsed="0" w:defQFormat="0" w:count="371">
     <w:lsdException w:name="Normal" w:uiPriority="0" w:qFormat="1"/>
     <w:lsdException w:name="heading 1" w:uiPriority="9" w:qFormat="1"/>
     <w:lsdException w:name="heading 2" w:semiHidden="1" w:uiPriority="9" w:unhideWhenUsed="1" w:qFormat="1"/>
@@ -7080,11 +8313,6 @@
     <w:lsdException w:name="List Table 5 Dark Accent 6" w:uiPriority="50"/>
     <w:lsdException w:name="List Table 6 Colorful Accent 6" w:uiPriority="51"/>
     <w:lsdException w:name="List Table 7 Colorful Accent 6" w:uiPriority="52"/>
-    <w:lsdException w:name="Mention" w:semiHidden="1" w:unhideWhenUsed="1"/>
-    <w:lsdException w:name="Smart Hyperlink" w:semiHidden="1" w:unhideWhenUsed="1"/>
-    <w:lsdException w:name="Hashtag" w:semiHidden="1" w:unhideWhenUsed="1"/>
-    <w:lsdException w:name="Unresolved Mention" w:semiHidden="1" w:unhideWhenUsed="1"/>
-    <w:lsdException w:name="Smart Link" w:semiHidden="1" w:unhideWhenUsed="1"/>
   </w:latentStyles>
   <w:style w:type="paragraph" w:default="1" w:styleId="Normal">
     <w:name w:val="Normal"/>
@@ -7168,6 +8396,7 @@
   <w:style w:type="character" w:default="1" w:styleId="Fuentedeprrafopredeter">
     <w:name w:val="Default Paragraph Font"/>
     <w:uiPriority w:val="1"/>
+    <w:semiHidden/>
     <w:unhideWhenUsed/>
   </w:style>
   <w:style w:type="table" w:default="1" w:styleId="Tablanormal">
@@ -7414,7 +8643,7 @@
       <w:contextualSpacing/>
     </w:pPr>
   </w:style>
-  <w:style w:type="character" w:styleId="Fuerte">
+  <w:style w:type="character" w:styleId="Textoennegrita">
     <w:name w:val="Strong"/>
     <w:basedOn w:val="Fuentedeprrafopredeter"/>
     <w:uiPriority w:val="22"/>
@@ -7482,6 +8711,568 @@
     <w:rsid w:val="009354B0"/>
   </w:style>
 </w:styles>
+</file>
+
+<file path=word/glossary/document.xml><?xml version="1.0" encoding="utf-8"?>
+<w:glossaryDocument xmlns:wpc="http://schemas.microsoft.com/office/word/2010/wordprocessingCanvas" xmlns:cx="http://schemas.microsoft.com/office/drawing/2014/chartex" xmlns:mc="http://schemas.openxmlformats.org/markup-compatibility/2006" xmlns:o="urn:schemas-microsoft-com:office:office" xmlns:r="http://schemas.openxmlformats.org/officeDocument/2006/relationships" xmlns:m="http://schemas.openxmlformats.org/officeDocument/2006/math" xmlns:v="urn:schemas-microsoft-com:vml" xmlns:wp14="http://schemas.microsoft.com/office/word/2010/wordprocessingDrawing" xmlns:wp="http://schemas.openxmlformats.org/drawingml/2006/wordprocessingDrawing" xmlns:w10="urn:schemas-microsoft-com:office:word" xmlns:w="http://schemas.openxmlformats.org/wordprocessingml/2006/main" xmlns:w14="http://schemas.microsoft.com/office/word/2010/wordml" xmlns:w15="http://schemas.microsoft.com/office/word/2012/wordml" xmlns:w16se="http://schemas.microsoft.com/office/word/2015/wordml/symex" xmlns:wpg="http://schemas.microsoft.com/office/word/2010/wordprocessingGroup" xmlns:wpi="http://schemas.microsoft.com/office/word/2010/wordprocessingInk" xmlns:wne="http://schemas.microsoft.com/office/word/2006/wordml" xmlns:wps="http://schemas.microsoft.com/office/word/2010/wordprocessingShape" mc:Ignorable="w14 w15 w16se wp14"/>
+</file>
+
+<file path=word/glossary/fontTable.xml><?xml version="1.0" encoding="utf-8"?>
+<w:fonts xmlns:mc="http://schemas.openxmlformats.org/markup-compatibility/2006" xmlns:r="http://schemas.openxmlformats.org/officeDocument/2006/relationships" xmlns:w="http://schemas.openxmlformats.org/wordprocessingml/2006/main" xmlns:w14="http://schemas.microsoft.com/office/word/2010/wordml" xmlns:w15="http://schemas.microsoft.com/office/word/2012/wordml" xmlns:w16se="http://schemas.microsoft.com/office/word/2015/wordml/symex" mc:Ignorable="w14 w15 w16se">
+  <w:font w:name="Courier New">
+    <w:panose1 w:val="02070309020205020404"/>
+    <w:charset w:val="00"/>
+    <w:family w:val="modern"/>
+    <w:pitch w:val="fixed"/>
+    <w:sig w:usb0="E0002EFF" w:usb1="C0007843" w:usb2="00000009" w:usb3="00000000" w:csb0="000001FF" w:csb1="00000000"/>
+  </w:font>
+  <w:font w:name="Times New Roman">
+    <w:panose1 w:val="02020603050405020304"/>
+    <w:charset w:val="00"/>
+    <w:family w:val="roman"/>
+    <w:pitch w:val="variable"/>
+    <w:sig w:usb0="E0002EFF" w:usb1="C000785B" w:usb2="00000009" w:usb3="00000000" w:csb0="000001FF" w:csb1="00000000"/>
+  </w:font>
+  <w:font w:name="Wingdings">
+    <w:panose1 w:val="05000000000000000000"/>
+    <w:charset w:val="02"/>
+    <w:family w:val="auto"/>
+    <w:pitch w:val="variable"/>
+    <w:sig w:usb0="00000000" w:usb1="10000000" w:usb2="00000000" w:usb3="00000000" w:csb0="80000000" w:csb1="00000000"/>
+  </w:font>
+  <w:font w:name="Symbol">
+    <w:panose1 w:val="05050102010706020507"/>
+    <w:charset w:val="02"/>
+    <w:family w:val="roman"/>
+    <w:pitch w:val="variable"/>
+    <w:sig w:usb0="00000000" w:usb1="10000000" w:usb2="00000000" w:usb3="00000000" w:csb0="80000000" w:csb1="00000000"/>
+  </w:font>
+  <w:font w:name="Calibri">
+    <w:panose1 w:val="020F0502020204030204"/>
+    <w:charset w:val="00"/>
+    <w:family w:val="swiss"/>
+    <w:pitch w:val="variable"/>
+    <w:sig w:usb0="E4002EFF" w:usb1="C000247B" w:usb2="00000009" w:usb3="00000000" w:csb0="000001FF" w:csb1="00000000"/>
+  </w:font>
+  <w:font w:name="Garamond">
+    <w:panose1 w:val="02020404030301010803"/>
+    <w:charset w:val="00"/>
+    <w:family w:val="roman"/>
+    <w:pitch w:val="variable"/>
+    <w:sig w:usb0="00000287" w:usb1="00000000" w:usb2="00000000" w:usb3="00000000" w:csb0="0000009F" w:csb1="00000000"/>
+  </w:font>
+  <w:font w:name="Calibri Light">
+    <w:panose1 w:val="020F0302020204030204"/>
+    <w:charset w:val="00"/>
+    <w:family w:val="swiss"/>
+    <w:pitch w:val="variable"/>
+    <w:sig w:usb0="E4002EFF" w:usb1="C000247B" w:usb2="00000009" w:usb3="00000000" w:csb0="000001FF" w:csb1="00000000"/>
+  </w:font>
+  <w:font w:name="Segoe UI">
+    <w:panose1 w:val="020B0502040204020203"/>
+    <w:charset w:val="00"/>
+    <w:family w:val="swiss"/>
+    <w:pitch w:val="variable"/>
+    <w:sig w:usb0="E4002EFF" w:usb1="C000E47F" w:usb2="00000009" w:usb3="00000000" w:csb0="000001FF" w:csb1="00000000"/>
+  </w:font>
+  <w:font w:name="CMBX12">
+    <w:altName w:val="MS Gothic"/>
+    <w:panose1 w:val="00000000000000000000"/>
+    <w:charset w:val="80"/>
+    <w:family w:val="auto"/>
+    <w:notTrueType/>
+    <w:pitch w:val="default"/>
+    <w:sig w:usb0="00000001" w:usb1="08070000" w:usb2="00000010" w:usb3="00000000" w:csb0="00020000" w:csb1="00000000"/>
+  </w:font>
+  <w:font w:name="Cambria Math">
+    <w:panose1 w:val="02040503050406030204"/>
+    <w:charset w:val="00"/>
+    <w:family w:val="roman"/>
+    <w:pitch w:val="variable"/>
+    <w:sig w:usb0="E00006FF" w:usb1="420024FF" w:usb2="02000000" w:usb3="00000000" w:csb0="0000019F" w:csb1="00000000"/>
+  </w:font>
+</w:fonts>
+</file>
+
+<file path=word/glossary/settings.xml><?xml version="1.0" encoding="utf-8"?>
+<w:settings xmlns:mc="http://schemas.openxmlformats.org/markup-compatibility/2006" xmlns:o="urn:schemas-microsoft-com:office:office" xmlns:r="http://schemas.openxmlformats.org/officeDocument/2006/relationships" xmlns:m="http://schemas.openxmlformats.org/officeDocument/2006/math" xmlns:v="urn:schemas-microsoft-com:vml" xmlns:w10="urn:schemas-microsoft-com:office:word" xmlns:w="http://schemas.openxmlformats.org/wordprocessingml/2006/main" xmlns:w14="http://schemas.microsoft.com/office/word/2010/wordml" xmlns:w15="http://schemas.microsoft.com/office/word/2012/wordml" xmlns:w16se="http://schemas.microsoft.com/office/word/2015/wordml/symex" xmlns:sl="http://schemas.openxmlformats.org/schemaLibrary/2006/main" mc:Ignorable="w14 w15 w16se">
+  <w:view w:val="normal"/>
+  <w:defaultTabStop w:val="708"/>
+  <w:hyphenationZone w:val="425"/>
+  <w:characterSpacingControl w:val="doNotCompress"/>
+  <w:compat>
+    <w:useFELayout/>
+    <w:compatSetting w:name="compatibilityMode" w:uri="http://schemas.microsoft.com/office/word" w:val="15"/>
+    <w:compatSetting w:name="overrideTableStyleFontSizeAndJustification" w:uri="http://schemas.microsoft.com/office/word" w:val="1"/>
+    <w:compatSetting w:name="enableOpenTypeFeatures" w:uri="http://schemas.microsoft.com/office/word" w:val="1"/>
+    <w:compatSetting w:name="doNotFlipMirrorIndents" w:uri="http://schemas.microsoft.com/office/word" w:val="1"/>
+    <w:compatSetting w:name="differentiateMultirowTableHeaders" w:uri="http://schemas.microsoft.com/office/word" w:val="1"/>
+  </w:compat>
+  <w:rsids>
+    <w:rsidRoot w:val="00842F57"/>
+    <w:rsid w:val="004F39FA"/>
+    <w:rsid w:val="00842F57"/>
+  </w:rsids>
+  <m:mathPr>
+    <m:mathFont m:val="Cambria Math"/>
+    <m:brkBin m:val="before"/>
+    <m:brkBinSub m:val="--"/>
+    <m:smallFrac m:val="0"/>
+    <m:dispDef/>
+    <m:lMargin m:val="0"/>
+    <m:rMargin m:val="0"/>
+    <m:defJc m:val="centerGroup"/>
+    <m:wrapIndent m:val="1440"/>
+    <m:intLim m:val="subSup"/>
+    <m:naryLim m:val="undOvr"/>
+  </m:mathPr>
+  <w:themeFontLang w:val="es-AR"/>
+  <w:clrSchemeMapping w:bg1="light1" w:t1="dark1" w:bg2="light2" w:t2="dark2" w:accent1="accent1" w:accent2="accent2" w:accent3="accent3" w:accent4="accent4" w:accent5="accent5" w:accent6="accent6" w:hyperlink="hyperlink" w:followedHyperlink="followedHyperlink"/>
+  <w:decimalSymbol w:val=","/>
+  <w:listSeparator w:val=";"/>
+  <w15:chartTrackingRefBased/>
+</w:settings>
+</file>
+
+<file path=word/glossary/styles.xml><?xml version="1.0" encoding="utf-8"?>
+<w:styles xmlns:mc="http://schemas.openxmlformats.org/markup-compatibility/2006" xmlns:r="http://schemas.openxmlformats.org/officeDocument/2006/relationships" xmlns:w="http://schemas.openxmlformats.org/wordprocessingml/2006/main" xmlns:w14="http://schemas.microsoft.com/office/word/2010/wordml" xmlns:w15="http://schemas.microsoft.com/office/word/2012/wordml" xmlns:w16se="http://schemas.microsoft.com/office/word/2015/wordml/symex" mc:Ignorable="w14 w15 w16se">
+  <w:docDefaults>
+    <w:rPrDefault>
+      <w:rPr>
+        <w:rFonts w:asciiTheme="minorHAnsi" w:eastAsiaTheme="minorEastAsia" w:hAnsiTheme="minorHAnsi" w:cstheme="minorBidi"/>
+        <w:sz w:val="22"/>
+        <w:szCs w:val="22"/>
+        <w:lang w:val="es-AR" w:eastAsia="es-AR" w:bidi="ar-SA"/>
+      </w:rPr>
+    </w:rPrDefault>
+    <w:pPrDefault>
+      <w:pPr>
+        <w:spacing w:after="160" w:line="259" w:lineRule="auto"/>
+      </w:pPr>
+    </w:pPrDefault>
+  </w:docDefaults>
+  <w:latentStyles w:defLockedState="0" w:defUIPriority="99" w:defSemiHidden="0" w:defUnhideWhenUsed="0" w:defQFormat="0" w:count="371">
+    <w:lsdException w:name="Normal" w:uiPriority="0" w:qFormat="1"/>
+    <w:lsdException w:name="heading 1" w:uiPriority="9" w:qFormat="1"/>
+    <w:lsdException w:name="heading 2" w:semiHidden="1" w:uiPriority="9" w:unhideWhenUsed="1" w:qFormat="1"/>
+    <w:lsdException w:name="heading 3" w:semiHidden="1" w:uiPriority="9" w:unhideWhenUsed="1" w:qFormat="1"/>
+    <w:lsdException w:name="heading 4" w:semiHidden="1" w:uiPriority="9" w:unhideWhenUsed="1" w:qFormat="1"/>
+    <w:lsdException w:name="heading 5" w:semiHidden="1" w:uiPriority="9" w:unhideWhenUsed="1" w:qFormat="1"/>
+    <w:lsdException w:name="heading 6" w:semiHidden="1" w:uiPriority="9" w:unhideWhenUsed="1" w:qFormat="1"/>
+    <w:lsdException w:name="heading 7" w:semiHidden="1" w:uiPriority="9" w:unhideWhenUsed="1" w:qFormat="1"/>
+    <w:lsdException w:name="heading 8" w:semiHidden="1" w:uiPriority="9" w:unhideWhenUsed="1" w:qFormat="1"/>
+    <w:lsdException w:name="heading 9" w:semiHidden="1" w:uiPriority="9" w:unhideWhenUsed="1" w:qFormat="1"/>
+    <w:lsdException w:name="index 1" w:semiHidden="1" w:unhideWhenUsed="1"/>
+    <w:lsdException w:name="index 2" w:semiHidden="1" w:unhideWhenUsed="1"/>
+    <w:lsdException w:name="index 3" w:semiHidden="1" w:unhideWhenUsed="1"/>
+    <w:lsdException w:name="index 4" w:semiHidden="1" w:unhideWhenUsed="1"/>
+    <w:lsdException w:name="index 5" w:semiHidden="1" w:unhideWhenUsed="1"/>
+    <w:lsdException w:name="index 6" w:semiHidden="1" w:unhideWhenUsed="1"/>
+    <w:lsdException w:name="index 7" w:semiHidden="1" w:unhideWhenUsed="1"/>
+    <w:lsdException w:name="index 8" w:semiHidden="1" w:unhideWhenUsed="1"/>
+    <w:lsdException w:name="index 9" w:semiHidden="1" w:unhideWhenUsed="1"/>
+    <w:lsdException w:name="toc 1" w:semiHidden="1" w:uiPriority="39" w:unhideWhenUsed="1"/>
+    <w:lsdException w:name="toc 2" w:semiHidden="1" w:uiPriority="39" w:unhideWhenUsed="1"/>
+    <w:lsdException w:name="toc 3" w:semiHidden="1" w:uiPriority="39" w:unhideWhenUsed="1"/>
+    <w:lsdException w:name="toc 4" w:semiHidden="1" w:uiPriority="39" w:unhideWhenUsed="1"/>
+    <w:lsdException w:name="toc 5" w:semiHidden="1" w:uiPriority="39" w:unhideWhenUsed="1"/>
+    <w:lsdException w:name="toc 6" w:semiHidden="1" w:uiPriority="39" w:unhideWhenUsed="1"/>
+    <w:lsdException w:name="toc 7" w:semiHidden="1" w:uiPriority="39" w:unhideWhenUsed="1"/>
+    <w:lsdException w:name="toc 8" w:semiHidden="1" w:uiPriority="39" w:unhideWhenUsed="1"/>
+    <w:lsdException w:name="toc 9" w:semiHidden="1" w:uiPriority="39" w:unhideWhenUsed="1"/>
+    <w:lsdException w:name="Normal Indent" w:semiHidden="1" w:unhideWhenUsed="1"/>
+    <w:lsdException w:name="footnote text" w:semiHidden="1" w:unhideWhenUsed="1"/>
+    <w:lsdException w:name="annotation text" w:semiHidden="1" w:unhideWhenUsed="1"/>
+    <w:lsdException w:name="header" w:semiHidden="1" w:unhideWhenUsed="1"/>
+    <w:lsdException w:name="footer" w:semiHidden="1" w:unhideWhenUsed="1"/>
+    <w:lsdException w:name="index heading" w:semiHidden="1" w:unhideWhenUsed="1"/>
+    <w:lsdException w:name="caption" w:semiHidden="1" w:uiPriority="35" w:unhideWhenUsed="1" w:qFormat="1"/>
+    <w:lsdException w:name="table of figures" w:semiHidden="1" w:unhideWhenUsed="1"/>
+    <w:lsdException w:name="envelope address" w:semiHidden="1" w:unhideWhenUsed="1"/>
+    <w:lsdException w:name="envelope return" w:semiHidden="1" w:unhideWhenUsed="1"/>
+    <w:lsdException w:name="footnote reference" w:semiHidden="1" w:unhideWhenUsed="1"/>
+    <w:lsdException w:name="annotation reference" w:semiHidden="1" w:unhideWhenUsed="1"/>
+    <w:lsdException w:name="line number" w:semiHidden="1" w:unhideWhenUsed="1"/>
+    <w:lsdException w:name="page number" w:semiHidden="1" w:unhideWhenUsed="1"/>
+    <w:lsdException w:name="endnote reference" w:semiHidden="1" w:unhideWhenUsed="1"/>
+    <w:lsdException w:name="endnote text" w:semiHidden="1" w:unhideWhenUsed="1"/>
+    <w:lsdException w:name="table of authorities" w:semiHidden="1" w:unhideWhenUsed="1"/>
+    <w:lsdException w:name="macro" w:semiHidden="1" w:unhideWhenUsed="1"/>
+    <w:lsdException w:name="toa heading" w:semiHidden="1" w:unhideWhenUsed="1"/>
+    <w:lsdException w:name="List" w:semiHidden="1" w:unhideWhenUsed="1"/>
+    <w:lsdException w:name="List Bullet" w:semiHidden="1" w:unhideWhenUsed="1"/>
+    <w:lsdException w:name="List Number" w:semiHidden="1" w:unhideWhenUsed="1"/>
+    <w:lsdException w:name="List 2" w:semiHidden="1" w:unhideWhenUsed="1"/>
+    <w:lsdException w:name="List 3" w:semiHidden="1" w:unhideWhenUsed="1"/>
+    <w:lsdException w:name="List 4" w:semiHidden="1" w:unhideWhenUsed="1"/>
+    <w:lsdException w:name="List 5" w:semiHidden="1" w:unhideWhenUsed="1"/>
+    <w:lsdException w:name="List Bullet 2" w:semiHidden="1" w:unhideWhenUsed="1"/>
+    <w:lsdException w:name="List Bullet 3" w:semiHidden="1" w:unhideWhenUsed="1"/>
+    <w:lsdException w:name="List Bullet 4" w:semiHidden="1" w:unhideWhenUsed="1"/>
+    <w:lsdException w:name="List Bullet 5" w:semiHidden="1" w:unhideWhenUsed="1"/>
+    <w:lsdException w:name="List Number 2" w:semiHidden="1" w:unhideWhenUsed="1"/>
+    <w:lsdException w:name="List Number 3" w:semiHidden="1" w:unhideWhenUsed="1"/>
+    <w:lsdException w:name="List Number 4" w:semiHidden="1" w:unhideWhenUsed="1"/>
+    <w:lsdException w:name="List Number 5" w:semiHidden="1" w:unhideWhenUsed="1"/>
+    <w:lsdException w:name="Title" w:uiPriority="10" w:qFormat="1"/>
+    <w:lsdException w:name="Closing" w:semiHidden="1" w:unhideWhenUsed="1"/>
+    <w:lsdException w:name="Signature" w:semiHidden="1" w:unhideWhenUsed="1"/>
+    <w:lsdException w:name="Default Paragraph Font" w:semiHidden="1" w:uiPriority="1" w:unhideWhenUsed="1"/>
+    <w:lsdException w:name="Body Text" w:semiHidden="1" w:unhideWhenUsed="1"/>
+    <w:lsdException w:name="Body Text Indent" w:semiHidden="1" w:unhideWhenUsed="1"/>
+    <w:lsdException w:name="List Continue" w:semiHidden="1" w:unhideWhenUsed="1"/>
+    <w:lsdException w:name="List Continue 2" w:semiHidden="1" w:unhideWhenUsed="1"/>
+    <w:lsdException w:name="List Continue 3" w:semiHidden="1" w:unhideWhenUsed="1"/>
+    <w:lsdException w:name="List Continue 4" w:semiHidden="1" w:unhideWhenUsed="1"/>
+    <w:lsdException w:name="List Continue 5" w:semiHidden="1" w:unhideWhenUsed="1"/>
+    <w:lsdException w:name="Message Header" w:semiHidden="1" w:unhideWhenUsed="1"/>
+    <w:lsdException w:name="Subtitle" w:uiPriority="11" w:qFormat="1"/>
+    <w:lsdException w:name="Salutation" w:semiHidden="1" w:unhideWhenUsed="1"/>
+    <w:lsdException w:name="Date" w:semiHidden="1" w:unhideWhenUsed="1"/>
+    <w:lsdException w:name="Body Text First Indent" w:semiHidden="1" w:unhideWhenUsed="1"/>
+    <w:lsdException w:name="Body Text First Indent 2" w:semiHidden="1" w:unhideWhenUsed="1"/>
+    <w:lsdException w:name="Note Heading" w:semiHidden="1" w:unhideWhenUsed="1"/>
+    <w:lsdException w:name="Body Text 2" w:semiHidden="1" w:unhideWhenUsed="1"/>
+    <w:lsdException w:name="Body Text 3" w:semiHidden="1" w:unhideWhenUsed="1"/>
+    <w:lsdException w:name="Body Text Indent 2" w:semiHidden="1" w:unhideWhenUsed="1"/>
+    <w:lsdException w:name="Body Text Indent 3" w:semiHidden="1" w:unhideWhenUsed="1"/>
+    <w:lsdException w:name="Block Text" w:semiHidden="1" w:unhideWhenUsed="1"/>
+    <w:lsdException w:name="Hyperlink" w:semiHidden="1" w:unhideWhenUsed="1"/>
+    <w:lsdException w:name="FollowedHyperlink" w:semiHidden="1" w:unhideWhenUsed="1"/>
+    <w:lsdException w:name="Strong" w:uiPriority="22" w:qFormat="1"/>
+    <w:lsdException w:name="Emphasis" w:uiPriority="20" w:qFormat="1"/>
+    <w:lsdException w:name="Document Map" w:semiHidden="1" w:unhideWhenUsed="1"/>
+    <w:lsdException w:name="Plain Text" w:semiHidden="1" w:unhideWhenUsed="1"/>
+    <w:lsdException w:name="E-mail Signature" w:semiHidden="1" w:unhideWhenUsed="1"/>
+    <w:lsdException w:name="HTML Top of Form" w:semiHidden="1" w:unhideWhenUsed="1"/>
+    <w:lsdException w:name="HTML Bottom of Form" w:semiHidden="1" w:unhideWhenUsed="1"/>
+    <w:lsdException w:name="Normal (Web)" w:semiHidden="1" w:unhideWhenUsed="1"/>
+    <w:lsdException w:name="HTML Acronym" w:semiHidden="1" w:unhideWhenUsed="1"/>
+    <w:lsdException w:name="HTML Address" w:semiHidden="1" w:unhideWhenUsed="1"/>
+    <w:lsdException w:name="HTML Cite" w:semiHidden="1" w:unhideWhenUsed="1"/>
+    <w:lsdException w:name="HTML Code" w:semiHidden="1" w:unhideWhenUsed="1"/>
+    <w:lsdException w:name="HTML Definition" w:semiHidden="1" w:unhideWhenUsed="1"/>
+    <w:lsdException w:name="HTML Keyboard" w:semiHidden="1" w:unhideWhenUsed="1"/>
+    <w:lsdException w:name="HTML Preformatted" w:semiHidden="1" w:unhideWhenUsed="1"/>
+    <w:lsdException w:name="HTML Sample" w:semiHidden="1" w:unhideWhenUsed="1"/>
+    <w:lsdException w:name="HTML Typewriter" w:semiHidden="1" w:unhideWhenUsed="1"/>
+    <w:lsdException w:name="HTML Variable" w:semiHidden="1" w:unhideWhenUsed="1"/>
+    <w:lsdException w:name="Normal Table" w:semiHidden="1" w:unhideWhenUsed="1"/>
+    <w:lsdException w:name="annotation subject" w:semiHidden="1" w:unhideWhenUsed="1"/>
+    <w:lsdException w:name="No List" w:semiHidden="1" w:unhideWhenUsed="1"/>
+    <w:lsdException w:name="Outline List 1" w:semiHidden="1" w:unhideWhenUsed="1"/>
+    <w:lsdException w:name="Outline List 2" w:semiHidden="1" w:unhideWhenUsed="1"/>
+    <w:lsdException w:name="Outline List 3" w:semiHidden="1" w:unhideWhenUsed="1"/>
+    <w:lsdException w:name="Table Simple 1" w:semiHidden="1" w:unhideWhenUsed="1"/>
+    <w:lsdException w:name="Table Simple 2" w:semiHidden="1" w:unhideWhenUsed="1"/>
+    <w:lsdException w:name="Table Simple 3" w:semiHidden="1" w:unhideWhenUsed="1"/>
+    <w:lsdException w:name="Table Classic 1" w:semiHidden="1" w:unhideWhenUsed="1"/>
+    <w:lsdException w:name="Table Classic 2" w:semiHidden="1" w:unhideWhenUsed="1"/>
+    <w:lsdException w:name="Table Classic 3" w:semiHidden="1" w:unhideWhenUsed="1"/>
+    <w:lsdException w:name="Table Classic 4" w:semiHidden="1" w:unhideWhenUsed="1"/>
+    <w:lsdException w:name="Table Colorful 1" w:semiHidden="1" w:unhideWhenUsed="1"/>
+    <w:lsdException w:name="Table Colorful 2" w:semiHidden="1" w:unhideWhenUsed="1"/>
+    <w:lsdException w:name="Table Colorful 3" w:semiHidden="1" w:unhideWhenUsed="1"/>
+    <w:lsdException w:name="Table Columns 1" w:semiHidden="1" w:unhideWhenUsed="1"/>
+    <w:lsdException w:name="Table Columns 2" w:semiHidden="1" w:unhideWhenUsed="1"/>
+    <w:lsdException w:name="Table Columns 3" w:semiHidden="1" w:unhideWhenUsed="1"/>
+    <w:lsdException w:name="Table Columns 4" w:semiHidden="1" w:unhideWhenUsed="1"/>
+    <w:lsdException w:name="Table Columns 5" w:semiHidden="1" w:unhideWhenUsed="1"/>
+    <w:lsdException w:name="Table Grid 1" w:semiHidden="1" w:unhideWhenUsed="1"/>
+    <w:lsdException w:name="Table Grid 2" w:semiHidden="1" w:unhideWhenUsed="1"/>
+    <w:lsdException w:name="Table Grid 3" w:semiHidden="1" w:unhideWhenUsed="1"/>
+    <w:lsdException w:name="Table Grid 4" w:semiHidden="1" w:unhideWhenUsed="1"/>
+    <w:lsdException w:name="Table Grid 5" w:semiHidden="1" w:unhideWhenUsed="1"/>
+    <w:lsdException w:name="Table Grid 6" w:semiHidden="1" w:unhideWhenUsed="1"/>
+    <w:lsdException w:name="Table Grid 7" w:semiHidden="1" w:unhideWhenUsed="1"/>
+    <w:lsdException w:name="Table Grid 8" w:semiHidden="1" w:unhideWhenUsed="1"/>
+    <w:lsdException w:name="Table List 1" w:semiHidden="1" w:unhideWhenUsed="1"/>
+    <w:lsdException w:name="Table List 2" w:semiHidden="1" w:unhideWhenUsed="1"/>
+    <w:lsdException w:name="Table List 3" w:semiHidden="1" w:unhideWhenUsed="1"/>
+    <w:lsdException w:name="Table List 4" w:semiHidden="1" w:unhideWhenUsed="1"/>
+    <w:lsdException w:name="Table List 5" w:semiHidden="1" w:unhideWhenUsed="1"/>
+    <w:lsdException w:name="Table List 6" w:semiHidden="1" w:unhideWhenUsed="1"/>
+    <w:lsdException w:name="Table List 7" w:semiHidden="1" w:unhideWhenUsed="1"/>
+    <w:lsdException w:name="Table List 8" w:semiHidden="1" w:unhideWhenUsed="1"/>
+    <w:lsdException w:name="Table 3D effects 1" w:semiHidden="1" w:unhideWhenUsed="1"/>
+    <w:lsdException w:name="Table 3D effects 2" w:semiHidden="1" w:unhideWhenUsed="1"/>
+    <w:lsdException w:name="Table 3D effects 3" w:semiHidden="1" w:unhideWhenUsed="1"/>
+    <w:lsdException w:name="Table Contemporary" w:semiHidden="1" w:unhideWhenUsed="1"/>
+    <w:lsdException w:name="Table Elegant" w:semiHidden="1" w:unhideWhenUsed="1"/>
+    <w:lsdException w:name="Table Professional" w:semiHidden="1" w:unhideWhenUsed="1"/>
+    <w:lsdException w:name="Table Subtle 1" w:semiHidden="1" w:unhideWhenUsed="1"/>
+    <w:lsdException w:name="Table Subtle 2" w:semiHidden="1" w:unhideWhenUsed="1"/>
+    <w:lsdException w:name="Table Web 1" w:semiHidden="1" w:unhideWhenUsed="1"/>
+    <w:lsdException w:name="Table Web 2" w:semiHidden="1" w:unhideWhenUsed="1"/>
+    <w:lsdException w:name="Table Web 3" w:semiHidden="1" w:unhideWhenUsed="1"/>
+    <w:lsdException w:name="Balloon Text" w:semiHidden="1" w:unhideWhenUsed="1"/>
+    <w:lsdException w:name="Table Grid" w:uiPriority="39"/>
+    <w:lsdException w:name="Table Theme" w:semiHidden="1" w:unhideWhenUsed="1"/>
+    <w:lsdException w:name="Placeholder Text" w:semiHidden="1"/>
+    <w:lsdException w:name="No Spacing" w:uiPriority="1" w:qFormat="1"/>
+    <w:lsdException w:name="Light Shading" w:uiPriority="60"/>
+    <w:lsdException w:name="Light List" w:uiPriority="61"/>
+    <w:lsdException w:name="Light Grid" w:uiPriority="62"/>
+    <w:lsdException w:name="Medium Shading 1" w:uiPriority="63"/>
+    <w:lsdException w:name="Medium Shading 2" w:uiPriority="64"/>
+    <w:lsdException w:name="Medium List 1" w:uiPriority="65"/>
+    <w:lsdException w:name="Medium List 2" w:uiPriority="66"/>
+    <w:lsdException w:name="Medium Grid 1" w:uiPriority="67"/>
+    <w:lsdException w:name="Medium Grid 2" w:uiPriority="68"/>
+    <w:lsdException w:name="Medium Grid 3" w:uiPriority="69"/>
+    <w:lsdException w:name="Dark List" w:uiPriority="70"/>
+    <w:lsdException w:name="Colorful Shading" w:uiPriority="71"/>
+    <w:lsdException w:name="Colorful List" w:uiPriority="72"/>
+    <w:lsdException w:name="Colorful Grid" w:uiPriority="73"/>
+    <w:lsdException w:name="Light Shading Accent 1" w:uiPriority="60"/>
+    <w:lsdException w:name="Light List Accent 1" w:uiPriority="61"/>
+    <w:lsdException w:name="Light Grid Accent 1" w:uiPriority="62"/>
+    <w:lsdException w:name="Medium Shading 1 Accent 1" w:uiPriority="63"/>
+    <w:lsdException w:name="Medium Shading 2 Accent 1" w:uiPriority="64"/>
+    <w:lsdException w:name="Medium List 1 Accent 1" w:uiPriority="65"/>
+    <w:lsdException w:name="Revision" w:semiHidden="1"/>
+    <w:lsdException w:name="List Paragraph" w:uiPriority="34" w:qFormat="1"/>
+    <w:lsdException w:name="Quote" w:uiPriority="29" w:qFormat="1"/>
+    <w:lsdException w:name="Intense Quote" w:uiPriority="30" w:qFormat="1"/>
+    <w:lsdException w:name="Medium List 2 Accent 1" w:uiPriority="66"/>
+    <w:lsdException w:name="Medium Grid 1 Accent 1" w:uiPriority="67"/>
+    <w:lsdException w:name="Medium Grid 2 Accent 1" w:uiPriority="68"/>
+    <w:lsdException w:name="Medium Grid 3 Accent 1" w:uiPriority="69"/>
+    <w:lsdException w:name="Dark List Accent 1" w:uiPriority="70"/>
+    <w:lsdException w:name="Colorful Shading Accent 1" w:uiPriority="71"/>
+    <w:lsdException w:name="Colorful List Accent 1" w:uiPriority="72"/>
+    <w:lsdException w:name="Colorful Grid Accent 1" w:uiPriority="73"/>
+    <w:lsdException w:name="Light Shading Accent 2" w:uiPriority="60"/>
+    <w:lsdException w:name="Light List Accent 2" w:uiPriority="61"/>
+    <w:lsdException w:name="Light Grid Accent 2" w:uiPriority="62"/>
+    <w:lsdException w:name="Medium Shading 1 Accent 2" w:uiPriority="63"/>
+    <w:lsdException w:name="Medium Shading 2 Accent 2" w:uiPriority="64"/>
+    <w:lsdException w:name="Medium List 1 Accent 2" w:uiPriority="65"/>
+    <w:lsdException w:name="Medium List 2 Accent 2" w:uiPriority="66"/>
+    <w:lsdException w:name="Medium Grid 1 Accent 2" w:uiPriority="67"/>
+    <w:lsdException w:name="Medium Grid 2 Accent 2" w:uiPriority="68"/>
+    <w:lsdException w:name="Medium Grid 3 Accent 2" w:uiPriority="69"/>
+    <w:lsdException w:name="Dark List Accent 2" w:uiPriority="70"/>
+    <w:lsdException w:name="Colorful Shading Accent 2" w:uiPriority="71"/>
+    <w:lsdException w:name="Colorful List Accent 2" w:uiPriority="72"/>
+    <w:lsdException w:name="Colorful Grid Accent 2" w:uiPriority="73"/>
+    <w:lsdException w:name="Light Shading Accent 3" w:uiPriority="60"/>
+    <w:lsdException w:name="Light List Accent 3" w:uiPriority="61"/>
+    <w:lsdException w:name="Light Grid Accent 3" w:uiPriority="62"/>
+    <w:lsdException w:name="Medium Shading 1 Accent 3" w:uiPriority="63"/>
+    <w:lsdException w:name="Medium Shading 2 Accent 3" w:uiPriority="64"/>
+    <w:lsdException w:name="Medium List 1 Accent 3" w:uiPriority="65"/>
+    <w:lsdException w:name="Medium List 2 Accent 3" w:uiPriority="66"/>
+    <w:lsdException w:name="Medium Grid 1 Accent 3" w:uiPriority="67"/>
+    <w:lsdException w:name="Medium Grid 2 Accent 3" w:uiPriority="68"/>
+    <w:lsdException w:name="Medium Grid 3 Accent 3" w:uiPriority="69"/>
+    <w:lsdException w:name="Dark List Accent 3" w:uiPriority="70"/>
+    <w:lsdException w:name="Colorful Shading Accent 3" w:uiPriority="71"/>
+    <w:lsdException w:name="Colorful List Accent 3" w:uiPriority="72"/>
+    <w:lsdException w:name="Colorful Grid Accent 3" w:uiPriority="73"/>
+    <w:lsdException w:name="Light Shading Accent 4" w:uiPriority="60"/>
+    <w:lsdException w:name="Light List Accent 4" w:uiPriority="61"/>
+    <w:lsdException w:name="Light Grid Accent 4" w:uiPriority="62"/>
+    <w:lsdException w:name="Medium Shading 1 Accent 4" w:uiPriority="63"/>
+    <w:lsdException w:name="Medium Shading 2 Accent 4" w:uiPriority="64"/>
+    <w:lsdException w:name="Medium List 1 Accent 4" w:uiPriority="65"/>
+    <w:lsdException w:name="Medium List 2 Accent 4" w:uiPriority="66"/>
+    <w:lsdException w:name="Medium Grid 1 Accent 4" w:uiPriority="67"/>
+    <w:lsdException w:name="Medium Grid 2 Accent 4" w:uiPriority="68"/>
+    <w:lsdException w:name="Medium Grid 3 Accent 4" w:uiPriority="69"/>
+    <w:lsdException w:name="Dark List Accent 4" w:uiPriority="70"/>
+    <w:lsdException w:name="Colorful Shading Accent 4" w:uiPriority="71"/>
+    <w:lsdException w:name="Colorful List Accent 4" w:uiPriority="72"/>
+    <w:lsdException w:name="Colorful Grid Accent 4" w:uiPriority="73"/>
+    <w:lsdException w:name="Light Shading Accent 5" w:uiPriority="60"/>
+    <w:lsdException w:name="Light List Accent 5" w:uiPriority="61"/>
+    <w:lsdException w:name="Light Grid Accent 5" w:uiPriority="62"/>
+    <w:lsdException w:name="Medium Shading 1 Accent 5" w:uiPriority="63"/>
+    <w:lsdException w:name="Medium Shading 2 Accent 5" w:uiPriority="64"/>
+    <w:lsdException w:name="Medium List 1 Accent 5" w:uiPriority="65"/>
+    <w:lsdException w:name="Medium List 2 Accent 5" w:uiPriority="66"/>
+    <w:lsdException w:name="Medium Grid 1 Accent 5" w:uiPriority="67"/>
+    <w:lsdException w:name="Medium Grid 2 Accent 5" w:uiPriority="68"/>
+    <w:lsdException w:name="Medium Grid 3 Accent 5" w:uiPriority="69"/>
+    <w:lsdException w:name="Dark List Accent 5" w:uiPriority="70"/>
+    <w:lsdException w:name="Colorful Shading Accent 5" w:uiPriority="71"/>
+    <w:lsdException w:name="Colorful List Accent 5" w:uiPriority="72"/>
+    <w:lsdException w:name="Colorful Grid Accent 5" w:uiPriority="73"/>
+    <w:lsdException w:name="Light Shading Accent 6" w:uiPriority="60"/>
+    <w:lsdException w:name="Light List Accent 6" w:uiPriority="61"/>
+    <w:lsdException w:name="Light Grid Accent 6" w:uiPriority="62"/>
+    <w:lsdException w:name="Medium Shading 1 Accent 6" w:uiPriority="63"/>
+    <w:lsdException w:name="Medium Shading 2 Accent 6" w:uiPriority="64"/>
+    <w:lsdException w:name="Medium List 1 Accent 6" w:uiPriority="65"/>
+    <w:lsdException w:name="Medium List 2 Accent 6" w:uiPriority="66"/>
+    <w:lsdException w:name="Medium Grid 1 Accent 6" w:uiPriority="67"/>
+    <w:lsdException w:name="Medium Grid 2 Accent 6" w:uiPriority="68"/>
+    <w:lsdException w:name="Medium Grid 3 Accent 6" w:uiPriority="69"/>
+    <w:lsdException w:name="Dark List Accent 6" w:uiPriority="70"/>
+    <w:lsdException w:name="Colorful Shading Accent 6" w:uiPriority="71"/>
+    <w:lsdException w:name="Colorful List Accent 6" w:uiPriority="72"/>
+    <w:lsdException w:name="Colorful Grid Accent 6" w:uiPriority="73"/>
+    <w:lsdException w:name="Subtle Emphasis" w:uiPriority="19" w:qFormat="1"/>
+    <w:lsdException w:name="Intense Emphasis" w:uiPriority="21" w:qFormat="1"/>
+    <w:lsdException w:name="Subtle Reference" w:uiPriority="31" w:qFormat="1"/>
+    <w:lsdException w:name="Intense Reference" w:uiPriority="32" w:qFormat="1"/>
+    <w:lsdException w:name="Book Title" w:uiPriority="33" w:qFormat="1"/>
+    <w:lsdException w:name="Bibliography" w:semiHidden="1" w:uiPriority="37" w:unhideWhenUsed="1"/>
+    <w:lsdException w:name="TOC Heading" w:semiHidden="1" w:uiPriority="39" w:unhideWhenUsed="1" w:qFormat="1"/>
+    <w:lsdException w:name="Plain Table 1" w:uiPriority="41"/>
+    <w:lsdException w:name="Plain Table 2" w:uiPriority="42"/>
+    <w:lsdException w:name="Plain Table 3" w:uiPriority="43"/>
+    <w:lsdException w:name="Plain Table 4" w:uiPriority="44"/>
+    <w:lsdException w:name="Plain Table 5" w:uiPriority="45"/>
+    <w:lsdException w:name="Grid Table Light" w:uiPriority="40"/>
+    <w:lsdException w:name="Grid Table 1 Light" w:uiPriority="46"/>
+    <w:lsdException w:name="Grid Table 2" w:uiPriority="47"/>
+    <w:lsdException w:name="Grid Table 3" w:uiPriority="48"/>
+    <w:lsdException w:name="Grid Table 4" w:uiPriority="49"/>
+    <w:lsdException w:name="Grid Table 5 Dark" w:uiPriority="50"/>
+    <w:lsdException w:name="Grid Table 6 Colorful" w:uiPriority="51"/>
+    <w:lsdException w:name="Grid Table 7 Colorful" w:uiPriority="52"/>
+    <w:lsdException w:name="Grid Table 1 Light Accent 1" w:uiPriority="46"/>
+    <w:lsdException w:name="Grid Table 2 Accent 1" w:uiPriority="47"/>
+    <w:lsdException w:name="Grid Table 3 Accent 1" w:uiPriority="48"/>
+    <w:lsdException w:name="Grid Table 4 Accent 1" w:uiPriority="49"/>
+    <w:lsdException w:name="Grid Table 5 Dark Accent 1" w:uiPriority="50"/>
+    <w:lsdException w:name="Grid Table 6 Colorful Accent 1" w:uiPriority="51"/>
+    <w:lsdException w:name="Grid Table 7 Colorful Accent 1" w:uiPriority="52"/>
+    <w:lsdException w:name="Grid Table 1 Light Accent 2" w:uiPriority="46"/>
+    <w:lsdException w:name="Grid Table 2 Accent 2" w:uiPriority="47"/>
+    <w:lsdException w:name="Grid Table 3 Accent 2" w:uiPriority="48"/>
+    <w:lsdException w:name="Grid Table 4 Accent 2" w:uiPriority="49"/>
+    <w:lsdException w:name="Grid Table 5 Dark Accent 2" w:uiPriority="50"/>
+    <w:lsdException w:name="Grid Table 6 Colorful Accent 2" w:uiPriority="51"/>
+    <w:lsdException w:name="Grid Table 7 Colorful Accent 2" w:uiPriority="52"/>
+    <w:lsdException w:name="Grid Table 1 Light Accent 3" w:uiPriority="46"/>
+    <w:lsdException w:name="Grid Table 2 Accent 3" w:uiPriority="47"/>
+    <w:lsdException w:name="Grid Table 3 Accent 3" w:uiPriority="48"/>
+    <w:lsdException w:name="Grid Table 4 Accent 3" w:uiPriority="49"/>
+    <w:lsdException w:name="Grid Table 5 Dark Accent 3" w:uiPriority="50"/>
+    <w:lsdException w:name="Grid Table 6 Colorful Accent 3" w:uiPriority="51"/>
+    <w:lsdException w:name="Grid Table 7 Colorful Accent 3" w:uiPriority="52"/>
+    <w:lsdException w:name="Grid Table 1 Light Accent 4" w:uiPriority="46"/>
+    <w:lsdException w:name="Grid Table 2 Accent 4" w:uiPriority="47"/>
+    <w:lsdException w:name="Grid Table 3 Accent 4" w:uiPriority="48"/>
+    <w:lsdException w:name="Grid Table 4 Accent 4" w:uiPriority="49"/>
+    <w:lsdException w:name="Grid Table 5 Dark Accent 4" w:uiPriority="50"/>
+    <w:lsdException w:name="Grid Table 6 Colorful Accent 4" w:uiPriority="51"/>
+    <w:lsdException w:name="Grid Table 7 Colorful Accent 4" w:uiPriority="52"/>
+    <w:lsdException w:name="Grid Table 1 Light Accent 5" w:uiPriority="46"/>
+    <w:lsdException w:name="Grid Table 2 Accent 5" w:uiPriority="47"/>
+    <w:lsdException w:name="Grid Table 3 Accent 5" w:uiPriority="48"/>
+    <w:lsdException w:name="Grid Table 4 Accent 5" w:uiPriority="49"/>
+    <w:lsdException w:name="Grid Table 5 Dark Accent 5" w:uiPriority="50"/>
+    <w:lsdException w:name="Grid Table 6 Colorful Accent 5" w:uiPriority="51"/>
+    <w:lsdException w:name="Grid Table 7 Colorful Accent 5" w:uiPriority="52"/>
+    <w:lsdException w:name="Grid Table 1 Light Accent 6" w:uiPriority="46"/>
+    <w:lsdException w:name="Grid Table 2 Accent 6" w:uiPriority="47"/>
+    <w:lsdException w:name="Grid Table 3 Accent 6" w:uiPriority="48"/>
+    <w:lsdException w:name="Grid Table 4 Accent 6" w:uiPriority="49"/>
+    <w:lsdException w:name="Grid Table 5 Dark Accent 6" w:uiPriority="50"/>
+    <w:lsdException w:name="Grid Table 6 Colorful Accent 6" w:uiPriority="51"/>
+    <w:lsdException w:name="Grid Table 7 Colorful Accent 6" w:uiPriority="52"/>
+    <w:lsdException w:name="List Table 1 Light" w:uiPriority="46"/>
+    <w:lsdException w:name="List Table 2" w:uiPriority="47"/>
+    <w:lsdException w:name="List Table 3" w:uiPriority="48"/>
+    <w:lsdException w:name="List Table 4" w:uiPriority="49"/>
+    <w:lsdException w:name="List Table 5 Dark" w:uiPriority="50"/>
+    <w:lsdException w:name="List Table 6 Colorful" w:uiPriority="51"/>
+    <w:lsdException w:name="List Table 7 Colorful" w:uiPriority="52"/>
+    <w:lsdException w:name="List Table 1 Light Accent 1" w:uiPriority="46"/>
+    <w:lsdException w:name="List Table 2 Accent 1" w:uiPriority="47"/>
+    <w:lsdException w:name="List Table 3 Accent 1" w:uiPriority="48"/>
+    <w:lsdException w:name="List Table 4 Accent 1" w:uiPriority="49"/>
+    <w:lsdException w:name="List Table 5 Dark Accent 1" w:uiPriority="50"/>
+    <w:lsdException w:name="List Table 6 Colorful Accent 1" w:uiPriority="51"/>
+    <w:lsdException w:name="List Table 7 Colorful Accent 1" w:uiPriority="52"/>
+    <w:lsdException w:name="List Table 1 Light Accent 2" w:uiPriority="46"/>
+    <w:lsdException w:name="List Table 2 Accent 2" w:uiPriority="47"/>
+    <w:lsdException w:name="List Table 3 Accent 2" w:uiPriority="48"/>
+    <w:lsdException w:name="List Table 4 Accent 2" w:uiPriority="49"/>
+    <w:lsdException w:name="List Table 5 Dark Accent 2" w:uiPriority="50"/>
+    <w:lsdException w:name="List Table 6 Colorful Accent 2" w:uiPriority="51"/>
+    <w:lsdException w:name="List Table 7 Colorful Accent 2" w:uiPriority="52"/>
+    <w:lsdException w:name="List Table 1 Light Accent 3" w:uiPriority="46"/>
+    <w:lsdException w:name="List Table 2 Accent 3" w:uiPriority="47"/>
+    <w:lsdException w:name="List Table 3 Accent 3" w:uiPriority="48"/>
+    <w:lsdException w:name="List Table 4 Accent 3" w:uiPriority="49"/>
+    <w:lsdException w:name="List Table 5 Dark Accent 3" w:uiPriority="50"/>
+    <w:lsdException w:name="List Table 6 Colorful Accent 3" w:uiPriority="51"/>
+    <w:lsdException w:name="List Table 7 Colorful Accent 3" w:uiPriority="52"/>
+    <w:lsdException w:name="List Table 1 Light Accent 4" w:uiPriority="46"/>
+    <w:lsdException w:name="List Table 2 Accent 4" w:uiPriority="47"/>
+    <w:lsdException w:name="List Table 3 Accent 4" w:uiPriority="48"/>
+    <w:lsdException w:name="List Table 4 Accent 4" w:uiPriority="49"/>
+    <w:lsdException w:name="List Table 5 Dark Accent 4" w:uiPriority="50"/>
+    <w:lsdException w:name="List Table 6 Colorful Accent 4" w:uiPriority="51"/>
+    <w:lsdException w:name="List Table 7 Colorful Accent 4" w:uiPriority="52"/>
+    <w:lsdException w:name="List Table 1 Light Accent 5" w:uiPriority="46"/>
+    <w:lsdException w:name="List Table 2 Accent 5" w:uiPriority="47"/>
+    <w:lsdException w:name="List Table 3 Accent 5" w:uiPriority="48"/>
+    <w:lsdException w:name="List Table 4 Accent 5" w:uiPriority="49"/>
+    <w:lsdException w:name="List Table 5 Dark Accent 5" w:uiPriority="50"/>
+    <w:lsdException w:name="List Table 6 Colorful Accent 5" w:uiPriority="51"/>
+    <w:lsdException w:name="List Table 7 Colorful Accent 5" w:uiPriority="52"/>
+    <w:lsdException w:name="List Table 1 Light Accent 6" w:uiPriority="46"/>
+    <w:lsdException w:name="List Table 2 Accent 6" w:uiPriority="47"/>
+    <w:lsdException w:name="List Table 3 Accent 6" w:uiPriority="48"/>
+    <w:lsdException w:name="List Table 4 Accent 6" w:uiPriority="49"/>
+    <w:lsdException w:name="List Table 5 Dark Accent 6" w:uiPriority="50"/>
+    <w:lsdException w:name="List Table 6 Colorful Accent 6" w:uiPriority="51"/>
+    <w:lsdException w:name="List Table 7 Colorful Accent 6" w:uiPriority="52"/>
+  </w:latentStyles>
+  <w:style w:type="paragraph" w:default="1" w:styleId="Normal">
+    <w:name w:val="Normal"/>
+    <w:qFormat/>
+  </w:style>
+  <w:style w:type="character" w:default="1" w:styleId="Fuentedeprrafopredeter">
+    <w:name w:val="Default Paragraph Font"/>
+    <w:uiPriority w:val="1"/>
+    <w:semiHidden/>
+    <w:unhideWhenUsed/>
+  </w:style>
+  <w:style w:type="table" w:default="1" w:styleId="Tablanormal">
+    <w:name w:val="Normal Table"/>
+    <w:uiPriority w:val="99"/>
+    <w:semiHidden/>
+    <w:unhideWhenUsed/>
+    <w:tblPr>
+      <w:tblInd w:w="0" w:type="dxa"/>
+      <w:tblCellMar>
+        <w:top w:w="0" w:type="dxa"/>
+        <w:left w:w="108" w:type="dxa"/>
+        <w:bottom w:w="0" w:type="dxa"/>
+        <w:right w:w="108" w:type="dxa"/>
+      </w:tblCellMar>
+    </w:tblPr>
+  </w:style>
+  <w:style w:type="numbering" w:default="1" w:styleId="Sinlista">
+    <w:name w:val="No List"/>
+    <w:uiPriority w:val="99"/>
+    <w:semiHidden/>
+    <w:unhideWhenUsed/>
+  </w:style>
+  <w:style w:type="character" w:styleId="Textodelmarcadordeposicin">
+    <w:name w:val="Placeholder Text"/>
+    <w:basedOn w:val="Fuentedeprrafopredeter"/>
+    <w:uiPriority w:val="99"/>
+    <w:semiHidden/>
+    <w:rsid w:val="00842F57"/>
+    <w:rPr>
+      <w:color w:val="808080"/>
+    </w:rPr>
+  </w:style>
+</w:styles>
+</file>
+
+<file path=word/glossary/webSettings.xml><?xml version="1.0" encoding="utf-8"?>
+<w:webSettings xmlns:mc="http://schemas.openxmlformats.org/markup-compatibility/2006" xmlns:r="http://schemas.openxmlformats.org/officeDocument/2006/relationships" xmlns:w="http://schemas.openxmlformats.org/wordprocessingml/2006/main" xmlns:w14="http://schemas.microsoft.com/office/word/2010/wordml" xmlns:w15="http://schemas.microsoft.com/office/word/2012/wordml" xmlns:w16se="http://schemas.microsoft.com/office/word/2015/wordml/symex" mc:Ignorable="w14 w15 w16se">
+  <w:optimizeForBrowser/>
+  <w:allowPNG/>
+</w:webSettings>
 </file>
 
 <file path=word/theme/theme1.xml><?xml version="1.0" encoding="utf-8"?>
@@ -7784,7 +9575,7 @@
 </file>
 
 <file path=customXml/itemProps1.xml><?xml version="1.0" encoding="utf-8"?>
-<ds:datastoreItem xmlns:ds="http://schemas.openxmlformats.org/officeDocument/2006/customXml" ds:itemID="{B69A22EE-BB1C-4E42-8828-026C61EF19DB}">
+<ds:datastoreItem xmlns:ds="http://schemas.openxmlformats.org/officeDocument/2006/customXml" ds:itemID="{6ADDDDDA-2E15-4BAA-8515-599AE8946406}">
   <ds:schemaRefs>
     <ds:schemaRef ds:uri="http://schemas.openxmlformats.org/officeDocument/2006/bibliography"/>
   </ds:schemaRefs>

</xml_diff>